<commit_message>
Add independent ground-truth validation, NDMI refinement, and rebuilt models
Adds analysis/v2_refined/: rasterizes an independent, externally sourced
land-cover reference directly onto the analysis grid to check the pure-NDVI
classification against real ground truth (OA = 43.8%, far below any prior
self-referential figure), fits an NDMI-based refinement that partially
corrects the diagnosed forest/agriculture confusion, and rebuilds both
CA-Markov and ConvLSTM (v2 full-weight, v3 sqrt-dampened) on the refined
labels.

Updates the JISEBI manuscript to report this full investigation end to end:
independent validation, refinement, rebuilt results, and a rewritten
Discussion/Conclusion disclosing the genuinely mixed outcome rather than a
clean verdict for either model family.
</commit_message>
<xml_diff>
--- a/paper/JISEBI_West_Java_Landcover.docx
+++ b/paper/JISEBI_West_Java_Landcover.docx
@@ -139,7 +139,7 @@
                 <w:sz w:val="18"/>
                 <w:szCs w:val="18"/>
               </w:rPr>
-              <w:t xml:space="preserve">Choosing between a classical and a deep-learning model for spatiotemporal change prediction is a recurring problem in predictive analytics, especially with a short historical data series where a headline accuracy score can mask systematic failure on the class of greatest interest. Satellite-based land cover monitoring is a data-rich setting to test this, yet published comparisons rarely validate both a Cellular Automata–Markov Chain (CA–Markov) model and a deep-learning alternative out-of-sample on the same, genuinely sourced dataset.</w:t>
+              <w:t xml:space="preserve">Choosing between a classical and a deep-learning model for spatiotemporal prediction is a recurring problem: a headline accuracy score can mask systematic failure on the class of greatest interest, and the labels scoring both models often go unchecked against independent evidence. Satellite land cover monitoring is data-rich enough to test this, yet comparisons rarely validate both families against an external reference rather than a pipeline's own classifications.</w:t>
             </w:r>
           </w:p>
           <w:p>
@@ -163,7 +163,7 @@
                 <w:sz w:val="18"/>
                 <w:szCs w:val="18"/>
               </w:rPr>
-              <w:t xml:space="preserve">This study maps West Java's 2024 land cover from genuine Sentinel-2 imagery, projects 2025 land cover using CA–Markov and a Convolutional LSTM (ConvLSTM), and validates both against real, held-out imagery.</w:t>
+              <w:t xml:space="preserve">This study maps West Java's 2024 land cover from Sentinel-2 imagery, projects 2025 land cover with CA–Markov and a Convolutional LSTM (ConvLSTM), validates both out-of-sample, then checks the classification against an independent reference, refining and rebuilding both models where that check reveals a deficiency.</w:t>
             </w:r>
           </w:p>
           <w:p>
@@ -187,7 +187,7 @@
                 <w:sz w:val="18"/>
                 <w:szCs w:val="18"/>
               </w:rPr>
-              <w:t xml:space="preserve">Sentinel-2 Level-2A imagery (2017–2024) was retrieved from the AWS Open Data “sentinel-cogs” archive, cloud-masked via the Scene Classification Layer, and clipped to the West Java boundary; a four-class NDVI classification was applied after median-shift radiometric normalization across dates. A CA–Markov model and a custom ConvLSTM network were each trained and then validated out-of-sample against an independently held-out year using Overall Accuracy (OA), Kappa, Producer's/User's Accuracy, and Figure of Merit (FoM). Follow-up experiments then re-evaluated ConvLSTM at CA–Markov's resolution with corrected labels and class-weighted loss, using bootstrap and McNemar tests for significance.</w:t>
+              <w:t xml:space="preserve">Sentinel-2 Level-2A imagery (2017–2024) from the AWS Open Data “sentinel-cogs” archive was cloud-masked and classified into four NDVI-based classes after cross-date normalization. CA–Markov and a custom ConvLSTM were validated out-of-sample, then re-evaluated at matched resolution with corrected labels and class-weighted loss. The classification was checked against an independent land-cover layer, prompting an NDMI refinement and rebuild of both pipelines.</w:t>
             </w:r>
           </w:p>
           <w:p>
@@ -211,7 +211,7 @@
                 <w:sz w:val="18"/>
                 <w:szCs w:val="18"/>
               </w:rPr>
-              <w:t xml:space="preserve">CA–Markov achieved OA = 68.3%, Kappa = 0.38, FoM = 22.2%, projecting non-vegetated land to grow from 2,207.4 km² (2024) to 2,557.9 km² (2025, +15.9%). ConvLSTM initially reached a higher OA (75.5%, Kappa = 0.46) but collapsed on non-vegetated land (Producer's Accuracy = 0.7%) — substantially a fixable artifact: CA–Markov itself collapsed at ConvLSTM's coarser resolution (PA 44.2%→8.4%), and class-weighted retraining recovered ConvLSTM's PA to 59.6% (Kappa 0.52), exceeding CA–Markov at that same resolution.</w:t>
+              <w:t xml:space="preserve">CA–Markov achieved OA = 68.3%, Kappa = 0.38, FoM = 22.2%; ConvLSTM initially collapsed on non-vegetated land (PA = 0.7%) but recovered to PA = 59.6% at matched resolution with class-weighted loss, exceeding CA–Markov there. Against the independent reference, however, the classification agreed only 43.8% of the time (Kappa = 0.155), concentrated in forest/agriculture confusion. NDMI refinement recovered part of this gap (OA = 55.5%) but gave no clean verdict: CA–Markov's OA fell while FoM rose; ConvLSTM reached higher Kappa but no forecast both precise and stable.</w:t>
             </w:r>
           </w:p>
           <w:p>
@@ -235,7 +235,7 @@
                 <w:sz w:val="18"/>
                 <w:szCs w:val="18"/>
               </w:rPr>
-              <w:t xml:space="preserve">A comparison at mismatched resolutions, uncorrected for class imbalance, can yield a misleading verdict; such comparisons must control for both before ruling out either model family.</w:t>
+              <w:t xml:space="preserve">Comparisons at mismatched resolutions, uncorrected for class imbalance, and validated only against a model's own classifications can yield a misleading verdict; robust comparison requires matched evaluation and independent validation before either family is judged superior.</w:t>
             </w:r>
           </w:p>
           <w:p>
@@ -263,7 +263,7 @@
                 <w:sz w:val="18"/>
                 <w:szCs w:val="18"/>
               </w:rPr>
-              <w:t xml:space="preserve">Sentinel-2; land cover change; CA–Markov; ConvLSTM; accuracy assessment; West Java.</w:t>
+              <w:t xml:space="preserve">Sentinel-2; land cover change; CA–Markov; ConvLSTM; independent validation; West Java.</w:t>
             </w:r>
           </w:p>
         </w:tc>
@@ -395,7 +395,7 @@
           <w:sz w:val="20"/>
           <w:szCs w:val="20"/>
         </w:rPr>
-        <w:t xml:space="preserve">CA–Markov remains the most widely applied land change projection technique because it is computationally light and its transition matrix is directly interpretable. Its accuracy is known to be sensitive to the length and quality of the calibration interval: landscape pattern and economic-factor analysis at the county scale shows prediction accuracy varying substantially with these choices [8], and a 2026 application to Türkiye reports comparable sensitivity when the CA–Markov framework is applied over multi-decade windows [9]. Hybrid variants that combine CA–Markov with boosted regression trees [10] or that parallelize the allocation step over a MapReduce framework for national-scale application [11] show that the core Markov-transition-plus-neighborhood-allocation logic generalizes well across implementations, and CA–Markov driven by coarse global land cover products (ESA CCI) has been applied at the country scale in Zambia [12] — confirming the method's applicability even where locally calibrated, fine-resolution training data are scarce, as is partly the case for multi-year Indonesian archives.</w:t>
+        <w:t xml:space="preserve">CA–Markov remains the most widely applied land change projection technique because it is computationally light and its transition matrix is directly interpretable. Its accuracy is known to be sensitive to the length and quality of the calibration interval: landscape pattern and economic-factor analysis at the county scale shows prediction accuracy varying substantially with these choices [8], and a 2026 application to Türkiye reports comparable sensitivity when the CA–Markov framework is applied over multi-decade windows [9]. Hybrid variants that combine CA–Markov with boosted regression trees [10] or that parallelize the allocation step over a MapReduce framework for national-scale application [11] show that the core Markov-transition-plus-neighborhood-allocation logic generalizes well across implementations, and CA–Markov driven by coarse global land cover products (ESA CCI) has been applied at the country scale in Zambia [12] — confirming the method's applicability even where locally calibrated, fine-resolution training data are scarce, as is partly the case for multi-year Indonesian archives, though global 1 km land cover products spanning multi-decadal scenarios are increasingly available as an auxiliary data source for such settings [30].</w:t>
       </w:r>
     </w:p>
     <w:p>
@@ -489,7 +489,7 @@
           <w:sz w:val="20"/>
           <w:szCs w:val="20"/>
         </w:rPr>
-        <w:t xml:space="preserve">The study area is the entire administrative extent of West Java Province, Indonesia, bounded approximately by 5.91°S–7.83°S and 106.37°E–108.70°E. The provincial boundary was obtained from an open-licensed (CC BY 4.0) vector dataset of Indonesia's 38 provinces and used to clip every raster mosaic used in this study, excluding open ocean and neighboring provinces from all area and accuracy statistics. All raster processing used the UTM Zone 48S projection (EPSG:32748).</w:t>
+        <w:t xml:space="preserve">The study area is the entire administrative extent of West Java Province, Indonesia, bounded approximately by 5.91°S–7.83°S and 106.37°E–108.70°E. The provincial boundary was obtained from an open-licensed (CC BY 4.0) vector dataset of Indonesia's 38 provinces [29] and used to clip every raster mosaic used in this study, excluding open ocean and neighboring provinces from all area and accuracy statistics. All raster processing used the UTM Zone 48S projection (EPSG:32748).</w:t>
       </w:r>
     </w:p>
     <w:p>
@@ -1595,6 +1595,171 @@
     <w:p>
       <w:pPr>
         <w:keepNext/>
+        <w:spacing w:after="100" w:before="200"/>
+        <w:ind w:firstLine="204"/>
+        <w:jc w:val="left"/>
+      </w:pPr>
+      <w:r>
+        <w:rPr>
+          <w:rFonts w:ascii="Times New Roman" w:cs="Times New Roman" w:eastAsia="Times New Roman" w:hAnsi="Times New Roman"/>
+          <w:b/>
+          <w:bCs/>
+          <w:i/>
+          <w:iCs/>
+          <w:sz w:val="20"/>
+          <w:szCs w:val="20"/>
+        </w:rPr>
+        <w:t xml:space="preserve">I. </w:t>
+      </w:r>
+      <w:r>
+        <w:rPr>
+          <w:rFonts w:ascii="Times New Roman" w:cs="Times New Roman" w:eastAsia="Times New Roman" w:hAnsi="Times New Roman"/>
+          <w:b/>
+          <w:bCs/>
+          <w:i/>
+          <w:iCs/>
+          <w:sz w:val="20"/>
+          <w:szCs w:val="20"/>
+        </w:rPr>
+        <w:t xml:space="preserve">Independent Ground-Truth Validation</w:t>
+      </w:r>
+    </w:p>
+    <w:p>
+      <w:pPr>
+        <w:spacing w:after="120" w:line="252"/>
+        <w:ind w:firstLine="204"/>
+        <w:jc w:val="both"/>
+      </w:pPr>
+      <w:r>
+        <w:rPr>
+          <w:rFonts w:ascii="Times New Roman" w:cs="Times New Roman" w:eastAsia="Times New Roman" w:hAnsi="Times New Roman"/>
+          <w:sz w:val="20"/>
+          <w:szCs w:val="20"/>
+        </w:rPr>
+        <w:t xml:space="preserve">Every accuracy figure reported so far is self-referential: both the CA–Markov and ConvLSTM validations compare model output against classifications produced by this study's own NDVI-threshold pipeline, not against an external reference. To close this gap, a province-wide land-cover reference layer was obtained separately by the author — a 17-class vector product using a standard Indonesian national land-cover taxonomy (e.g., primary/secondary dryland forest, mangrove, tree-crop plantation, paddy, dryland agriculture, settlement, open land, water bodies) covering the full extent of West Java. The file carries no acquisition-date field, so its exact vintage could not be confirmed from its own metadata; it is treated here as an independent check on spatial pattern and classification logic rather than as a perfectly contemporaneous reference for 2024.</w:t>
+      </w:r>
+    </w:p>
+    <w:p>
+      <w:pPr>
+        <w:spacing w:after="120" w:line="252"/>
+        <w:ind w:firstLine="204"/>
+        <w:jc w:val="both"/>
+      </w:pPr>
+      <w:r>
+        <w:rPr>
+          <w:rFonts w:ascii="Times New Roman" w:cs="Times New Roman" w:eastAsia="Times New Roman" w:hAnsi="Times New Roman"/>
+          <w:sz w:val="20"/>
+          <w:szCs w:val="20"/>
+        </w:rPr>
+        <w:t xml:space="preserve">The reference layer's 17 classes were crosswalked to this study's four classes by land-cover logic: water bodies and aquaculture ponds to Water; open land, settlement, and extractive land uses to Non-vegetated; paddy, dryland agriculture, and shrub to Sparse vegetation; and primary/secondary forest, plantation forest, tree-crop plantation, and mangrove to Dense vegetation. Three classes (swamp, swamp shrub, tree-crop plantation) were flagged as genuinely ambiguous between crosswalk targets and carried a documented default assignment; a sensitivity check re-ran the comparison excluding these three classes entirely to test whether the crosswalk choice was driving the result. The reference layer was reprojected to this study's analysis grid coordinate system and rasterized directly onto the same 2,447 × 3,000-pixel grid used throughout, yielding a pixel-exact, full-population comparison rather than a point sample.</w:t>
+      </w:r>
+    </w:p>
+    <w:p>
+      <w:pPr>
+        <w:keepNext/>
+        <w:spacing w:after="100" w:before="200"/>
+        <w:ind w:firstLine="204"/>
+        <w:jc w:val="left"/>
+      </w:pPr>
+      <w:r>
+        <w:rPr>
+          <w:rFonts w:ascii="Times New Roman" w:cs="Times New Roman" w:eastAsia="Times New Roman" w:hAnsi="Times New Roman"/>
+          <w:b/>
+          <w:bCs/>
+          <w:i/>
+          <w:iCs/>
+          <w:sz w:val="20"/>
+          <w:szCs w:val="20"/>
+        </w:rPr>
+        <w:t xml:space="preserve">J. </w:t>
+      </w:r>
+      <w:r>
+        <w:rPr>
+          <w:rFonts w:ascii="Times New Roman" w:cs="Times New Roman" w:eastAsia="Times New Roman" w:hAnsi="Times New Roman"/>
+          <w:b/>
+          <w:bCs/>
+          <w:i/>
+          <w:iCs/>
+          <w:sz w:val="20"/>
+          <w:szCs w:val="20"/>
+        </w:rPr>
+        <w:t xml:space="preserve">Refined Classification and Full Pipeline Rebuild</w:t>
+      </w:r>
+    </w:p>
+    <w:p>
+      <w:pPr>
+        <w:spacing w:after="120" w:line="252"/>
+        <w:ind w:firstLine="204"/>
+        <w:jc w:val="both"/>
+      </w:pPr>
+      <w:r>
+        <w:rPr>
+          <w:rFonts w:ascii="Times New Roman" w:cs="Times New Roman" w:eastAsia="Times New Roman" w:hAnsi="Times New Roman"/>
+          <w:sz w:val="20"/>
+          <w:szCs w:val="20"/>
+        </w:rPr>
+        <w:t xml:space="preserve">The independent validation (Section IV-G) showed the initial NDVI-only classification agreed with the reference layer far less often than the self-referential figures implied, concentrated in a specific, diagnosable error: reference pixels labeled as agriculture or shrub were frequently classified as Dense vegetation, consistent with the well-documented inability of a single greenness index to separate closed-canopy natural forest from healthy, high-NDVI cropland or plantation. To address this without discarding the validated NDVI threshold structure for the other three classes, the Normalized Difference Moisture Index [36], [37],</w:t>
+      </w:r>
+    </w:p>
+    <w:p>
+      <w:pPr>
+        <w:tabs>
+          <w:tab w:val="right" w:pos="9026"/>
+        </w:tabs>
+        <w:spacing w:after="120" w:before="120"/>
+      </w:pPr>
+      <w:r>
+        <w:rPr>
+          <w:rFonts w:ascii="Times New Roman" w:cs="Times New Roman" w:eastAsia="Times New Roman" w:hAnsi="Times New Roman"/>
+          <w:i/>
+          <w:iCs/>
+          <w:sz w:val="20"/>
+          <w:szCs w:val="20"/>
+        </w:rPr>
+        <w:t xml:space="preserve">        NDMI = (B08 − B11) / (B08 + B11)</w:t>
+      </w:r>
+      <w:r>
+        <w:rPr>
+          <w:rFonts w:ascii="Times New Roman" w:cs="Times New Roman" w:eastAsia="Times New Roman" w:hAnsi="Times New Roman"/>
+          <w:sz w:val="20"/>
+          <w:szCs w:val="20"/>
+        </w:rPr>
+        <w:t xml:space="preserve">	(4)</w:t>
+      </w:r>
+    </w:p>
+    <w:p>
+      <w:pPr>
+        <w:spacing w:after="120" w:line="252"/>
+        <w:ind w:firstLine="204"/>
+        <w:jc w:val="both"/>
+      </w:pPr>
+      <w:r>
+        <w:rPr>
+          <w:rFonts w:ascii="Times New Roman" w:cs="Times New Roman" w:eastAsia="Times New Roman" w:hAnsi="Times New Roman"/>
+          <w:sz w:val="20"/>
+          <w:szCs w:val="20"/>
+        </w:rPr>
+        <w:t xml:space="preserve">was computed from the Sentinel-2 short-wave infrared band (B11, 20 m, resampled to the analysis grid) for every year in the 2017–2024 sequence, using the same tile-date selections and SCL cloud masking as the corresponding NDVI mosaics (Section III-B–C). NDMI showed the same kind of reproducible cross-date offset already documented for NDVI (Section III-D) — most pronounced in 2019 and 2023, the same two years with the largest NDVI offsets — and was therefore median-shift normalized to the 2024 reference by the identical procedure. The classification rule for the Water, Non-vegetated, and Sparse-vegetation thresholds (Table 1) was left unchanged; for NDVI ≥ 0.55 candidates, the pixel was retained as Dense vegetation only if NDMI also exceeded a threshold fit on a spatial checkerboard training split (alternating 20-pixel blocks, ≈1.7 km) of the independent reference layer, otherwise reassigned to Sparse vegetation. The threshold (0.268) was fit once, by maximizing balanced accuracy between reference-Sparse and reference-Dense pixels on the training split only, and applied uniformly across all eight years and both models rather than re-fit per year, since independent ground truth exists for only one time point.</w:t>
+      </w:r>
+    </w:p>
+    <w:p>
+      <w:pPr>
+        <w:spacing w:after="120" w:line="252"/>
+        <w:ind w:firstLine="204"/>
+        <w:jc w:val="both"/>
+      </w:pPr>
+      <w:r>
+        <w:rPr>
+          <w:rFonts w:ascii="Times New Roman" w:cs="Times New Roman" w:eastAsia="Times New Roman" w:hAnsi="Times New Roman"/>
+          <w:sz w:val="20"/>
+          <w:szCs w:val="20"/>
+        </w:rPr>
+        <w:t xml:space="preserve">Because the refined labels now depend on NDMI, ConvLSTM's input was extended from two channels (NDVI, brightness) to three (NDVI, brightness, NDMI) so the model has access to the same information its own targets are derived from; the architecture, training-window structure, and epoch budget were otherwise unchanged from Section III-F. The CA–Markov transition-matrix estimation, capping procedure (Section III-E), and CA spatial allocation were re-run in full on the refined 2019, 2021, and 2024 classifications. For ConvLSTM, inverse-frequency class-weighting (the fix validated in Section III-H) was applied first at full strength; this produced high Non-vegetated recall but collapsed User's Accuracy for that class to roughly one in eight predictions correct — a precision failure consistent with over-aggressive minority-class up-weighting. A standard remedy, dampening the weights by a square root, was applied as a second configuration and is reported as the refined model's primary result, with the full-weight configuration retained for comparison as a documented cautionary finding rather than discarded.</w:t>
+      </w:r>
+    </w:p>
+    <w:p>
+      <w:pPr>
+        <w:keepNext/>
         <w:spacing w:after="160" w:before="280"/>
         <w:jc w:val="center"/>
       </w:pPr>
@@ -10699,6 +10864,4186 @@
     <w:p>
       <w:pPr>
         <w:keepNext/>
+        <w:spacing w:after="100" w:before="200"/>
+        <w:ind w:firstLine="204"/>
+        <w:jc w:val="left"/>
+      </w:pPr>
+      <w:r>
+        <w:rPr>
+          <w:rFonts w:ascii="Times New Roman" w:cs="Times New Roman" w:eastAsia="Times New Roman" w:hAnsi="Times New Roman"/>
+          <w:b/>
+          <w:bCs/>
+          <w:i/>
+          <w:iCs/>
+          <w:sz w:val="20"/>
+          <w:szCs w:val="20"/>
+        </w:rPr>
+        <w:t xml:space="preserve">G. </w:t>
+      </w:r>
+      <w:r>
+        <w:rPr>
+          <w:rFonts w:ascii="Times New Roman" w:cs="Times New Roman" w:eastAsia="Times New Roman" w:hAnsi="Times New Roman"/>
+          <w:b/>
+          <w:bCs/>
+          <w:i/>
+          <w:iCs/>
+          <w:sz w:val="20"/>
+          <w:szCs w:val="20"/>
+        </w:rPr>
+        <w:t xml:space="preserve">Independent Ground-Truth Validation</w:t>
+      </w:r>
+    </w:p>
+    <w:p>
+      <w:pPr>
+        <w:spacing w:after="120" w:line="252"/>
+        <w:ind w:firstLine="204"/>
+        <w:jc w:val="both"/>
+      </w:pPr>
+      <w:r>
+        <w:rPr>
+          <w:rFonts w:ascii="Times New Roman" w:cs="Times New Roman" w:eastAsia="Times New Roman" w:hAnsi="Times New Roman"/>
+          <w:sz w:val="20"/>
+          <w:szCs w:val="20"/>
+        </w:rPr>
+        <w:t xml:space="preserve">Comparing the initial (pure-NDVI) 2024 classification directly against the independent reference layer, on the 97.7%-of-AOI subset the reference layer covers, gave markedly lower accuracy than any self-referential figure reported above:</w:t>
+      </w:r>
+    </w:p>
+    <w:p>
+      <w:pPr>
+        <w:spacing w:after="20" w:before="200"/>
+        <w:jc w:val="left"/>
+      </w:pPr>
+      <w:r>
+        <w:rPr>
+          <w:rFonts w:ascii="Times New Roman" w:cs="Times New Roman" w:eastAsia="Times New Roman" w:hAnsi="Times New Roman"/>
+          <w:sz w:val="16"/>
+          <w:szCs w:val="16"/>
+        </w:rPr>
+        <w:t xml:space="preserve">TABLE 13</w:t>
+      </w:r>
+    </w:p>
+    <w:p>
+      <w:pPr>
+        <w:spacing w:after="100"/>
+        <w:jc w:val="left"/>
+      </w:pPr>
+      <w:r>
+        <w:rPr>
+          <w:rFonts w:ascii="Times New Roman" w:cs="Times New Roman" w:eastAsia="Times New Roman" w:hAnsi="Times New Roman"/>
+          <w:caps/>
+          <w:sz w:val="16"/>
+          <w:szCs w:val="16"/>
+        </w:rPr>
+        <w:t xml:space="preserve">INITIAL CLASSIFICATION VS. INDEPENDENT REFERENCE (N = 2,335,751, HELD-OUT SPATIAL SPLIT)</w:t>
+      </w:r>
+    </w:p>
+    <w:tbl>
+      <w:tblPr>
+        <w:tblW w:type="dxa" w:w="9360"/>
+        <w:tblBorders>
+          <w:top w:val="single" w:color="000000" w:sz="8"/>
+          <w:left w:val="none" w:color="FFFFFF" w:sz="0"/>
+          <w:bottom w:val="single" w:color="000000" w:sz="8"/>
+          <w:right w:val="none" w:color="FFFFFF" w:sz="0"/>
+          <w:insideH w:val="none" w:color="FFFFFF" w:sz="0"/>
+          <w:insideV w:val="none" w:color="FFFFFF" w:sz="0"/>
+        </w:tblBorders>
+      </w:tblPr>
+      <w:tblGrid>
+        <w:gridCol w:w="3900"/>
+        <w:gridCol w:w="2730"/>
+        <w:gridCol w:w="2730"/>
+      </w:tblGrid>
+      <w:tr>
+        <w:trPr>
+          <w:tblHeader/>
+        </w:trPr>
+        <w:tc>
+          <w:tcPr>
+            <w:tcW w:type="dxa" w:w="3900"/>
+            <w:tcBorders>
+              <w:top w:val="none" w:color="FFFFFF" w:sz="0"/>
+              <w:left w:val="none" w:color="FFFFFF" w:sz="0"/>
+              <w:bottom w:val="none" w:color="FFFFFF" w:sz="0"/>
+              <w:right w:val="none" w:color="FFFFFF" w:sz="0"/>
+            </w:tcBorders>
+            <w:shd w:fill="D9D9D9" w:val="clear"/>
+            <w:tcMar>
+              <w:top w:type="dxa" w:w="40"/>
+              <w:left w:type="dxa" w:w="80"/>
+              <w:bottom w:type="dxa" w:w="40"/>
+              <w:right w:type="dxa" w:w="80"/>
+            </w:tcMar>
+            <w:vAlign w:val="center"/>
+          </w:tcPr>
+          <w:p>
+            <w:pPr>
+              <w:jc w:val="center"/>
+            </w:pPr>
+            <w:r>
+              <w:rPr>
+                <w:rFonts w:ascii="Times New Roman" w:cs="Times New Roman" w:eastAsia="Times New Roman" w:hAnsi="Times New Roman"/>
+                <w:b/>
+                <w:bCs/>
+                <w:sz w:val="16"/>
+                <w:szCs w:val="16"/>
+              </w:rPr>
+              <w:t xml:space="preserve">Metric</w:t>
+            </w:r>
+          </w:p>
+        </w:tc>
+        <w:tc>
+          <w:tcPr>
+            <w:tcW w:type="dxa" w:w="2730"/>
+            <w:tcBorders>
+              <w:top w:val="none" w:color="FFFFFF" w:sz="0"/>
+              <w:left w:val="none" w:color="FFFFFF" w:sz="0"/>
+              <w:bottom w:val="none" w:color="FFFFFF" w:sz="0"/>
+              <w:right w:val="none" w:color="FFFFFF" w:sz="0"/>
+            </w:tcBorders>
+            <w:shd w:fill="D9D9D9" w:val="clear"/>
+            <w:tcMar>
+              <w:top w:type="dxa" w:w="40"/>
+              <w:left w:type="dxa" w:w="80"/>
+              <w:bottom w:type="dxa" w:w="40"/>
+              <w:right w:type="dxa" w:w="80"/>
+            </w:tcMar>
+            <w:vAlign w:val="center"/>
+          </w:tcPr>
+          <w:p>
+            <w:pPr>
+              <w:jc w:val="center"/>
+            </w:pPr>
+            <w:r>
+              <w:rPr>
+                <w:rFonts w:ascii="Times New Roman" w:cs="Times New Roman" w:eastAsia="Times New Roman" w:hAnsi="Times New Roman"/>
+                <w:b/>
+                <w:bCs/>
+                <w:sz w:val="16"/>
+                <w:szCs w:val="16"/>
+              </w:rPr>
+              <w:t xml:space="preserve">Initial (NDVI-only)</w:t>
+            </w:r>
+          </w:p>
+        </w:tc>
+        <w:tc>
+          <w:tcPr>
+            <w:tcW w:type="dxa" w:w="2730"/>
+            <w:tcBorders>
+              <w:top w:val="none" w:color="FFFFFF" w:sz="0"/>
+              <w:left w:val="none" w:color="FFFFFF" w:sz="0"/>
+              <w:bottom w:val="none" w:color="FFFFFF" w:sz="0"/>
+              <w:right w:val="none" w:color="FFFFFF" w:sz="0"/>
+            </w:tcBorders>
+            <w:shd w:fill="D9D9D9" w:val="clear"/>
+            <w:tcMar>
+              <w:top w:type="dxa" w:w="40"/>
+              <w:left w:type="dxa" w:w="80"/>
+              <w:bottom w:type="dxa" w:w="40"/>
+              <w:right w:type="dxa" w:w="80"/>
+            </w:tcMar>
+            <w:vAlign w:val="center"/>
+          </w:tcPr>
+          <w:p>
+            <w:pPr>
+              <w:jc w:val="center"/>
+            </w:pPr>
+            <w:r>
+              <w:rPr>
+                <w:rFonts w:ascii="Times New Roman" w:cs="Times New Roman" w:eastAsia="Times New Roman" w:hAnsi="Times New Roman"/>
+                <w:b/>
+                <w:bCs/>
+                <w:sz w:val="16"/>
+                <w:szCs w:val="16"/>
+              </w:rPr>
+              <w:t xml:space="preserve">Refined (NDVI+NDMI)</w:t>
+            </w:r>
+          </w:p>
+        </w:tc>
+      </w:tr>
+      <w:tr>
+        <w:tc>
+          <w:tcPr>
+            <w:tcW w:type="dxa" w:w="3900"/>
+            <w:tcBorders>
+              <w:top w:val="none" w:color="FFFFFF" w:sz="0"/>
+              <w:left w:val="none" w:color="FFFFFF" w:sz="0"/>
+              <w:bottom w:val="none" w:color="FFFFFF" w:sz="0"/>
+              <w:right w:val="none" w:color="FFFFFF" w:sz="0"/>
+            </w:tcBorders>
+            <w:tcMar>
+              <w:top w:type="dxa" w:w="40"/>
+              <w:left w:type="dxa" w:w="80"/>
+              <w:bottom w:type="dxa" w:w="40"/>
+              <w:right w:type="dxa" w:w="80"/>
+            </w:tcMar>
+            <w:vAlign w:val="center"/>
+          </w:tcPr>
+          <w:p>
+            <w:pPr>
+              <w:jc w:val="left"/>
+            </w:pPr>
+            <w:r>
+              <w:rPr>
+                <w:rFonts w:ascii="Times New Roman" w:cs="Times New Roman" w:eastAsia="Times New Roman" w:hAnsi="Times New Roman"/>
+                <w:b w:val="false"/>
+                <w:bCs w:val="false"/>
+                <w:sz w:val="16"/>
+                <w:szCs w:val="16"/>
+              </w:rPr>
+              <w:t xml:space="preserve">Overall Accuracy</w:t>
+            </w:r>
+          </w:p>
+        </w:tc>
+        <w:tc>
+          <w:tcPr>
+            <w:tcW w:type="dxa" w:w="2730"/>
+            <w:tcBorders>
+              <w:top w:val="none" w:color="FFFFFF" w:sz="0"/>
+              <w:left w:val="none" w:color="FFFFFF" w:sz="0"/>
+              <w:bottom w:val="none" w:color="FFFFFF" w:sz="0"/>
+              <w:right w:val="none" w:color="FFFFFF" w:sz="0"/>
+            </w:tcBorders>
+            <w:tcMar>
+              <w:top w:type="dxa" w:w="40"/>
+              <w:left w:type="dxa" w:w="80"/>
+              <w:bottom w:type="dxa" w:w="40"/>
+              <w:right w:type="dxa" w:w="80"/>
+            </w:tcMar>
+            <w:vAlign w:val="center"/>
+          </w:tcPr>
+          <w:p>
+            <w:pPr>
+              <w:jc w:val="center"/>
+            </w:pPr>
+            <w:r>
+              <w:rPr>
+                <w:rFonts w:ascii="Times New Roman" w:cs="Times New Roman" w:eastAsia="Times New Roman" w:hAnsi="Times New Roman"/>
+                <w:b w:val="false"/>
+                <w:bCs w:val="false"/>
+                <w:sz w:val="16"/>
+                <w:szCs w:val="16"/>
+              </w:rPr>
+              <w:t xml:space="preserve">43.78%</w:t>
+            </w:r>
+          </w:p>
+        </w:tc>
+        <w:tc>
+          <w:tcPr>
+            <w:tcW w:type="dxa" w:w="2730"/>
+            <w:tcBorders>
+              <w:top w:val="none" w:color="FFFFFF" w:sz="0"/>
+              <w:left w:val="none" w:color="FFFFFF" w:sz="0"/>
+              <w:bottom w:val="none" w:color="FFFFFF" w:sz="0"/>
+              <w:right w:val="none" w:color="FFFFFF" w:sz="0"/>
+            </w:tcBorders>
+            <w:tcMar>
+              <w:top w:type="dxa" w:w="40"/>
+              <w:left w:type="dxa" w:w="80"/>
+              <w:bottom w:type="dxa" w:w="40"/>
+              <w:right w:type="dxa" w:w="80"/>
+            </w:tcMar>
+            <w:vAlign w:val="center"/>
+          </w:tcPr>
+          <w:p>
+            <w:pPr>
+              <w:jc w:val="center"/>
+            </w:pPr>
+            <w:r>
+              <w:rPr>
+                <w:rFonts w:ascii="Times New Roman" w:cs="Times New Roman" w:eastAsia="Times New Roman" w:hAnsi="Times New Roman"/>
+                <w:b w:val="false"/>
+                <w:bCs w:val="false"/>
+                <w:sz w:val="16"/>
+                <w:szCs w:val="16"/>
+              </w:rPr>
+              <w:t xml:space="preserve">55.52%</w:t>
+            </w:r>
+          </w:p>
+        </w:tc>
+      </w:tr>
+      <w:tr>
+        <w:tc>
+          <w:tcPr>
+            <w:tcW w:type="dxa" w:w="3900"/>
+            <w:tcBorders>
+              <w:top w:val="none" w:color="FFFFFF" w:sz="0"/>
+              <w:left w:val="none" w:color="FFFFFF" w:sz="0"/>
+              <w:bottom w:val="none" w:color="FFFFFF" w:sz="0"/>
+              <w:right w:val="none" w:color="FFFFFF" w:sz="0"/>
+            </w:tcBorders>
+            <w:tcMar>
+              <w:top w:type="dxa" w:w="40"/>
+              <w:left w:type="dxa" w:w="80"/>
+              <w:bottom w:type="dxa" w:w="40"/>
+              <w:right w:type="dxa" w:w="80"/>
+            </w:tcMar>
+            <w:vAlign w:val="center"/>
+          </w:tcPr>
+          <w:p>
+            <w:pPr>
+              <w:jc w:val="left"/>
+            </w:pPr>
+            <w:r>
+              <w:rPr>
+                <w:rFonts w:ascii="Times New Roman" w:cs="Times New Roman" w:eastAsia="Times New Roman" w:hAnsi="Times New Roman"/>
+                <w:b w:val="false"/>
+                <w:bCs w:val="false"/>
+                <w:sz w:val="16"/>
+                <w:szCs w:val="16"/>
+              </w:rPr>
+              <w:t xml:space="preserve">Kappa coefficient</w:t>
+            </w:r>
+          </w:p>
+        </w:tc>
+        <w:tc>
+          <w:tcPr>
+            <w:tcW w:type="dxa" w:w="2730"/>
+            <w:tcBorders>
+              <w:top w:val="none" w:color="FFFFFF" w:sz="0"/>
+              <w:left w:val="none" w:color="FFFFFF" w:sz="0"/>
+              <w:bottom w:val="none" w:color="FFFFFF" w:sz="0"/>
+              <w:right w:val="none" w:color="FFFFFF" w:sz="0"/>
+            </w:tcBorders>
+            <w:tcMar>
+              <w:top w:type="dxa" w:w="40"/>
+              <w:left w:type="dxa" w:w="80"/>
+              <w:bottom w:type="dxa" w:w="40"/>
+              <w:right w:type="dxa" w:w="80"/>
+            </w:tcMar>
+            <w:vAlign w:val="center"/>
+          </w:tcPr>
+          <w:p>
+            <w:pPr>
+              <w:jc w:val="center"/>
+            </w:pPr>
+            <w:r>
+              <w:rPr>
+                <w:rFonts w:ascii="Times New Roman" w:cs="Times New Roman" w:eastAsia="Times New Roman" w:hAnsi="Times New Roman"/>
+                <w:b w:val="false"/>
+                <w:bCs w:val="false"/>
+                <w:sz w:val="16"/>
+                <w:szCs w:val="16"/>
+              </w:rPr>
+              <w:t xml:space="preserve">0.1552</w:t>
+            </w:r>
+          </w:p>
+        </w:tc>
+        <w:tc>
+          <w:tcPr>
+            <w:tcW w:type="dxa" w:w="2730"/>
+            <w:tcBorders>
+              <w:top w:val="none" w:color="FFFFFF" w:sz="0"/>
+              <w:left w:val="none" w:color="FFFFFF" w:sz="0"/>
+              <w:bottom w:val="none" w:color="FFFFFF" w:sz="0"/>
+              <w:right w:val="none" w:color="FFFFFF" w:sz="0"/>
+            </w:tcBorders>
+            <w:tcMar>
+              <w:top w:type="dxa" w:w="40"/>
+              <w:left w:type="dxa" w:w="80"/>
+              <w:bottom w:type="dxa" w:w="40"/>
+              <w:right w:type="dxa" w:w="80"/>
+            </w:tcMar>
+            <w:vAlign w:val="center"/>
+          </w:tcPr>
+          <w:p>
+            <w:pPr>
+              <w:jc w:val="center"/>
+            </w:pPr>
+            <w:r>
+              <w:rPr>
+                <w:rFonts w:ascii="Times New Roman" w:cs="Times New Roman" w:eastAsia="Times New Roman" w:hAnsi="Times New Roman"/>
+                <w:b w:val="false"/>
+                <w:bCs w:val="false"/>
+                <w:sz w:val="16"/>
+                <w:szCs w:val="16"/>
+              </w:rPr>
+              <w:t xml:space="preserve">0.2098</w:t>
+            </w:r>
+          </w:p>
+        </w:tc>
+      </w:tr>
+    </w:tbl>
+    <w:p>
+      <w:pPr>
+        <w:spacing w:after="120" w:line="252"/>
+        <w:ind w:firstLine="204"/>
+        <w:jc w:val="both"/>
+      </w:pPr>
+      <w:r>
+        <w:rPr>
+          <w:rFonts w:ascii="Times New Roman" w:cs="Times New Roman" w:eastAsia="Times New Roman" w:hAnsi="Times New Roman"/>
+          <w:sz w:val="20"/>
+          <w:szCs w:val="20"/>
+        </w:rPr>
+        <w:t xml:space="preserve">Per-class Producer's Accuracy against the independent reference shows exactly where the disagreement concentrated: 25.2% for Sparse vegetation under the initial classification, the class most often confused with Dense vegetation (Table 14) — consistent with the diagnosis in Section III-J that a single greenness index cannot separate closed-canopy forest from high-NDVI cropland or plantation.</w:t>
+      </w:r>
+    </w:p>
+    <w:p>
+      <w:pPr>
+        <w:spacing w:after="20" w:before="200"/>
+        <w:jc w:val="left"/>
+      </w:pPr>
+      <w:r>
+        <w:rPr>
+          <w:rFonts w:ascii="Times New Roman" w:cs="Times New Roman" w:eastAsia="Times New Roman" w:hAnsi="Times New Roman"/>
+          <w:sz w:val="16"/>
+          <w:szCs w:val="16"/>
+        </w:rPr>
+        <w:t xml:space="preserve">TABLE 14</w:t>
+      </w:r>
+    </w:p>
+    <w:p>
+      <w:pPr>
+        <w:spacing w:after="100"/>
+        <w:jc w:val="left"/>
+      </w:pPr>
+      <w:r>
+        <w:rPr>
+          <w:rFonts w:ascii="Times New Roman" w:cs="Times New Roman" w:eastAsia="Times New Roman" w:hAnsi="Times New Roman"/>
+          <w:caps/>
+          <w:sz w:val="16"/>
+          <w:szCs w:val="16"/>
+        </w:rPr>
+        <w:t xml:space="preserve">PRODUCER'S ACCURACY VS. INDEPENDENT REFERENCE, BY CLASS</w:t>
+      </w:r>
+    </w:p>
+    <w:tbl>
+      <w:tblPr>
+        <w:tblW w:type="dxa" w:w="9060"/>
+        <w:tblBorders>
+          <w:top w:val="single" w:color="000000" w:sz="8"/>
+          <w:left w:val="none" w:color="FFFFFF" w:sz="0"/>
+          <w:bottom w:val="single" w:color="000000" w:sz="8"/>
+          <w:right w:val="none" w:color="FFFFFF" w:sz="0"/>
+          <w:insideH w:val="none" w:color="FFFFFF" w:sz="0"/>
+          <w:insideV w:val="none" w:color="FFFFFF" w:sz="0"/>
+        </w:tblBorders>
+      </w:tblPr>
+      <w:tblGrid>
+        <w:gridCol w:w="3600"/>
+        <w:gridCol w:w="2730"/>
+        <w:gridCol w:w="2730"/>
+      </w:tblGrid>
+      <w:tr>
+        <w:trPr>
+          <w:tblHeader/>
+        </w:trPr>
+        <w:tc>
+          <w:tcPr>
+            <w:tcW w:type="dxa" w:w="3600"/>
+            <w:tcBorders>
+              <w:top w:val="none" w:color="FFFFFF" w:sz="0"/>
+              <w:left w:val="none" w:color="FFFFFF" w:sz="0"/>
+              <w:bottom w:val="none" w:color="FFFFFF" w:sz="0"/>
+              <w:right w:val="none" w:color="FFFFFF" w:sz="0"/>
+            </w:tcBorders>
+            <w:shd w:fill="D9D9D9" w:val="clear"/>
+            <w:tcMar>
+              <w:top w:type="dxa" w:w="40"/>
+              <w:left w:type="dxa" w:w="80"/>
+              <w:bottom w:type="dxa" w:w="40"/>
+              <w:right w:type="dxa" w:w="80"/>
+            </w:tcMar>
+            <w:vAlign w:val="center"/>
+          </w:tcPr>
+          <w:p>
+            <w:pPr>
+              <w:jc w:val="center"/>
+            </w:pPr>
+            <w:r>
+              <w:rPr>
+                <w:rFonts w:ascii="Times New Roman" w:cs="Times New Roman" w:eastAsia="Times New Roman" w:hAnsi="Times New Roman"/>
+                <w:b/>
+                <w:bCs/>
+                <w:sz w:val="16"/>
+                <w:szCs w:val="16"/>
+              </w:rPr>
+              <w:t xml:space="preserve">Class</w:t>
+            </w:r>
+          </w:p>
+        </w:tc>
+        <w:tc>
+          <w:tcPr>
+            <w:tcW w:type="dxa" w:w="2730"/>
+            <w:tcBorders>
+              <w:top w:val="none" w:color="FFFFFF" w:sz="0"/>
+              <w:left w:val="none" w:color="FFFFFF" w:sz="0"/>
+              <w:bottom w:val="none" w:color="FFFFFF" w:sz="0"/>
+              <w:right w:val="none" w:color="FFFFFF" w:sz="0"/>
+            </w:tcBorders>
+            <w:shd w:fill="D9D9D9" w:val="clear"/>
+            <w:tcMar>
+              <w:top w:type="dxa" w:w="40"/>
+              <w:left w:type="dxa" w:w="80"/>
+              <w:bottom w:type="dxa" w:w="40"/>
+              <w:right w:type="dxa" w:w="80"/>
+            </w:tcMar>
+            <w:vAlign w:val="center"/>
+          </w:tcPr>
+          <w:p>
+            <w:pPr>
+              <w:jc w:val="center"/>
+            </w:pPr>
+            <w:r>
+              <w:rPr>
+                <w:rFonts w:ascii="Times New Roman" w:cs="Times New Roman" w:eastAsia="Times New Roman" w:hAnsi="Times New Roman"/>
+                <w:b/>
+                <w:bCs/>
+                <w:sz w:val="16"/>
+                <w:szCs w:val="16"/>
+              </w:rPr>
+              <w:t xml:space="preserve">Initial (NDVI-only)</w:t>
+            </w:r>
+          </w:p>
+        </w:tc>
+        <w:tc>
+          <w:tcPr>
+            <w:tcW w:type="dxa" w:w="2730"/>
+            <w:tcBorders>
+              <w:top w:val="none" w:color="FFFFFF" w:sz="0"/>
+              <w:left w:val="none" w:color="FFFFFF" w:sz="0"/>
+              <w:bottom w:val="none" w:color="FFFFFF" w:sz="0"/>
+              <w:right w:val="none" w:color="FFFFFF" w:sz="0"/>
+            </w:tcBorders>
+            <w:shd w:fill="D9D9D9" w:val="clear"/>
+            <w:tcMar>
+              <w:top w:type="dxa" w:w="40"/>
+              <w:left w:type="dxa" w:w="80"/>
+              <w:bottom w:type="dxa" w:w="40"/>
+              <w:right w:type="dxa" w:w="80"/>
+            </w:tcMar>
+            <w:vAlign w:val="center"/>
+          </w:tcPr>
+          <w:p>
+            <w:pPr>
+              <w:jc w:val="center"/>
+            </w:pPr>
+            <w:r>
+              <w:rPr>
+                <w:rFonts w:ascii="Times New Roman" w:cs="Times New Roman" w:eastAsia="Times New Roman" w:hAnsi="Times New Roman"/>
+                <w:b/>
+                <w:bCs/>
+                <w:sz w:val="16"/>
+                <w:szCs w:val="16"/>
+              </w:rPr>
+              <w:t xml:space="preserve">Refined (NDVI+NDMI)</w:t>
+            </w:r>
+          </w:p>
+        </w:tc>
+      </w:tr>
+      <w:tr>
+        <w:tc>
+          <w:tcPr>
+            <w:tcW w:type="dxa" w:w="3600"/>
+            <w:tcBorders>
+              <w:top w:val="none" w:color="FFFFFF" w:sz="0"/>
+              <w:left w:val="none" w:color="FFFFFF" w:sz="0"/>
+              <w:bottom w:val="none" w:color="FFFFFF" w:sz="0"/>
+              <w:right w:val="none" w:color="FFFFFF" w:sz="0"/>
+            </w:tcBorders>
+            <w:tcMar>
+              <w:top w:type="dxa" w:w="40"/>
+              <w:left w:type="dxa" w:w="80"/>
+              <w:bottom w:type="dxa" w:w="40"/>
+              <w:right w:type="dxa" w:w="80"/>
+            </w:tcMar>
+            <w:vAlign w:val="center"/>
+          </w:tcPr>
+          <w:p>
+            <w:pPr>
+              <w:jc w:val="left"/>
+            </w:pPr>
+            <w:r>
+              <w:rPr>
+                <w:rFonts w:ascii="Times New Roman" w:cs="Times New Roman" w:eastAsia="Times New Roman" w:hAnsi="Times New Roman"/>
+                <w:b w:val="false"/>
+                <w:bCs w:val="false"/>
+                <w:sz w:val="16"/>
+                <w:szCs w:val="16"/>
+              </w:rPr>
+              <w:t xml:space="preserve">Water</w:t>
+            </w:r>
+          </w:p>
+        </w:tc>
+        <w:tc>
+          <w:tcPr>
+            <w:tcW w:type="dxa" w:w="2730"/>
+            <w:tcBorders>
+              <w:top w:val="none" w:color="FFFFFF" w:sz="0"/>
+              <w:left w:val="none" w:color="FFFFFF" w:sz="0"/>
+              <w:bottom w:val="none" w:color="FFFFFF" w:sz="0"/>
+              <w:right w:val="none" w:color="FFFFFF" w:sz="0"/>
+            </w:tcBorders>
+            <w:tcMar>
+              <w:top w:type="dxa" w:w="40"/>
+              <w:left w:type="dxa" w:w="80"/>
+              <w:bottom w:type="dxa" w:w="40"/>
+              <w:right w:type="dxa" w:w="80"/>
+            </w:tcMar>
+            <w:vAlign w:val="center"/>
+          </w:tcPr>
+          <w:p>
+            <w:pPr>
+              <w:jc w:val="center"/>
+            </w:pPr>
+            <w:r>
+              <w:rPr>
+                <w:rFonts w:ascii="Times New Roman" w:cs="Times New Roman" w:eastAsia="Times New Roman" w:hAnsi="Times New Roman"/>
+                <w:b w:val="false"/>
+                <w:bCs w:val="false"/>
+                <w:sz w:val="16"/>
+                <w:szCs w:val="16"/>
+              </w:rPr>
+              <w:t xml:space="preserve">43.3%</w:t>
+            </w:r>
+          </w:p>
+        </w:tc>
+        <w:tc>
+          <w:tcPr>
+            <w:tcW w:type="dxa" w:w="2730"/>
+            <w:tcBorders>
+              <w:top w:val="none" w:color="FFFFFF" w:sz="0"/>
+              <w:left w:val="none" w:color="FFFFFF" w:sz="0"/>
+              <w:bottom w:val="none" w:color="FFFFFF" w:sz="0"/>
+              <w:right w:val="none" w:color="FFFFFF" w:sz="0"/>
+            </w:tcBorders>
+            <w:tcMar>
+              <w:top w:type="dxa" w:w="40"/>
+              <w:left w:type="dxa" w:w="80"/>
+              <w:bottom w:type="dxa" w:w="40"/>
+              <w:right w:type="dxa" w:w="80"/>
+            </w:tcMar>
+            <w:vAlign w:val="center"/>
+          </w:tcPr>
+          <w:p>
+            <w:pPr>
+              <w:jc w:val="center"/>
+            </w:pPr>
+            <w:r>
+              <w:rPr>
+                <w:rFonts w:ascii="Times New Roman" w:cs="Times New Roman" w:eastAsia="Times New Roman" w:hAnsi="Times New Roman"/>
+                <w:b w:val="false"/>
+                <w:bCs w:val="false"/>
+                <w:sz w:val="16"/>
+                <w:szCs w:val="16"/>
+              </w:rPr>
+              <w:t xml:space="preserve">43.3%</w:t>
+            </w:r>
+          </w:p>
+        </w:tc>
+      </w:tr>
+      <w:tr>
+        <w:tc>
+          <w:tcPr>
+            <w:tcW w:type="dxa" w:w="3600"/>
+            <w:tcBorders>
+              <w:top w:val="none" w:color="FFFFFF" w:sz="0"/>
+              <w:left w:val="none" w:color="FFFFFF" w:sz="0"/>
+              <w:bottom w:val="none" w:color="FFFFFF" w:sz="0"/>
+              <w:right w:val="none" w:color="FFFFFF" w:sz="0"/>
+            </w:tcBorders>
+            <w:tcMar>
+              <w:top w:type="dxa" w:w="40"/>
+              <w:left w:type="dxa" w:w="80"/>
+              <w:bottom w:type="dxa" w:w="40"/>
+              <w:right w:type="dxa" w:w="80"/>
+            </w:tcMar>
+            <w:vAlign w:val="center"/>
+          </w:tcPr>
+          <w:p>
+            <w:pPr>
+              <w:jc w:val="left"/>
+            </w:pPr>
+            <w:r>
+              <w:rPr>
+                <w:rFonts w:ascii="Times New Roman" w:cs="Times New Roman" w:eastAsia="Times New Roman" w:hAnsi="Times New Roman"/>
+                <w:b w:val="false"/>
+                <w:bCs w:val="false"/>
+                <w:sz w:val="16"/>
+                <w:szCs w:val="16"/>
+              </w:rPr>
+              <w:t xml:space="preserve">Non-vegetated</w:t>
+            </w:r>
+          </w:p>
+        </w:tc>
+        <w:tc>
+          <w:tcPr>
+            <w:tcW w:type="dxa" w:w="2730"/>
+            <w:tcBorders>
+              <w:top w:val="none" w:color="FFFFFF" w:sz="0"/>
+              <w:left w:val="none" w:color="FFFFFF" w:sz="0"/>
+              <w:bottom w:val="none" w:color="FFFFFF" w:sz="0"/>
+              <w:right w:val="none" w:color="FFFFFF" w:sz="0"/>
+            </w:tcBorders>
+            <w:tcMar>
+              <w:top w:type="dxa" w:w="40"/>
+              <w:left w:type="dxa" w:w="80"/>
+              <w:bottom w:type="dxa" w:w="40"/>
+              <w:right w:type="dxa" w:w="80"/>
+            </w:tcMar>
+            <w:vAlign w:val="center"/>
+          </w:tcPr>
+          <w:p>
+            <w:pPr>
+              <w:jc w:val="center"/>
+            </w:pPr>
+            <w:r>
+              <w:rPr>
+                <w:rFonts w:ascii="Times New Roman" w:cs="Times New Roman" w:eastAsia="Times New Roman" w:hAnsi="Times New Roman"/>
+                <w:b w:val="false"/>
+                <w:bCs w:val="false"/>
+                <w:sz w:val="16"/>
+                <w:szCs w:val="16"/>
+              </w:rPr>
+              <w:t xml:space="preserve">22.4%</w:t>
+            </w:r>
+          </w:p>
+        </w:tc>
+        <w:tc>
+          <w:tcPr>
+            <w:tcW w:type="dxa" w:w="2730"/>
+            <w:tcBorders>
+              <w:top w:val="none" w:color="FFFFFF" w:sz="0"/>
+              <w:left w:val="none" w:color="FFFFFF" w:sz="0"/>
+              <w:bottom w:val="none" w:color="FFFFFF" w:sz="0"/>
+              <w:right w:val="none" w:color="FFFFFF" w:sz="0"/>
+            </w:tcBorders>
+            <w:tcMar>
+              <w:top w:type="dxa" w:w="40"/>
+              <w:left w:type="dxa" w:w="80"/>
+              <w:bottom w:type="dxa" w:w="40"/>
+              <w:right w:type="dxa" w:w="80"/>
+            </w:tcMar>
+            <w:vAlign w:val="center"/>
+          </w:tcPr>
+          <w:p>
+            <w:pPr>
+              <w:jc w:val="center"/>
+            </w:pPr>
+            <w:r>
+              <w:rPr>
+                <w:rFonts w:ascii="Times New Roman" w:cs="Times New Roman" w:eastAsia="Times New Roman" w:hAnsi="Times New Roman"/>
+                <w:b w:val="false"/>
+                <w:bCs w:val="false"/>
+                <w:sz w:val="16"/>
+                <w:szCs w:val="16"/>
+              </w:rPr>
+              <w:t xml:space="preserve">22.4%</w:t>
+            </w:r>
+          </w:p>
+        </w:tc>
+      </w:tr>
+      <w:tr>
+        <w:tc>
+          <w:tcPr>
+            <w:tcW w:type="dxa" w:w="3600"/>
+            <w:tcBorders>
+              <w:top w:val="none" w:color="FFFFFF" w:sz="0"/>
+              <w:left w:val="none" w:color="FFFFFF" w:sz="0"/>
+              <w:bottom w:val="none" w:color="FFFFFF" w:sz="0"/>
+              <w:right w:val="none" w:color="FFFFFF" w:sz="0"/>
+            </w:tcBorders>
+            <w:tcMar>
+              <w:top w:type="dxa" w:w="40"/>
+              <w:left w:type="dxa" w:w="80"/>
+              <w:bottom w:type="dxa" w:w="40"/>
+              <w:right w:type="dxa" w:w="80"/>
+            </w:tcMar>
+            <w:vAlign w:val="center"/>
+          </w:tcPr>
+          <w:p>
+            <w:pPr>
+              <w:jc w:val="left"/>
+            </w:pPr>
+            <w:r>
+              <w:rPr>
+                <w:rFonts w:ascii="Times New Roman" w:cs="Times New Roman" w:eastAsia="Times New Roman" w:hAnsi="Times New Roman"/>
+                <w:b w:val="false"/>
+                <w:bCs w:val="false"/>
+                <w:sz w:val="16"/>
+                <w:szCs w:val="16"/>
+              </w:rPr>
+              <w:t xml:space="preserve">Sparse vegetation</w:t>
+            </w:r>
+          </w:p>
+        </w:tc>
+        <w:tc>
+          <w:tcPr>
+            <w:tcW w:type="dxa" w:w="2730"/>
+            <w:tcBorders>
+              <w:top w:val="none" w:color="FFFFFF" w:sz="0"/>
+              <w:left w:val="none" w:color="FFFFFF" w:sz="0"/>
+              <w:bottom w:val="none" w:color="FFFFFF" w:sz="0"/>
+              <w:right w:val="none" w:color="FFFFFF" w:sz="0"/>
+            </w:tcBorders>
+            <w:tcMar>
+              <w:top w:type="dxa" w:w="40"/>
+              <w:left w:type="dxa" w:w="80"/>
+              <w:bottom w:type="dxa" w:w="40"/>
+              <w:right w:type="dxa" w:w="80"/>
+            </w:tcMar>
+            <w:vAlign w:val="center"/>
+          </w:tcPr>
+          <w:p>
+            <w:pPr>
+              <w:jc w:val="center"/>
+            </w:pPr>
+            <w:r>
+              <w:rPr>
+                <w:rFonts w:ascii="Times New Roman" w:cs="Times New Roman" w:eastAsia="Times New Roman" w:hAnsi="Times New Roman"/>
+                <w:b w:val="false"/>
+                <w:bCs w:val="false"/>
+                <w:sz w:val="16"/>
+                <w:szCs w:val="16"/>
+              </w:rPr>
+              <w:t xml:space="preserve">25.2%</w:t>
+            </w:r>
+          </w:p>
+        </w:tc>
+        <w:tc>
+          <w:tcPr>
+            <w:tcW w:type="dxa" w:w="2730"/>
+            <w:tcBorders>
+              <w:top w:val="none" w:color="FFFFFF" w:sz="0"/>
+              <w:left w:val="none" w:color="FFFFFF" w:sz="0"/>
+              <w:bottom w:val="none" w:color="FFFFFF" w:sz="0"/>
+              <w:right w:val="none" w:color="FFFFFF" w:sz="0"/>
+            </w:tcBorders>
+            <w:tcMar>
+              <w:top w:type="dxa" w:w="40"/>
+              <w:left w:type="dxa" w:w="80"/>
+              <w:bottom w:type="dxa" w:w="40"/>
+              <w:right w:type="dxa" w:w="80"/>
+            </w:tcMar>
+            <w:vAlign w:val="center"/>
+          </w:tcPr>
+          <w:p>
+            <w:pPr>
+              <w:jc w:val="center"/>
+            </w:pPr>
+            <w:r>
+              <w:rPr>
+                <w:rFonts w:ascii="Times New Roman" w:cs="Times New Roman" w:eastAsia="Times New Roman" w:hAnsi="Times New Roman"/>
+                <w:b w:val="false"/>
+                <w:bCs w:val="false"/>
+                <w:sz w:val="16"/>
+                <w:szCs w:val="16"/>
+              </w:rPr>
+              <w:t xml:space="preserve">64.3%</w:t>
+            </w:r>
+          </w:p>
+        </w:tc>
+      </w:tr>
+      <w:tr>
+        <w:tc>
+          <w:tcPr>
+            <w:tcW w:type="dxa" w:w="3600"/>
+            <w:tcBorders>
+              <w:top w:val="none" w:color="FFFFFF" w:sz="0"/>
+              <w:left w:val="none" w:color="FFFFFF" w:sz="0"/>
+              <w:bottom w:val="none" w:color="FFFFFF" w:sz="0"/>
+              <w:right w:val="none" w:color="FFFFFF" w:sz="0"/>
+            </w:tcBorders>
+            <w:tcMar>
+              <w:top w:type="dxa" w:w="40"/>
+              <w:left w:type="dxa" w:w="80"/>
+              <w:bottom w:type="dxa" w:w="40"/>
+              <w:right w:type="dxa" w:w="80"/>
+            </w:tcMar>
+            <w:vAlign w:val="center"/>
+          </w:tcPr>
+          <w:p>
+            <w:pPr>
+              <w:jc w:val="left"/>
+            </w:pPr>
+            <w:r>
+              <w:rPr>
+                <w:rFonts w:ascii="Times New Roman" w:cs="Times New Roman" w:eastAsia="Times New Roman" w:hAnsi="Times New Roman"/>
+                <w:b w:val="false"/>
+                <w:bCs w:val="false"/>
+                <w:sz w:val="16"/>
+                <w:szCs w:val="16"/>
+              </w:rPr>
+              <w:t xml:space="preserve">Dense vegetation</w:t>
+            </w:r>
+          </w:p>
+        </w:tc>
+        <w:tc>
+          <w:tcPr>
+            <w:tcW w:type="dxa" w:w="2730"/>
+            <w:tcBorders>
+              <w:top w:val="none" w:color="FFFFFF" w:sz="0"/>
+              <w:left w:val="none" w:color="FFFFFF" w:sz="0"/>
+              <w:bottom w:val="none" w:color="FFFFFF" w:sz="0"/>
+              <w:right w:val="none" w:color="FFFFFF" w:sz="0"/>
+            </w:tcBorders>
+            <w:tcMar>
+              <w:top w:type="dxa" w:w="40"/>
+              <w:left w:type="dxa" w:w="80"/>
+              <w:bottom w:type="dxa" w:w="40"/>
+              <w:right w:type="dxa" w:w="80"/>
+            </w:tcMar>
+            <w:vAlign w:val="center"/>
+          </w:tcPr>
+          <w:p>
+            <w:pPr>
+              <w:jc w:val="center"/>
+            </w:pPr>
+            <w:r>
+              <w:rPr>
+                <w:rFonts w:ascii="Times New Roman" w:cs="Times New Roman" w:eastAsia="Times New Roman" w:hAnsi="Times New Roman"/>
+                <w:b w:val="false"/>
+                <w:bCs w:val="false"/>
+                <w:sz w:val="16"/>
+                <w:szCs w:val="16"/>
+              </w:rPr>
+              <w:t xml:space="preserve">91.1%</w:t>
+            </w:r>
+          </w:p>
+        </w:tc>
+        <w:tc>
+          <w:tcPr>
+            <w:tcW w:type="dxa" w:w="2730"/>
+            <w:tcBorders>
+              <w:top w:val="none" w:color="FFFFFF" w:sz="0"/>
+              <w:left w:val="none" w:color="FFFFFF" w:sz="0"/>
+              <w:bottom w:val="none" w:color="FFFFFF" w:sz="0"/>
+              <w:right w:val="none" w:color="FFFFFF" w:sz="0"/>
+            </w:tcBorders>
+            <w:tcMar>
+              <w:top w:type="dxa" w:w="40"/>
+              <w:left w:type="dxa" w:w="80"/>
+              <w:bottom w:type="dxa" w:w="40"/>
+              <w:right w:type="dxa" w:w="80"/>
+            </w:tcMar>
+            <w:vAlign w:val="center"/>
+          </w:tcPr>
+          <w:p>
+            <w:pPr>
+              <w:jc w:val="center"/>
+            </w:pPr>
+            <w:r>
+              <w:rPr>
+                <w:rFonts w:ascii="Times New Roman" w:cs="Times New Roman" w:eastAsia="Times New Roman" w:hAnsi="Times New Roman"/>
+                <w:b w:val="false"/>
+                <w:bCs w:val="false"/>
+                <w:sz w:val="16"/>
+                <w:szCs w:val="16"/>
+              </w:rPr>
+              <w:t xml:space="preserve">53.2%</w:t>
+            </w:r>
+          </w:p>
+        </w:tc>
+      </w:tr>
+    </w:tbl>
+    <w:p>
+      <w:pPr>
+        <w:spacing w:after="120" w:line="252"/>
+        <w:ind w:firstLine="204"/>
+        <w:jc w:val="both"/>
+      </w:pPr>
+      <w:r>
+        <w:rPr>
+          <w:rFonts w:ascii="Times New Roman" w:cs="Times New Roman" w:eastAsia="Times New Roman" w:hAnsi="Times New Roman"/>
+          <w:sz w:val="20"/>
+          <w:szCs w:val="20"/>
+        </w:rPr>
+        <w:t xml:space="preserve">The refinement is a genuine but partial correction, not a solved problem: it recovers Sparse-vegetation accuracy substantially (25.2% → 64.3%) at a real cost to Dense-vegetation accuracy (91.1% → 53.2%), because the added NDMI threshold reassigns some genuinely forested pixels along with the intended agricultural/plantation ones. A sensitivity check excluding the three crosswalk-ambiguous reference classes (swamp, swamp shrub, tree-crop plantation) changed Overall Accuracy by less than one percentage point in either direction, indicating the crosswalk judgment calls were not driving the result.</w:t>
+      </w:r>
+    </w:p>
+    <w:p>
+      <w:pPr>
+        <w:keepNext/>
+        <w:spacing w:after="100" w:before="200"/>
+        <w:ind w:firstLine="204"/>
+        <w:jc w:val="left"/>
+      </w:pPr>
+      <w:r>
+        <w:rPr>
+          <w:rFonts w:ascii="Times New Roman" w:cs="Times New Roman" w:eastAsia="Times New Roman" w:hAnsi="Times New Roman"/>
+          <w:b/>
+          <w:bCs/>
+          <w:i/>
+          <w:iCs/>
+          <w:sz w:val="20"/>
+          <w:szCs w:val="20"/>
+        </w:rPr>
+        <w:t xml:space="preserve">H. </w:t>
+      </w:r>
+      <w:r>
+        <w:rPr>
+          <w:rFonts w:ascii="Times New Roman" w:cs="Times New Roman" w:eastAsia="Times New Roman" w:hAnsi="Times New Roman"/>
+          <w:b/>
+          <w:bCs/>
+          <w:i/>
+          <w:iCs/>
+          <w:sz w:val="20"/>
+          <w:szCs w:val="20"/>
+        </w:rPr>
+        <w:t xml:space="preserve">Refined Classification and Rebuilt Model Results</w:t>
+      </w:r>
+    </w:p>
+    <w:p>
+      <w:pPr>
+        <w:spacing w:after="120" w:line="252"/>
+        <w:ind w:firstLine="204"/>
+        <w:jc w:val="both"/>
+      </w:pPr>
+      <w:r>
+        <w:rPr>
+          <w:rFonts w:ascii="Times New Roman" w:cs="Times New Roman" w:eastAsia="Times New Roman" w:hAnsi="Times New Roman"/>
+          <w:sz w:val="20"/>
+          <w:szCs w:val="20"/>
+        </w:rPr>
+        <w:t xml:space="preserve">Under the refined (NDVI+NDMI) classification, the 2024 baseline shifts substantially from Table 2: Dense vegetation falls from 23,854.2 km² to 11,542.8 km² and Sparse vegetation rises from 8,292.0 km² to 20,603.4 km², since much of what NDVI alone labeled Dense vegetation is, by the independent reference and the added moisture index, agricultural or plantation land instead. Water and Non-vegetated areas are unchanged, since their thresholds were not modified.</w:t>
+      </w:r>
+    </w:p>
+    <w:p>
+      <w:pPr>
+        <w:spacing w:after="120" w:line="252"/>
+        <w:ind w:firstLine="204"/>
+        <w:jc w:val="both"/>
+      </w:pPr>
+      <w:r>
+        <w:rPr>
+          <w:rFonts w:ascii="Times New Roman" w:cs="Times New Roman" w:eastAsia="Times New Roman" w:hAnsi="Times New Roman"/>
+          <w:sz w:val="20"/>
+          <w:szCs w:val="20"/>
+        </w:rPr>
+        <w:t xml:space="preserve">The CA–Markov transition matrix and CA allocation were re-run in full on the refined classifications, using the same capping procedure as Section III-E (the raw annualized Non-vegetated→Water rate was 13.6%/year, again capped to 1%/year):</w:t>
+      </w:r>
+    </w:p>
+    <w:p>
+      <w:pPr>
+        <w:spacing w:after="20" w:before="200"/>
+        <w:jc w:val="left"/>
+      </w:pPr>
+      <w:r>
+        <w:rPr>
+          <w:rFonts w:ascii="Times New Roman" w:cs="Times New Roman" w:eastAsia="Times New Roman" w:hAnsi="Times New Roman"/>
+          <w:sz w:val="16"/>
+          <w:szCs w:val="16"/>
+        </w:rPr>
+        <w:t xml:space="preserve">TABLE 15</w:t>
+      </w:r>
+    </w:p>
+    <w:p>
+      <w:pPr>
+        <w:spacing w:after="100"/>
+        <w:jc w:val="left"/>
+      </w:pPr>
+      <w:r>
+        <w:rPr>
+          <w:rFonts w:ascii="Times New Roman" w:cs="Times New Roman" w:eastAsia="Times New Roman" w:hAnsi="Times New Roman"/>
+          <w:caps/>
+          <w:sz w:val="16"/>
+          <w:szCs w:val="16"/>
+        </w:rPr>
+        <w:t xml:space="preserve">REFINED CA–MARKOV PROJECTED LAND COVER, 2025</w:t>
+      </w:r>
+    </w:p>
+    <w:tbl>
+      <w:tblPr>
+        <w:tblW w:type="dxa" w:w="9360"/>
+        <w:tblBorders>
+          <w:top w:val="single" w:color="000000" w:sz="8"/>
+          <w:left w:val="none" w:color="FFFFFF" w:sz="0"/>
+          <w:bottom w:val="single" w:color="000000" w:sz="8"/>
+          <w:right w:val="none" w:color="FFFFFF" w:sz="0"/>
+          <w:insideH w:val="none" w:color="FFFFFF" w:sz="0"/>
+          <w:insideV w:val="none" w:color="FFFFFF" w:sz="0"/>
+        </w:tblBorders>
+      </w:tblPr>
+      <w:tblGrid>
+        <w:gridCol w:w="3200"/>
+        <w:gridCol w:w="1750"/>
+        <w:gridCol w:w="1750"/>
+        <w:gridCol w:w="1300"/>
+        <w:gridCol w:w="1360"/>
+      </w:tblGrid>
+      <w:tr>
+        <w:trPr>
+          <w:tblHeader/>
+        </w:trPr>
+        <w:tc>
+          <w:tcPr>
+            <w:tcW w:type="dxa" w:w="3200"/>
+            <w:tcBorders>
+              <w:top w:val="none" w:color="FFFFFF" w:sz="0"/>
+              <w:left w:val="none" w:color="FFFFFF" w:sz="0"/>
+              <w:bottom w:val="none" w:color="FFFFFF" w:sz="0"/>
+              <w:right w:val="none" w:color="FFFFFF" w:sz="0"/>
+            </w:tcBorders>
+            <w:shd w:fill="D9D9D9" w:val="clear"/>
+            <w:tcMar>
+              <w:top w:type="dxa" w:w="40"/>
+              <w:left w:type="dxa" w:w="80"/>
+              <w:bottom w:type="dxa" w:w="40"/>
+              <w:right w:type="dxa" w:w="80"/>
+            </w:tcMar>
+            <w:vAlign w:val="center"/>
+          </w:tcPr>
+          <w:p>
+            <w:pPr>
+              <w:jc w:val="center"/>
+            </w:pPr>
+            <w:r>
+              <w:rPr>
+                <w:rFonts w:ascii="Times New Roman" w:cs="Times New Roman" w:eastAsia="Times New Roman" w:hAnsi="Times New Roman"/>
+                <w:b/>
+                <w:bCs/>
+                <w:sz w:val="16"/>
+                <w:szCs w:val="16"/>
+              </w:rPr>
+              <w:t xml:space="preserve">Class</w:t>
+            </w:r>
+          </w:p>
+        </w:tc>
+        <w:tc>
+          <w:tcPr>
+            <w:tcW w:type="dxa" w:w="1750"/>
+            <w:tcBorders>
+              <w:top w:val="none" w:color="FFFFFF" w:sz="0"/>
+              <w:left w:val="none" w:color="FFFFFF" w:sz="0"/>
+              <w:bottom w:val="none" w:color="FFFFFF" w:sz="0"/>
+              <w:right w:val="none" w:color="FFFFFF" w:sz="0"/>
+            </w:tcBorders>
+            <w:shd w:fill="D9D9D9" w:val="clear"/>
+            <w:tcMar>
+              <w:top w:type="dxa" w:w="40"/>
+              <w:left w:type="dxa" w:w="80"/>
+              <w:bottom w:type="dxa" w:w="40"/>
+              <w:right w:type="dxa" w:w="80"/>
+            </w:tcMar>
+            <w:vAlign w:val="center"/>
+          </w:tcPr>
+          <w:p>
+            <w:pPr>
+              <w:jc w:val="center"/>
+            </w:pPr>
+            <w:r>
+              <w:rPr>
+                <w:rFonts w:ascii="Times New Roman" w:cs="Times New Roman" w:eastAsia="Times New Roman" w:hAnsi="Times New Roman"/>
+                <w:b/>
+                <w:bCs/>
+                <w:sz w:val="16"/>
+                <w:szCs w:val="16"/>
+              </w:rPr>
+              <w:t xml:space="preserve">2024 (km²)</w:t>
+            </w:r>
+          </w:p>
+        </w:tc>
+        <w:tc>
+          <w:tcPr>
+            <w:tcW w:type="dxa" w:w="1750"/>
+            <w:tcBorders>
+              <w:top w:val="none" w:color="FFFFFF" w:sz="0"/>
+              <w:left w:val="none" w:color="FFFFFF" w:sz="0"/>
+              <w:bottom w:val="none" w:color="FFFFFF" w:sz="0"/>
+              <w:right w:val="none" w:color="FFFFFF" w:sz="0"/>
+            </w:tcBorders>
+            <w:shd w:fill="D9D9D9" w:val="clear"/>
+            <w:tcMar>
+              <w:top w:type="dxa" w:w="40"/>
+              <w:left w:type="dxa" w:w="80"/>
+              <w:bottom w:type="dxa" w:w="40"/>
+              <w:right w:type="dxa" w:w="80"/>
+            </w:tcMar>
+            <w:vAlign w:val="center"/>
+          </w:tcPr>
+          <w:p>
+            <w:pPr>
+              <w:jc w:val="center"/>
+            </w:pPr>
+            <w:r>
+              <w:rPr>
+                <w:rFonts w:ascii="Times New Roman" w:cs="Times New Roman" w:eastAsia="Times New Roman" w:hAnsi="Times New Roman"/>
+                <w:b/>
+                <w:bCs/>
+                <w:sz w:val="16"/>
+                <w:szCs w:val="16"/>
+              </w:rPr>
+              <w:t xml:space="preserve">2025 (km²)</w:t>
+            </w:r>
+          </w:p>
+        </w:tc>
+        <w:tc>
+          <w:tcPr>
+            <w:tcW w:type="dxa" w:w="1300"/>
+            <w:tcBorders>
+              <w:top w:val="none" w:color="FFFFFF" w:sz="0"/>
+              <w:left w:val="none" w:color="FFFFFF" w:sz="0"/>
+              <w:bottom w:val="none" w:color="FFFFFF" w:sz="0"/>
+              <w:right w:val="none" w:color="FFFFFF" w:sz="0"/>
+            </w:tcBorders>
+            <w:shd w:fill="D9D9D9" w:val="clear"/>
+            <w:tcMar>
+              <w:top w:type="dxa" w:w="40"/>
+              <w:left w:type="dxa" w:w="80"/>
+              <w:bottom w:type="dxa" w:w="40"/>
+              <w:right w:type="dxa" w:w="80"/>
+            </w:tcMar>
+            <w:vAlign w:val="center"/>
+          </w:tcPr>
+          <w:p>
+            <w:pPr>
+              <w:jc w:val="center"/>
+            </w:pPr>
+            <w:r>
+              <w:rPr>
+                <w:rFonts w:ascii="Times New Roman" w:cs="Times New Roman" w:eastAsia="Times New Roman" w:hAnsi="Times New Roman"/>
+                <w:b/>
+                <w:bCs/>
+                <w:sz w:val="16"/>
+                <w:szCs w:val="16"/>
+              </w:rPr>
+              <w:t xml:space="preserve">Δ (km²)</w:t>
+            </w:r>
+          </w:p>
+        </w:tc>
+        <w:tc>
+          <w:tcPr>
+            <w:tcW w:type="dxa" w:w="1360"/>
+            <w:tcBorders>
+              <w:top w:val="none" w:color="FFFFFF" w:sz="0"/>
+              <w:left w:val="none" w:color="FFFFFF" w:sz="0"/>
+              <w:bottom w:val="none" w:color="FFFFFF" w:sz="0"/>
+              <w:right w:val="none" w:color="FFFFFF" w:sz="0"/>
+            </w:tcBorders>
+            <w:shd w:fill="D9D9D9" w:val="clear"/>
+            <w:tcMar>
+              <w:top w:type="dxa" w:w="40"/>
+              <w:left w:type="dxa" w:w="80"/>
+              <w:bottom w:type="dxa" w:w="40"/>
+              <w:right w:type="dxa" w:w="80"/>
+            </w:tcMar>
+            <w:vAlign w:val="center"/>
+          </w:tcPr>
+          <w:p>
+            <w:pPr>
+              <w:jc w:val="center"/>
+            </w:pPr>
+            <w:r>
+              <w:rPr>
+                <w:rFonts w:ascii="Times New Roman" w:cs="Times New Roman" w:eastAsia="Times New Roman" w:hAnsi="Times New Roman"/>
+                <w:b/>
+                <w:bCs/>
+                <w:sz w:val="16"/>
+                <w:szCs w:val="16"/>
+              </w:rPr>
+              <w:t xml:space="preserve">Δ (%)</w:t>
+            </w:r>
+          </w:p>
+        </w:tc>
+      </w:tr>
+      <w:tr>
+        <w:tc>
+          <w:tcPr>
+            <w:tcW w:type="dxa" w:w="3200"/>
+            <w:tcBorders>
+              <w:top w:val="none" w:color="FFFFFF" w:sz="0"/>
+              <w:left w:val="none" w:color="FFFFFF" w:sz="0"/>
+              <w:bottom w:val="none" w:color="FFFFFF" w:sz="0"/>
+              <w:right w:val="none" w:color="FFFFFF" w:sz="0"/>
+            </w:tcBorders>
+            <w:tcMar>
+              <w:top w:type="dxa" w:w="40"/>
+              <w:left w:type="dxa" w:w="80"/>
+              <w:bottom w:type="dxa" w:w="40"/>
+              <w:right w:type="dxa" w:w="80"/>
+            </w:tcMar>
+            <w:vAlign w:val="center"/>
+          </w:tcPr>
+          <w:p>
+            <w:pPr>
+              <w:jc w:val="left"/>
+            </w:pPr>
+            <w:r>
+              <w:rPr>
+                <w:rFonts w:ascii="Times New Roman" w:cs="Times New Roman" w:eastAsia="Times New Roman" w:hAnsi="Times New Roman"/>
+                <w:b w:val="false"/>
+                <w:bCs w:val="false"/>
+                <w:sz w:val="16"/>
+                <w:szCs w:val="16"/>
+              </w:rPr>
+              <w:t xml:space="preserve">Water</w:t>
+            </w:r>
+          </w:p>
+        </w:tc>
+        <w:tc>
+          <w:tcPr>
+            <w:tcW w:type="dxa" w:w="1750"/>
+            <w:tcBorders>
+              <w:top w:val="none" w:color="FFFFFF" w:sz="0"/>
+              <w:left w:val="none" w:color="FFFFFF" w:sz="0"/>
+              <w:bottom w:val="none" w:color="FFFFFF" w:sz="0"/>
+              <w:right w:val="none" w:color="FFFFFF" w:sz="0"/>
+            </w:tcBorders>
+            <w:tcMar>
+              <w:top w:type="dxa" w:w="40"/>
+              <w:left w:type="dxa" w:w="80"/>
+              <w:bottom w:type="dxa" w:w="40"/>
+              <w:right w:type="dxa" w:w="80"/>
+            </w:tcMar>
+            <w:vAlign w:val="center"/>
+          </w:tcPr>
+          <w:p>
+            <w:pPr>
+              <w:jc w:val="center"/>
+            </w:pPr>
+            <w:r>
+              <w:rPr>
+                <w:rFonts w:ascii="Times New Roman" w:cs="Times New Roman" w:eastAsia="Times New Roman" w:hAnsi="Times New Roman"/>
+                <w:b w:val="false"/>
+                <w:bCs w:val="false"/>
+                <w:sz w:val="16"/>
+                <w:szCs w:val="16"/>
+              </w:rPr>
+              <w:t xml:space="preserve">1,168.7</w:t>
+            </w:r>
+          </w:p>
+        </w:tc>
+        <w:tc>
+          <w:tcPr>
+            <w:tcW w:type="dxa" w:w="1750"/>
+            <w:tcBorders>
+              <w:top w:val="none" w:color="FFFFFF" w:sz="0"/>
+              <w:left w:val="none" w:color="FFFFFF" w:sz="0"/>
+              <w:bottom w:val="none" w:color="FFFFFF" w:sz="0"/>
+              <w:right w:val="none" w:color="FFFFFF" w:sz="0"/>
+            </w:tcBorders>
+            <w:tcMar>
+              <w:top w:type="dxa" w:w="40"/>
+              <w:left w:type="dxa" w:w="80"/>
+              <w:bottom w:type="dxa" w:w="40"/>
+              <w:right w:type="dxa" w:w="80"/>
+            </w:tcMar>
+            <w:vAlign w:val="center"/>
+          </w:tcPr>
+          <w:p>
+            <w:pPr>
+              <w:jc w:val="center"/>
+            </w:pPr>
+            <w:r>
+              <w:rPr>
+                <w:rFonts w:ascii="Times New Roman" w:cs="Times New Roman" w:eastAsia="Times New Roman" w:hAnsi="Times New Roman"/>
+                <w:b w:val="false"/>
+                <w:bCs w:val="false"/>
+                <w:sz w:val="16"/>
+                <w:szCs w:val="16"/>
+              </w:rPr>
+              <w:t xml:space="preserve">1,200.8</w:t>
+            </w:r>
+          </w:p>
+        </w:tc>
+        <w:tc>
+          <w:tcPr>
+            <w:tcW w:type="dxa" w:w="1300"/>
+            <w:tcBorders>
+              <w:top w:val="none" w:color="FFFFFF" w:sz="0"/>
+              <w:left w:val="none" w:color="FFFFFF" w:sz="0"/>
+              <w:bottom w:val="none" w:color="FFFFFF" w:sz="0"/>
+              <w:right w:val="none" w:color="FFFFFF" w:sz="0"/>
+            </w:tcBorders>
+            <w:tcMar>
+              <w:top w:type="dxa" w:w="40"/>
+              <w:left w:type="dxa" w:w="80"/>
+              <w:bottom w:type="dxa" w:w="40"/>
+              <w:right w:type="dxa" w:w="80"/>
+            </w:tcMar>
+            <w:vAlign w:val="center"/>
+          </w:tcPr>
+          <w:p>
+            <w:pPr>
+              <w:jc w:val="center"/>
+            </w:pPr>
+            <w:r>
+              <w:rPr>
+                <w:rFonts w:ascii="Times New Roman" w:cs="Times New Roman" w:eastAsia="Times New Roman" w:hAnsi="Times New Roman"/>
+                <w:b w:val="false"/>
+                <w:bCs w:val="false"/>
+                <w:sz w:val="16"/>
+                <w:szCs w:val="16"/>
+              </w:rPr>
+              <w:t xml:space="preserve">+32.1</w:t>
+            </w:r>
+          </w:p>
+        </w:tc>
+        <w:tc>
+          <w:tcPr>
+            <w:tcW w:type="dxa" w:w="1360"/>
+            <w:tcBorders>
+              <w:top w:val="none" w:color="FFFFFF" w:sz="0"/>
+              <w:left w:val="none" w:color="FFFFFF" w:sz="0"/>
+              <w:bottom w:val="none" w:color="FFFFFF" w:sz="0"/>
+              <w:right w:val="none" w:color="FFFFFF" w:sz="0"/>
+            </w:tcBorders>
+            <w:tcMar>
+              <w:top w:type="dxa" w:w="40"/>
+              <w:left w:type="dxa" w:w="80"/>
+              <w:bottom w:type="dxa" w:w="40"/>
+              <w:right w:type="dxa" w:w="80"/>
+            </w:tcMar>
+            <w:vAlign w:val="center"/>
+          </w:tcPr>
+          <w:p>
+            <w:pPr>
+              <w:jc w:val="center"/>
+            </w:pPr>
+            <w:r>
+              <w:rPr>
+                <w:rFonts w:ascii="Times New Roman" w:cs="Times New Roman" w:eastAsia="Times New Roman" w:hAnsi="Times New Roman"/>
+                <w:b w:val="false"/>
+                <w:bCs w:val="false"/>
+                <w:sz w:val="16"/>
+                <w:szCs w:val="16"/>
+              </w:rPr>
+              <w:t xml:space="preserve">+2.8</w:t>
+            </w:r>
+          </w:p>
+        </w:tc>
+      </w:tr>
+      <w:tr>
+        <w:tc>
+          <w:tcPr>
+            <w:tcW w:type="dxa" w:w="3200"/>
+            <w:tcBorders>
+              <w:top w:val="none" w:color="FFFFFF" w:sz="0"/>
+              <w:left w:val="none" w:color="FFFFFF" w:sz="0"/>
+              <w:bottom w:val="none" w:color="FFFFFF" w:sz="0"/>
+              <w:right w:val="none" w:color="FFFFFF" w:sz="0"/>
+            </w:tcBorders>
+            <w:tcMar>
+              <w:top w:type="dxa" w:w="40"/>
+              <w:left w:type="dxa" w:w="80"/>
+              <w:bottom w:type="dxa" w:w="40"/>
+              <w:right w:type="dxa" w:w="80"/>
+            </w:tcMar>
+            <w:vAlign w:val="center"/>
+          </w:tcPr>
+          <w:p>
+            <w:pPr>
+              <w:jc w:val="left"/>
+            </w:pPr>
+            <w:r>
+              <w:rPr>
+                <w:rFonts w:ascii="Times New Roman" w:cs="Times New Roman" w:eastAsia="Times New Roman" w:hAnsi="Times New Roman"/>
+                <w:b w:val="false"/>
+                <w:bCs w:val="false"/>
+                <w:sz w:val="16"/>
+                <w:szCs w:val="16"/>
+              </w:rPr>
+              <w:t xml:space="preserve">Non-vegetated</w:t>
+            </w:r>
+          </w:p>
+        </w:tc>
+        <w:tc>
+          <w:tcPr>
+            <w:tcW w:type="dxa" w:w="1750"/>
+            <w:tcBorders>
+              <w:top w:val="none" w:color="FFFFFF" w:sz="0"/>
+              <w:left w:val="none" w:color="FFFFFF" w:sz="0"/>
+              <w:bottom w:val="none" w:color="FFFFFF" w:sz="0"/>
+              <w:right w:val="none" w:color="FFFFFF" w:sz="0"/>
+            </w:tcBorders>
+            <w:tcMar>
+              <w:top w:type="dxa" w:w="40"/>
+              <w:left w:type="dxa" w:w="80"/>
+              <w:bottom w:type="dxa" w:w="40"/>
+              <w:right w:type="dxa" w:w="80"/>
+            </w:tcMar>
+            <w:vAlign w:val="center"/>
+          </w:tcPr>
+          <w:p>
+            <w:pPr>
+              <w:jc w:val="center"/>
+            </w:pPr>
+            <w:r>
+              <w:rPr>
+                <w:rFonts w:ascii="Times New Roman" w:cs="Times New Roman" w:eastAsia="Times New Roman" w:hAnsi="Times New Roman"/>
+                <w:b w:val="false"/>
+                <w:bCs w:val="false"/>
+                <w:sz w:val="16"/>
+                <w:szCs w:val="16"/>
+              </w:rPr>
+              <w:t xml:space="preserve">2,207.4</w:t>
+            </w:r>
+          </w:p>
+        </w:tc>
+        <w:tc>
+          <w:tcPr>
+            <w:tcW w:type="dxa" w:w="1750"/>
+            <w:tcBorders>
+              <w:top w:val="none" w:color="FFFFFF" w:sz="0"/>
+              <w:left w:val="none" w:color="FFFFFF" w:sz="0"/>
+              <w:bottom w:val="none" w:color="FFFFFF" w:sz="0"/>
+              <w:right w:val="none" w:color="FFFFFF" w:sz="0"/>
+            </w:tcBorders>
+            <w:tcMar>
+              <w:top w:type="dxa" w:w="40"/>
+              <w:left w:type="dxa" w:w="80"/>
+              <w:bottom w:type="dxa" w:w="40"/>
+              <w:right w:type="dxa" w:w="80"/>
+            </w:tcMar>
+            <w:vAlign w:val="center"/>
+          </w:tcPr>
+          <w:p>
+            <w:pPr>
+              <w:jc w:val="center"/>
+            </w:pPr>
+            <w:r>
+              <w:rPr>
+                <w:rFonts w:ascii="Times New Roman" w:cs="Times New Roman" w:eastAsia="Times New Roman" w:hAnsi="Times New Roman"/>
+                <w:b w:val="false"/>
+                <w:bCs w:val="false"/>
+                <w:sz w:val="16"/>
+                <w:szCs w:val="16"/>
+              </w:rPr>
+              <w:t xml:space="preserve">2,626.0</w:t>
+            </w:r>
+          </w:p>
+        </w:tc>
+        <w:tc>
+          <w:tcPr>
+            <w:tcW w:type="dxa" w:w="1300"/>
+            <w:tcBorders>
+              <w:top w:val="none" w:color="FFFFFF" w:sz="0"/>
+              <w:left w:val="none" w:color="FFFFFF" w:sz="0"/>
+              <w:bottom w:val="none" w:color="FFFFFF" w:sz="0"/>
+              <w:right w:val="none" w:color="FFFFFF" w:sz="0"/>
+            </w:tcBorders>
+            <w:tcMar>
+              <w:top w:type="dxa" w:w="40"/>
+              <w:left w:type="dxa" w:w="80"/>
+              <w:bottom w:type="dxa" w:w="40"/>
+              <w:right w:type="dxa" w:w="80"/>
+            </w:tcMar>
+            <w:vAlign w:val="center"/>
+          </w:tcPr>
+          <w:p>
+            <w:pPr>
+              <w:jc w:val="center"/>
+            </w:pPr>
+            <w:r>
+              <w:rPr>
+                <w:rFonts w:ascii="Times New Roman" w:cs="Times New Roman" w:eastAsia="Times New Roman" w:hAnsi="Times New Roman"/>
+                <w:b w:val="false"/>
+                <w:bCs w:val="false"/>
+                <w:sz w:val="16"/>
+                <w:szCs w:val="16"/>
+              </w:rPr>
+              <w:t xml:space="preserve">+418.6</w:t>
+            </w:r>
+          </w:p>
+        </w:tc>
+        <w:tc>
+          <w:tcPr>
+            <w:tcW w:type="dxa" w:w="1360"/>
+            <w:tcBorders>
+              <w:top w:val="none" w:color="FFFFFF" w:sz="0"/>
+              <w:left w:val="none" w:color="FFFFFF" w:sz="0"/>
+              <w:bottom w:val="none" w:color="FFFFFF" w:sz="0"/>
+              <w:right w:val="none" w:color="FFFFFF" w:sz="0"/>
+            </w:tcBorders>
+            <w:tcMar>
+              <w:top w:type="dxa" w:w="40"/>
+              <w:left w:type="dxa" w:w="80"/>
+              <w:bottom w:type="dxa" w:w="40"/>
+              <w:right w:type="dxa" w:w="80"/>
+            </w:tcMar>
+            <w:vAlign w:val="center"/>
+          </w:tcPr>
+          <w:p>
+            <w:pPr>
+              <w:jc w:val="center"/>
+            </w:pPr>
+            <w:r>
+              <w:rPr>
+                <w:rFonts w:ascii="Times New Roman" w:cs="Times New Roman" w:eastAsia="Times New Roman" w:hAnsi="Times New Roman"/>
+                <w:b w:val="false"/>
+                <w:bCs w:val="false"/>
+                <w:sz w:val="16"/>
+                <w:szCs w:val="16"/>
+              </w:rPr>
+              <w:t xml:space="preserve">+19.0</w:t>
+            </w:r>
+          </w:p>
+        </w:tc>
+      </w:tr>
+      <w:tr>
+        <w:tc>
+          <w:tcPr>
+            <w:tcW w:type="dxa" w:w="3200"/>
+            <w:tcBorders>
+              <w:top w:val="none" w:color="FFFFFF" w:sz="0"/>
+              <w:left w:val="none" w:color="FFFFFF" w:sz="0"/>
+              <w:bottom w:val="none" w:color="FFFFFF" w:sz="0"/>
+              <w:right w:val="none" w:color="FFFFFF" w:sz="0"/>
+            </w:tcBorders>
+            <w:tcMar>
+              <w:top w:type="dxa" w:w="40"/>
+              <w:left w:type="dxa" w:w="80"/>
+              <w:bottom w:type="dxa" w:w="40"/>
+              <w:right w:type="dxa" w:w="80"/>
+            </w:tcMar>
+            <w:vAlign w:val="center"/>
+          </w:tcPr>
+          <w:p>
+            <w:pPr>
+              <w:jc w:val="left"/>
+            </w:pPr>
+            <w:r>
+              <w:rPr>
+                <w:rFonts w:ascii="Times New Roman" w:cs="Times New Roman" w:eastAsia="Times New Roman" w:hAnsi="Times New Roman"/>
+                <w:b w:val="false"/>
+                <w:bCs w:val="false"/>
+                <w:sz w:val="16"/>
+                <w:szCs w:val="16"/>
+              </w:rPr>
+              <w:t xml:space="preserve">Sparse vegetation</w:t>
+            </w:r>
+          </w:p>
+        </w:tc>
+        <w:tc>
+          <w:tcPr>
+            <w:tcW w:type="dxa" w:w="1750"/>
+            <w:tcBorders>
+              <w:top w:val="none" w:color="FFFFFF" w:sz="0"/>
+              <w:left w:val="none" w:color="FFFFFF" w:sz="0"/>
+              <w:bottom w:val="none" w:color="FFFFFF" w:sz="0"/>
+              <w:right w:val="none" w:color="FFFFFF" w:sz="0"/>
+            </w:tcBorders>
+            <w:tcMar>
+              <w:top w:type="dxa" w:w="40"/>
+              <w:left w:type="dxa" w:w="80"/>
+              <w:bottom w:type="dxa" w:w="40"/>
+              <w:right w:type="dxa" w:w="80"/>
+            </w:tcMar>
+            <w:vAlign w:val="center"/>
+          </w:tcPr>
+          <w:p>
+            <w:pPr>
+              <w:jc w:val="center"/>
+            </w:pPr>
+            <w:r>
+              <w:rPr>
+                <w:rFonts w:ascii="Times New Roman" w:cs="Times New Roman" w:eastAsia="Times New Roman" w:hAnsi="Times New Roman"/>
+                <w:b w:val="false"/>
+                <w:bCs w:val="false"/>
+                <w:sz w:val="16"/>
+                <w:szCs w:val="16"/>
+              </w:rPr>
+              <w:t xml:space="preserve">20,603.4</w:t>
+            </w:r>
+          </w:p>
+        </w:tc>
+        <w:tc>
+          <w:tcPr>
+            <w:tcW w:type="dxa" w:w="1750"/>
+            <w:tcBorders>
+              <w:top w:val="none" w:color="FFFFFF" w:sz="0"/>
+              <w:left w:val="none" w:color="FFFFFF" w:sz="0"/>
+              <w:bottom w:val="none" w:color="FFFFFF" w:sz="0"/>
+              <w:right w:val="none" w:color="FFFFFF" w:sz="0"/>
+            </w:tcBorders>
+            <w:tcMar>
+              <w:top w:type="dxa" w:w="40"/>
+              <w:left w:type="dxa" w:w="80"/>
+              <w:bottom w:type="dxa" w:w="40"/>
+              <w:right w:type="dxa" w:w="80"/>
+            </w:tcMar>
+            <w:vAlign w:val="center"/>
+          </w:tcPr>
+          <w:p>
+            <w:pPr>
+              <w:jc w:val="center"/>
+            </w:pPr>
+            <w:r>
+              <w:rPr>
+                <w:rFonts w:ascii="Times New Roman" w:cs="Times New Roman" w:eastAsia="Times New Roman" w:hAnsi="Times New Roman"/>
+                <w:b w:val="false"/>
+                <w:bCs w:val="false"/>
+                <w:sz w:val="16"/>
+                <w:szCs w:val="16"/>
+              </w:rPr>
+              <w:t xml:space="preserve">20,364.7</w:t>
+            </w:r>
+          </w:p>
+        </w:tc>
+        <w:tc>
+          <w:tcPr>
+            <w:tcW w:type="dxa" w:w="1300"/>
+            <w:tcBorders>
+              <w:top w:val="none" w:color="FFFFFF" w:sz="0"/>
+              <w:left w:val="none" w:color="FFFFFF" w:sz="0"/>
+              <w:bottom w:val="none" w:color="FFFFFF" w:sz="0"/>
+              <w:right w:val="none" w:color="FFFFFF" w:sz="0"/>
+            </w:tcBorders>
+            <w:tcMar>
+              <w:top w:type="dxa" w:w="40"/>
+              <w:left w:type="dxa" w:w="80"/>
+              <w:bottom w:type="dxa" w:w="40"/>
+              <w:right w:type="dxa" w:w="80"/>
+            </w:tcMar>
+            <w:vAlign w:val="center"/>
+          </w:tcPr>
+          <w:p>
+            <w:pPr>
+              <w:jc w:val="center"/>
+            </w:pPr>
+            <w:r>
+              <w:rPr>
+                <w:rFonts w:ascii="Times New Roman" w:cs="Times New Roman" w:eastAsia="Times New Roman" w:hAnsi="Times New Roman"/>
+                <w:b w:val="false"/>
+                <w:bCs w:val="false"/>
+                <w:sz w:val="16"/>
+                <w:szCs w:val="16"/>
+              </w:rPr>
+              <w:t xml:space="preserve">−238.7</w:t>
+            </w:r>
+          </w:p>
+        </w:tc>
+        <w:tc>
+          <w:tcPr>
+            <w:tcW w:type="dxa" w:w="1360"/>
+            <w:tcBorders>
+              <w:top w:val="none" w:color="FFFFFF" w:sz="0"/>
+              <w:left w:val="none" w:color="FFFFFF" w:sz="0"/>
+              <w:bottom w:val="none" w:color="FFFFFF" w:sz="0"/>
+              <w:right w:val="none" w:color="FFFFFF" w:sz="0"/>
+            </w:tcBorders>
+            <w:tcMar>
+              <w:top w:type="dxa" w:w="40"/>
+              <w:left w:type="dxa" w:w="80"/>
+              <w:bottom w:type="dxa" w:w="40"/>
+              <w:right w:type="dxa" w:w="80"/>
+            </w:tcMar>
+            <w:vAlign w:val="center"/>
+          </w:tcPr>
+          <w:p>
+            <w:pPr>
+              <w:jc w:val="center"/>
+            </w:pPr>
+            <w:r>
+              <w:rPr>
+                <w:rFonts w:ascii="Times New Roman" w:cs="Times New Roman" w:eastAsia="Times New Roman" w:hAnsi="Times New Roman"/>
+                <w:b w:val="false"/>
+                <w:bCs w:val="false"/>
+                <w:sz w:val="16"/>
+                <w:szCs w:val="16"/>
+              </w:rPr>
+              <w:t xml:space="preserve">−1.2</w:t>
+            </w:r>
+          </w:p>
+        </w:tc>
+      </w:tr>
+      <w:tr>
+        <w:tc>
+          <w:tcPr>
+            <w:tcW w:type="dxa" w:w="3200"/>
+            <w:tcBorders>
+              <w:top w:val="none" w:color="FFFFFF" w:sz="0"/>
+              <w:left w:val="none" w:color="FFFFFF" w:sz="0"/>
+              <w:bottom w:val="none" w:color="FFFFFF" w:sz="0"/>
+              <w:right w:val="none" w:color="FFFFFF" w:sz="0"/>
+            </w:tcBorders>
+            <w:tcMar>
+              <w:top w:type="dxa" w:w="40"/>
+              <w:left w:type="dxa" w:w="80"/>
+              <w:bottom w:type="dxa" w:w="40"/>
+              <w:right w:type="dxa" w:w="80"/>
+            </w:tcMar>
+            <w:vAlign w:val="center"/>
+          </w:tcPr>
+          <w:p>
+            <w:pPr>
+              <w:jc w:val="left"/>
+            </w:pPr>
+            <w:r>
+              <w:rPr>
+                <w:rFonts w:ascii="Times New Roman" w:cs="Times New Roman" w:eastAsia="Times New Roman" w:hAnsi="Times New Roman"/>
+                <w:b w:val="false"/>
+                <w:bCs w:val="false"/>
+                <w:sz w:val="16"/>
+                <w:szCs w:val="16"/>
+              </w:rPr>
+              <w:t xml:space="preserve">Dense vegetation</w:t>
+            </w:r>
+          </w:p>
+        </w:tc>
+        <w:tc>
+          <w:tcPr>
+            <w:tcW w:type="dxa" w:w="1750"/>
+            <w:tcBorders>
+              <w:top w:val="none" w:color="FFFFFF" w:sz="0"/>
+              <w:left w:val="none" w:color="FFFFFF" w:sz="0"/>
+              <w:bottom w:val="none" w:color="FFFFFF" w:sz="0"/>
+              <w:right w:val="none" w:color="FFFFFF" w:sz="0"/>
+            </w:tcBorders>
+            <w:tcMar>
+              <w:top w:type="dxa" w:w="40"/>
+              <w:left w:type="dxa" w:w="80"/>
+              <w:bottom w:type="dxa" w:w="40"/>
+              <w:right w:type="dxa" w:w="80"/>
+            </w:tcMar>
+            <w:vAlign w:val="center"/>
+          </w:tcPr>
+          <w:p>
+            <w:pPr>
+              <w:jc w:val="center"/>
+            </w:pPr>
+            <w:r>
+              <w:rPr>
+                <w:rFonts w:ascii="Times New Roman" w:cs="Times New Roman" w:eastAsia="Times New Roman" w:hAnsi="Times New Roman"/>
+                <w:b w:val="false"/>
+                <w:bCs w:val="false"/>
+                <w:sz w:val="16"/>
+                <w:szCs w:val="16"/>
+              </w:rPr>
+              <w:t xml:space="preserve">11,542.8</w:t>
+            </w:r>
+          </w:p>
+        </w:tc>
+        <w:tc>
+          <w:tcPr>
+            <w:tcW w:type="dxa" w:w="1750"/>
+            <w:tcBorders>
+              <w:top w:val="none" w:color="FFFFFF" w:sz="0"/>
+              <w:left w:val="none" w:color="FFFFFF" w:sz="0"/>
+              <w:bottom w:val="none" w:color="FFFFFF" w:sz="0"/>
+              <w:right w:val="none" w:color="FFFFFF" w:sz="0"/>
+            </w:tcBorders>
+            <w:tcMar>
+              <w:top w:type="dxa" w:w="40"/>
+              <w:left w:type="dxa" w:w="80"/>
+              <w:bottom w:type="dxa" w:w="40"/>
+              <w:right w:type="dxa" w:w="80"/>
+            </w:tcMar>
+            <w:vAlign w:val="center"/>
+          </w:tcPr>
+          <w:p>
+            <w:pPr>
+              <w:jc w:val="center"/>
+            </w:pPr>
+            <w:r>
+              <w:rPr>
+                <w:rFonts w:ascii="Times New Roman" w:cs="Times New Roman" w:eastAsia="Times New Roman" w:hAnsi="Times New Roman"/>
+                <w:b w:val="false"/>
+                <w:bCs w:val="false"/>
+                <w:sz w:val="16"/>
+                <w:szCs w:val="16"/>
+              </w:rPr>
+              <w:t xml:space="preserve">11,330.8</w:t>
+            </w:r>
+          </w:p>
+        </w:tc>
+        <w:tc>
+          <w:tcPr>
+            <w:tcW w:type="dxa" w:w="1300"/>
+            <w:tcBorders>
+              <w:top w:val="none" w:color="FFFFFF" w:sz="0"/>
+              <w:left w:val="none" w:color="FFFFFF" w:sz="0"/>
+              <w:bottom w:val="none" w:color="FFFFFF" w:sz="0"/>
+              <w:right w:val="none" w:color="FFFFFF" w:sz="0"/>
+            </w:tcBorders>
+            <w:tcMar>
+              <w:top w:type="dxa" w:w="40"/>
+              <w:left w:type="dxa" w:w="80"/>
+              <w:bottom w:type="dxa" w:w="40"/>
+              <w:right w:type="dxa" w:w="80"/>
+            </w:tcMar>
+            <w:vAlign w:val="center"/>
+          </w:tcPr>
+          <w:p>
+            <w:pPr>
+              <w:jc w:val="center"/>
+            </w:pPr>
+            <w:r>
+              <w:rPr>
+                <w:rFonts w:ascii="Times New Roman" w:cs="Times New Roman" w:eastAsia="Times New Roman" w:hAnsi="Times New Roman"/>
+                <w:b w:val="false"/>
+                <w:bCs w:val="false"/>
+                <w:sz w:val="16"/>
+                <w:szCs w:val="16"/>
+              </w:rPr>
+              <w:t xml:space="preserve">−212.0</w:t>
+            </w:r>
+          </w:p>
+        </w:tc>
+        <w:tc>
+          <w:tcPr>
+            <w:tcW w:type="dxa" w:w="1360"/>
+            <w:tcBorders>
+              <w:top w:val="none" w:color="FFFFFF" w:sz="0"/>
+              <w:left w:val="none" w:color="FFFFFF" w:sz="0"/>
+              <w:bottom w:val="none" w:color="FFFFFF" w:sz="0"/>
+              <w:right w:val="none" w:color="FFFFFF" w:sz="0"/>
+            </w:tcBorders>
+            <w:tcMar>
+              <w:top w:type="dxa" w:w="40"/>
+              <w:left w:type="dxa" w:w="80"/>
+              <w:bottom w:type="dxa" w:w="40"/>
+              <w:right w:type="dxa" w:w="80"/>
+            </w:tcMar>
+            <w:vAlign w:val="center"/>
+          </w:tcPr>
+          <w:p>
+            <w:pPr>
+              <w:jc w:val="center"/>
+            </w:pPr>
+            <w:r>
+              <w:rPr>
+                <w:rFonts w:ascii="Times New Roman" w:cs="Times New Roman" w:eastAsia="Times New Roman" w:hAnsi="Times New Roman"/>
+                <w:b w:val="false"/>
+                <w:bCs w:val="false"/>
+                <w:sz w:val="16"/>
+                <w:szCs w:val="16"/>
+              </w:rPr>
+              <w:t xml:space="preserve">−1.8</w:t>
+            </w:r>
+          </w:p>
+        </w:tc>
+      </w:tr>
+    </w:tbl>
+    <w:p>
+      <w:pPr>
+        <w:spacing w:after="120" w:line="252"/>
+        <w:ind w:firstLine="204"/>
+        <w:jc w:val="both"/>
+      </w:pPr>
+      <w:r>
+        <w:rPr>
+          <w:rFonts w:ascii="Times New Roman" w:cs="Times New Roman" w:eastAsia="Times New Roman" w:hAnsi="Times New Roman"/>
+          <w:sz w:val="20"/>
+          <w:szCs w:val="20"/>
+        </w:rPr>
+        <w:t xml:space="preserve">Out-of-sample validation (2019–2021 matrix, capped at 2%/2-year, projected three years to simulate 2024) against the refined actual 2024 classification gave OA = 61.72%, Kappa = 0.3194, and FoM = 25.68% (hits = 632,972, misses = 723,322, false alarms = 1,108,252; reference change 28.35%, simulated change 38.47%) — a lower OA/Kappa than the initial classification's validation (Table 5: 68.29%/0.3819) but a higher FoM (22.24% → 25.68%), consistent with the refined classification producing a map whose change locations, specifically, are somewhat better identified even though its overall class agreement is lower under the new, harder-to-satisfy class definitions.</w:t>
+      </w:r>
+    </w:p>
+    <w:p>
+      <w:pPr>
+        <w:spacing w:after="20" w:before="200"/>
+        <w:jc w:val="left"/>
+      </w:pPr>
+      <w:r>
+        <w:rPr>
+          <w:rFonts w:ascii="Times New Roman" w:cs="Times New Roman" w:eastAsia="Times New Roman" w:hAnsi="Times New Roman"/>
+          <w:sz w:val="16"/>
+          <w:szCs w:val="16"/>
+        </w:rPr>
+        <w:t xml:space="preserve">TABLE 16</w:t>
+      </w:r>
+    </w:p>
+    <w:p>
+      <w:pPr>
+        <w:spacing w:after="100"/>
+        <w:jc w:val="left"/>
+      </w:pPr>
+      <w:r>
+        <w:rPr>
+          <w:rFonts w:ascii="Times New Roman" w:cs="Times New Roman" w:eastAsia="Times New Roman" w:hAnsi="Times New Roman"/>
+          <w:caps/>
+          <w:sz w:val="16"/>
+          <w:szCs w:val="16"/>
+        </w:rPr>
+        <w:t xml:space="preserve">REFINED CA–MARKOV VALIDATION: PRODUCER'S / USER'S ACCURACY</w:t>
+      </w:r>
+    </w:p>
+    <w:tbl>
+      <w:tblPr>
+        <w:tblW w:type="dxa" w:w="9060"/>
+        <w:tblBorders>
+          <w:top w:val="single" w:color="000000" w:sz="8"/>
+          <w:left w:val="none" w:color="FFFFFF" w:sz="0"/>
+          <w:bottom w:val="single" w:color="000000" w:sz="8"/>
+          <w:right w:val="none" w:color="FFFFFF" w:sz="0"/>
+          <w:insideH w:val="none" w:color="FFFFFF" w:sz="0"/>
+          <w:insideV w:val="none" w:color="FFFFFF" w:sz="0"/>
+        </w:tblBorders>
+      </w:tblPr>
+      <w:tblGrid>
+        <w:gridCol w:w="3600"/>
+        <w:gridCol w:w="2730"/>
+        <w:gridCol w:w="2730"/>
+      </w:tblGrid>
+      <w:tr>
+        <w:trPr>
+          <w:tblHeader/>
+        </w:trPr>
+        <w:tc>
+          <w:tcPr>
+            <w:tcW w:type="dxa" w:w="3600"/>
+            <w:tcBorders>
+              <w:top w:val="none" w:color="FFFFFF" w:sz="0"/>
+              <w:left w:val="none" w:color="FFFFFF" w:sz="0"/>
+              <w:bottom w:val="none" w:color="FFFFFF" w:sz="0"/>
+              <w:right w:val="none" w:color="FFFFFF" w:sz="0"/>
+            </w:tcBorders>
+            <w:shd w:fill="D9D9D9" w:val="clear"/>
+            <w:tcMar>
+              <w:top w:type="dxa" w:w="40"/>
+              <w:left w:type="dxa" w:w="80"/>
+              <w:bottom w:type="dxa" w:w="40"/>
+              <w:right w:type="dxa" w:w="80"/>
+            </w:tcMar>
+            <w:vAlign w:val="center"/>
+          </w:tcPr>
+          <w:p>
+            <w:pPr>
+              <w:jc w:val="center"/>
+            </w:pPr>
+            <w:r>
+              <w:rPr>
+                <w:rFonts w:ascii="Times New Roman" w:cs="Times New Roman" w:eastAsia="Times New Roman" w:hAnsi="Times New Roman"/>
+                <w:b/>
+                <w:bCs/>
+                <w:sz w:val="16"/>
+                <w:szCs w:val="16"/>
+              </w:rPr>
+              <w:t xml:space="preserve">Class</w:t>
+            </w:r>
+          </w:p>
+        </w:tc>
+        <w:tc>
+          <w:tcPr>
+            <w:tcW w:type="dxa" w:w="2730"/>
+            <w:tcBorders>
+              <w:top w:val="none" w:color="FFFFFF" w:sz="0"/>
+              <w:left w:val="none" w:color="FFFFFF" w:sz="0"/>
+              <w:bottom w:val="none" w:color="FFFFFF" w:sz="0"/>
+              <w:right w:val="none" w:color="FFFFFF" w:sz="0"/>
+            </w:tcBorders>
+            <w:shd w:fill="D9D9D9" w:val="clear"/>
+            <w:tcMar>
+              <w:top w:type="dxa" w:w="40"/>
+              <w:left w:type="dxa" w:w="80"/>
+              <w:bottom w:type="dxa" w:w="40"/>
+              <w:right w:type="dxa" w:w="80"/>
+            </w:tcMar>
+            <w:vAlign w:val="center"/>
+          </w:tcPr>
+          <w:p>
+            <w:pPr>
+              <w:jc w:val="center"/>
+            </w:pPr>
+            <w:r>
+              <w:rPr>
+                <w:rFonts w:ascii="Times New Roman" w:cs="Times New Roman" w:eastAsia="Times New Roman" w:hAnsi="Times New Roman"/>
+                <w:b/>
+                <w:bCs/>
+                <w:sz w:val="16"/>
+                <w:szCs w:val="16"/>
+              </w:rPr>
+              <w:t xml:space="preserve">PA</w:t>
+            </w:r>
+          </w:p>
+        </w:tc>
+        <w:tc>
+          <w:tcPr>
+            <w:tcW w:type="dxa" w:w="2730"/>
+            <w:tcBorders>
+              <w:top w:val="none" w:color="FFFFFF" w:sz="0"/>
+              <w:left w:val="none" w:color="FFFFFF" w:sz="0"/>
+              <w:bottom w:val="none" w:color="FFFFFF" w:sz="0"/>
+              <w:right w:val="none" w:color="FFFFFF" w:sz="0"/>
+            </w:tcBorders>
+            <w:shd w:fill="D9D9D9" w:val="clear"/>
+            <w:tcMar>
+              <w:top w:type="dxa" w:w="40"/>
+              <w:left w:type="dxa" w:w="80"/>
+              <w:bottom w:type="dxa" w:w="40"/>
+              <w:right w:type="dxa" w:w="80"/>
+            </w:tcMar>
+            <w:vAlign w:val="center"/>
+          </w:tcPr>
+          <w:p>
+            <w:pPr>
+              <w:jc w:val="center"/>
+            </w:pPr>
+            <w:r>
+              <w:rPr>
+                <w:rFonts w:ascii="Times New Roman" w:cs="Times New Roman" w:eastAsia="Times New Roman" w:hAnsi="Times New Roman"/>
+                <w:b/>
+                <w:bCs/>
+                <w:sz w:val="16"/>
+                <w:szCs w:val="16"/>
+              </w:rPr>
+              <w:t xml:space="preserve">UA</w:t>
+            </w:r>
+          </w:p>
+        </w:tc>
+      </w:tr>
+      <w:tr>
+        <w:tc>
+          <w:tcPr>
+            <w:tcW w:type="dxa" w:w="3600"/>
+            <w:tcBorders>
+              <w:top w:val="none" w:color="FFFFFF" w:sz="0"/>
+              <w:left w:val="none" w:color="FFFFFF" w:sz="0"/>
+              <w:bottom w:val="none" w:color="FFFFFF" w:sz="0"/>
+              <w:right w:val="none" w:color="FFFFFF" w:sz="0"/>
+            </w:tcBorders>
+            <w:tcMar>
+              <w:top w:type="dxa" w:w="40"/>
+              <w:left w:type="dxa" w:w="80"/>
+              <w:bottom w:type="dxa" w:w="40"/>
+              <w:right w:type="dxa" w:w="80"/>
+            </w:tcMar>
+            <w:vAlign w:val="center"/>
+          </w:tcPr>
+          <w:p>
+            <w:pPr>
+              <w:jc w:val="left"/>
+            </w:pPr>
+            <w:r>
+              <w:rPr>
+                <w:rFonts w:ascii="Times New Roman" w:cs="Times New Roman" w:eastAsia="Times New Roman" w:hAnsi="Times New Roman"/>
+                <w:b w:val="false"/>
+                <w:bCs w:val="false"/>
+                <w:sz w:val="16"/>
+                <w:szCs w:val="16"/>
+              </w:rPr>
+              <w:t xml:space="preserve">Water</w:t>
+            </w:r>
+          </w:p>
+        </w:tc>
+        <w:tc>
+          <w:tcPr>
+            <w:tcW w:type="dxa" w:w="2730"/>
+            <w:tcBorders>
+              <w:top w:val="none" w:color="FFFFFF" w:sz="0"/>
+              <w:left w:val="none" w:color="FFFFFF" w:sz="0"/>
+              <w:bottom w:val="none" w:color="FFFFFF" w:sz="0"/>
+              <w:right w:val="none" w:color="FFFFFF" w:sz="0"/>
+            </w:tcBorders>
+            <w:tcMar>
+              <w:top w:type="dxa" w:w="40"/>
+              <w:left w:type="dxa" w:w="80"/>
+              <w:bottom w:type="dxa" w:w="40"/>
+              <w:right w:type="dxa" w:w="80"/>
+            </w:tcMar>
+            <w:vAlign w:val="center"/>
+          </w:tcPr>
+          <w:p>
+            <w:pPr>
+              <w:jc w:val="center"/>
+            </w:pPr>
+            <w:r>
+              <w:rPr>
+                <w:rFonts w:ascii="Times New Roman" w:cs="Times New Roman" w:eastAsia="Times New Roman" w:hAnsi="Times New Roman"/>
+                <w:b w:val="false"/>
+                <w:bCs w:val="false"/>
+                <w:sz w:val="16"/>
+                <w:szCs w:val="16"/>
+              </w:rPr>
+              <w:t xml:space="preserve">80.2%</w:t>
+            </w:r>
+          </w:p>
+        </w:tc>
+        <w:tc>
+          <w:tcPr>
+            <w:tcW w:type="dxa" w:w="2730"/>
+            <w:tcBorders>
+              <w:top w:val="none" w:color="FFFFFF" w:sz="0"/>
+              <w:left w:val="none" w:color="FFFFFF" w:sz="0"/>
+              <w:bottom w:val="none" w:color="FFFFFF" w:sz="0"/>
+              <w:right w:val="none" w:color="FFFFFF" w:sz="0"/>
+            </w:tcBorders>
+            <w:tcMar>
+              <w:top w:type="dxa" w:w="40"/>
+              <w:left w:type="dxa" w:w="80"/>
+              <w:bottom w:type="dxa" w:w="40"/>
+              <w:right w:type="dxa" w:w="80"/>
+            </w:tcMar>
+            <w:vAlign w:val="center"/>
+          </w:tcPr>
+          <w:p>
+            <w:pPr>
+              <w:jc w:val="center"/>
+            </w:pPr>
+            <w:r>
+              <w:rPr>
+                <w:rFonts w:ascii="Times New Roman" w:cs="Times New Roman" w:eastAsia="Times New Roman" w:hAnsi="Times New Roman"/>
+                <w:b w:val="false"/>
+                <w:bCs w:val="false"/>
+                <w:sz w:val="16"/>
+                <w:szCs w:val="16"/>
+              </w:rPr>
+              <w:t xml:space="preserve">67.8%</w:t>
+            </w:r>
+          </w:p>
+        </w:tc>
+      </w:tr>
+      <w:tr>
+        <w:tc>
+          <w:tcPr>
+            <w:tcW w:type="dxa" w:w="3600"/>
+            <w:tcBorders>
+              <w:top w:val="none" w:color="FFFFFF" w:sz="0"/>
+              <w:left w:val="none" w:color="FFFFFF" w:sz="0"/>
+              <w:bottom w:val="none" w:color="FFFFFF" w:sz="0"/>
+              <w:right w:val="none" w:color="FFFFFF" w:sz="0"/>
+            </w:tcBorders>
+            <w:tcMar>
+              <w:top w:type="dxa" w:w="40"/>
+              <w:left w:type="dxa" w:w="80"/>
+              <w:bottom w:type="dxa" w:w="40"/>
+              <w:right w:type="dxa" w:w="80"/>
+            </w:tcMar>
+            <w:vAlign w:val="center"/>
+          </w:tcPr>
+          <w:p>
+            <w:pPr>
+              <w:jc w:val="left"/>
+            </w:pPr>
+            <w:r>
+              <w:rPr>
+                <w:rFonts w:ascii="Times New Roman" w:cs="Times New Roman" w:eastAsia="Times New Roman" w:hAnsi="Times New Roman"/>
+                <w:b w:val="false"/>
+                <w:bCs w:val="false"/>
+                <w:sz w:val="16"/>
+                <w:szCs w:val="16"/>
+              </w:rPr>
+              <w:t xml:space="preserve">Non-vegetated</w:t>
+            </w:r>
+          </w:p>
+        </w:tc>
+        <w:tc>
+          <w:tcPr>
+            <w:tcW w:type="dxa" w:w="2730"/>
+            <w:tcBorders>
+              <w:top w:val="none" w:color="FFFFFF" w:sz="0"/>
+              <w:left w:val="none" w:color="FFFFFF" w:sz="0"/>
+              <w:bottom w:val="none" w:color="FFFFFF" w:sz="0"/>
+              <w:right w:val="none" w:color="FFFFFF" w:sz="0"/>
+            </w:tcBorders>
+            <w:tcMar>
+              <w:top w:type="dxa" w:w="40"/>
+              <w:left w:type="dxa" w:w="80"/>
+              <w:bottom w:type="dxa" w:w="40"/>
+              <w:right w:type="dxa" w:w="80"/>
+            </w:tcMar>
+            <w:vAlign w:val="center"/>
+          </w:tcPr>
+          <w:p>
+            <w:pPr>
+              <w:jc w:val="center"/>
+            </w:pPr>
+            <w:r>
+              <w:rPr>
+                <w:rFonts w:ascii="Times New Roman" w:cs="Times New Roman" w:eastAsia="Times New Roman" w:hAnsi="Times New Roman"/>
+                <w:b w:val="false"/>
+                <w:bCs w:val="false"/>
+                <w:sz w:val="16"/>
+                <w:szCs w:val="16"/>
+              </w:rPr>
+              <w:t xml:space="preserve">46.3%</w:t>
+            </w:r>
+          </w:p>
+        </w:tc>
+        <w:tc>
+          <w:tcPr>
+            <w:tcW w:type="dxa" w:w="2730"/>
+            <w:tcBorders>
+              <w:top w:val="none" w:color="FFFFFF" w:sz="0"/>
+              <w:left w:val="none" w:color="FFFFFF" w:sz="0"/>
+              <w:bottom w:val="none" w:color="FFFFFF" w:sz="0"/>
+              <w:right w:val="none" w:color="FFFFFF" w:sz="0"/>
+            </w:tcBorders>
+            <w:tcMar>
+              <w:top w:type="dxa" w:w="40"/>
+              <w:left w:type="dxa" w:w="80"/>
+              <w:bottom w:type="dxa" w:w="40"/>
+              <w:right w:type="dxa" w:w="80"/>
+            </w:tcMar>
+            <w:vAlign w:val="center"/>
+          </w:tcPr>
+          <w:p>
+            <w:pPr>
+              <w:jc w:val="center"/>
+            </w:pPr>
+            <w:r>
+              <w:rPr>
+                <w:rFonts w:ascii="Times New Roman" w:cs="Times New Roman" w:eastAsia="Times New Roman" w:hAnsi="Times New Roman"/>
+                <w:b w:val="false"/>
+                <w:bCs w:val="false"/>
+                <w:sz w:val="16"/>
+                <w:szCs w:val="16"/>
+              </w:rPr>
+              <w:t xml:space="preserve">25.1%</w:t>
+            </w:r>
+          </w:p>
+        </w:tc>
+      </w:tr>
+      <w:tr>
+        <w:tc>
+          <w:tcPr>
+            <w:tcW w:type="dxa" w:w="3600"/>
+            <w:tcBorders>
+              <w:top w:val="none" w:color="FFFFFF" w:sz="0"/>
+              <w:left w:val="none" w:color="FFFFFF" w:sz="0"/>
+              <w:bottom w:val="none" w:color="FFFFFF" w:sz="0"/>
+              <w:right w:val="none" w:color="FFFFFF" w:sz="0"/>
+            </w:tcBorders>
+            <w:tcMar>
+              <w:top w:type="dxa" w:w="40"/>
+              <w:left w:type="dxa" w:w="80"/>
+              <w:bottom w:type="dxa" w:w="40"/>
+              <w:right w:type="dxa" w:w="80"/>
+            </w:tcMar>
+            <w:vAlign w:val="center"/>
+          </w:tcPr>
+          <w:p>
+            <w:pPr>
+              <w:jc w:val="left"/>
+            </w:pPr>
+            <w:r>
+              <w:rPr>
+                <w:rFonts w:ascii="Times New Roman" w:cs="Times New Roman" w:eastAsia="Times New Roman" w:hAnsi="Times New Roman"/>
+                <w:b w:val="false"/>
+                <w:bCs w:val="false"/>
+                <w:sz w:val="16"/>
+                <w:szCs w:val="16"/>
+              </w:rPr>
+              <w:t xml:space="preserve">Sparse vegetation</w:t>
+            </w:r>
+          </w:p>
+        </w:tc>
+        <w:tc>
+          <w:tcPr>
+            <w:tcW w:type="dxa" w:w="2730"/>
+            <w:tcBorders>
+              <w:top w:val="none" w:color="FFFFFF" w:sz="0"/>
+              <w:left w:val="none" w:color="FFFFFF" w:sz="0"/>
+              <w:bottom w:val="none" w:color="FFFFFF" w:sz="0"/>
+              <w:right w:val="none" w:color="FFFFFF" w:sz="0"/>
+            </w:tcBorders>
+            <w:tcMar>
+              <w:top w:type="dxa" w:w="40"/>
+              <w:left w:type="dxa" w:w="80"/>
+              <w:bottom w:type="dxa" w:w="40"/>
+              <w:right w:type="dxa" w:w="80"/>
+            </w:tcMar>
+            <w:vAlign w:val="center"/>
+          </w:tcPr>
+          <w:p>
+            <w:pPr>
+              <w:jc w:val="center"/>
+            </w:pPr>
+            <w:r>
+              <w:rPr>
+                <w:rFonts w:ascii="Times New Roman" w:cs="Times New Roman" w:eastAsia="Times New Roman" w:hAnsi="Times New Roman"/>
+                <w:b w:val="false"/>
+                <w:bCs w:val="false"/>
+                <w:sz w:val="16"/>
+                <w:szCs w:val="16"/>
+              </w:rPr>
+              <w:t xml:space="preserve">72.2%</w:t>
+            </w:r>
+          </w:p>
+        </w:tc>
+        <w:tc>
+          <w:tcPr>
+            <w:tcW w:type="dxa" w:w="2730"/>
+            <w:tcBorders>
+              <w:top w:val="none" w:color="FFFFFF" w:sz="0"/>
+              <w:left w:val="none" w:color="FFFFFF" w:sz="0"/>
+              <w:bottom w:val="none" w:color="FFFFFF" w:sz="0"/>
+              <w:right w:val="none" w:color="FFFFFF" w:sz="0"/>
+            </w:tcBorders>
+            <w:tcMar>
+              <w:top w:type="dxa" w:w="40"/>
+              <w:left w:type="dxa" w:w="80"/>
+              <w:bottom w:type="dxa" w:w="40"/>
+              <w:right w:type="dxa" w:w="80"/>
+            </w:tcMar>
+            <w:vAlign w:val="center"/>
+          </w:tcPr>
+          <w:p>
+            <w:pPr>
+              <w:jc w:val="center"/>
+            </w:pPr>
+            <w:r>
+              <w:rPr>
+                <w:rFonts w:ascii="Times New Roman" w:cs="Times New Roman" w:eastAsia="Times New Roman" w:hAnsi="Times New Roman"/>
+                <w:b w:val="false"/>
+                <w:bCs w:val="false"/>
+                <w:sz w:val="16"/>
+                <w:szCs w:val="16"/>
+              </w:rPr>
+              <w:t xml:space="preserve">69.4%</w:t>
+            </w:r>
+          </w:p>
+        </w:tc>
+      </w:tr>
+      <w:tr>
+        <w:tc>
+          <w:tcPr>
+            <w:tcW w:type="dxa" w:w="3600"/>
+            <w:tcBorders>
+              <w:top w:val="none" w:color="FFFFFF" w:sz="0"/>
+              <w:left w:val="none" w:color="FFFFFF" w:sz="0"/>
+              <w:bottom w:val="none" w:color="FFFFFF" w:sz="0"/>
+              <w:right w:val="none" w:color="FFFFFF" w:sz="0"/>
+            </w:tcBorders>
+            <w:tcMar>
+              <w:top w:type="dxa" w:w="40"/>
+              <w:left w:type="dxa" w:w="80"/>
+              <w:bottom w:type="dxa" w:w="40"/>
+              <w:right w:type="dxa" w:w="80"/>
+            </w:tcMar>
+            <w:vAlign w:val="center"/>
+          </w:tcPr>
+          <w:p>
+            <w:pPr>
+              <w:jc w:val="left"/>
+            </w:pPr>
+            <w:r>
+              <w:rPr>
+                <w:rFonts w:ascii="Times New Roman" w:cs="Times New Roman" w:eastAsia="Times New Roman" w:hAnsi="Times New Roman"/>
+                <w:b w:val="false"/>
+                <w:bCs w:val="false"/>
+                <w:sz w:val="16"/>
+                <w:szCs w:val="16"/>
+              </w:rPr>
+              <w:t xml:space="preserve">Dense vegetation</w:t>
+            </w:r>
+          </w:p>
+        </w:tc>
+        <w:tc>
+          <w:tcPr>
+            <w:tcW w:type="dxa" w:w="2730"/>
+            <w:tcBorders>
+              <w:top w:val="none" w:color="FFFFFF" w:sz="0"/>
+              <w:left w:val="none" w:color="FFFFFF" w:sz="0"/>
+              <w:bottom w:val="none" w:color="FFFFFF" w:sz="0"/>
+              <w:right w:val="none" w:color="FFFFFF" w:sz="0"/>
+            </w:tcBorders>
+            <w:tcMar>
+              <w:top w:type="dxa" w:w="40"/>
+              <w:left w:type="dxa" w:w="80"/>
+              <w:bottom w:type="dxa" w:w="40"/>
+              <w:right w:type="dxa" w:w="80"/>
+            </w:tcMar>
+            <w:vAlign w:val="center"/>
+          </w:tcPr>
+          <w:p>
+            <w:pPr>
+              <w:jc w:val="center"/>
+            </w:pPr>
+            <w:r>
+              <w:rPr>
+                <w:rFonts w:ascii="Times New Roman" w:cs="Times New Roman" w:eastAsia="Times New Roman" w:hAnsi="Times New Roman"/>
+                <w:b w:val="false"/>
+                <w:bCs w:val="false"/>
+                <w:sz w:val="16"/>
+                <w:szCs w:val="16"/>
+              </w:rPr>
+              <w:t xml:space="preserve">44.1%</w:t>
+            </w:r>
+          </w:p>
+        </w:tc>
+        <w:tc>
+          <w:tcPr>
+            <w:tcW w:type="dxa" w:w="2730"/>
+            <w:tcBorders>
+              <w:top w:val="none" w:color="FFFFFF" w:sz="0"/>
+              <w:left w:val="none" w:color="FFFFFF" w:sz="0"/>
+              <w:bottom w:val="none" w:color="FFFFFF" w:sz="0"/>
+              <w:right w:val="none" w:color="FFFFFF" w:sz="0"/>
+            </w:tcBorders>
+            <w:tcMar>
+              <w:top w:type="dxa" w:w="40"/>
+              <w:left w:type="dxa" w:w="80"/>
+              <w:bottom w:type="dxa" w:w="40"/>
+              <w:right w:type="dxa" w:w="80"/>
+            </w:tcMar>
+            <w:vAlign w:val="center"/>
+          </w:tcPr>
+          <w:p>
+            <w:pPr>
+              <w:jc w:val="center"/>
+            </w:pPr>
+            <w:r>
+              <w:rPr>
+                <w:rFonts w:ascii="Times New Roman" w:cs="Times New Roman" w:eastAsia="Times New Roman" w:hAnsi="Times New Roman"/>
+                <w:b w:val="false"/>
+                <w:bCs w:val="false"/>
+                <w:sz w:val="16"/>
+                <w:szCs w:val="16"/>
+              </w:rPr>
+              <w:t xml:space="preserve">59.0%</w:t>
+            </w:r>
+          </w:p>
+        </w:tc>
+      </w:tr>
+    </w:tbl>
+    <w:p>
+      <w:pPr>
+        <w:spacing w:after="120" w:line="252"/>
+        <w:ind w:firstLine="204"/>
+        <w:jc w:val="both"/>
+      </w:pPr>
+      <w:r>
+        <w:rPr>
+          <w:rFonts w:ascii="Times New Roman" w:cs="Times New Roman" w:eastAsia="Times New Roman" w:hAnsi="Times New Roman"/>
+          <w:sz w:val="20"/>
+          <w:szCs w:val="20"/>
+        </w:rPr>
+        <w:t xml:space="preserve">ConvLSTM was retrained on the refined labels with a three-channel input (NDVI, brightness, NDMI — added so the model has access to the same information its own targets depend on) under two class-weighting configurations, five seeds each. Full inverse-frequency weighting reached Non-vegetated Producer's Accuracy of 73.1% (± 1.2%, 5 seeds) but User's Accuracy of only 13% — roughly seven in eight predictions of that class were false positives, a precision collapse from over-aggressive up-weighting. The square-root-dampened configuration, adopted as the primary refined ConvLSTM result, gave a markedly different balance:</w:t>
+      </w:r>
+    </w:p>
+    <w:p>
+      <w:pPr>
+        <w:spacing w:after="20" w:before="200"/>
+        <w:jc w:val="left"/>
+      </w:pPr>
+      <w:r>
+        <w:rPr>
+          <w:rFonts w:ascii="Times New Roman" w:cs="Times New Roman" w:eastAsia="Times New Roman" w:hAnsi="Times New Roman"/>
+          <w:sz w:val="16"/>
+          <w:szCs w:val="16"/>
+        </w:rPr>
+        <w:t xml:space="preserve">TABLE 17</w:t>
+      </w:r>
+    </w:p>
+    <w:p>
+      <w:pPr>
+        <w:spacing w:after="100"/>
+        <w:jc w:val="left"/>
+      </w:pPr>
+      <w:r>
+        <w:rPr>
+          <w:rFonts w:ascii="Times New Roman" w:cs="Times New Roman" w:eastAsia="Times New Roman" w:hAnsi="Times New Roman"/>
+          <w:caps/>
+          <w:sz w:val="16"/>
+          <w:szCs w:val="16"/>
+        </w:rPr>
+        <w:t xml:space="preserve">REFINED CONVLSTM (3-CHANNEL, √-DAMPENED WEIGHTING): 5-SEED POOLED RESULTS</w:t>
+      </w:r>
+    </w:p>
+    <w:tbl>
+      <w:tblPr>
+        <w:tblW w:type="dxa" w:w="9360"/>
+        <w:tblBorders>
+          <w:top w:val="single" w:color="000000" w:sz="8"/>
+          <w:left w:val="none" w:color="FFFFFF" w:sz="0"/>
+          <w:bottom w:val="single" w:color="000000" w:sz="8"/>
+          <w:right w:val="none" w:color="FFFFFF" w:sz="0"/>
+          <w:insideH w:val="none" w:color="FFFFFF" w:sz="0"/>
+          <w:insideV w:val="none" w:color="FFFFFF" w:sz="0"/>
+        </w:tblBorders>
+      </w:tblPr>
+      <w:tblGrid>
+        <w:gridCol w:w="3200"/>
+        <w:gridCol w:w="1750"/>
+        <w:gridCol w:w="1750"/>
+        <w:gridCol w:w="1330"/>
+        <w:gridCol w:w="1330"/>
+      </w:tblGrid>
+      <w:tr>
+        <w:trPr>
+          <w:tblHeader/>
+        </w:trPr>
+        <w:tc>
+          <w:tcPr>
+            <w:tcW w:type="dxa" w:w="3200"/>
+            <w:tcBorders>
+              <w:top w:val="none" w:color="FFFFFF" w:sz="0"/>
+              <w:left w:val="none" w:color="FFFFFF" w:sz="0"/>
+              <w:bottom w:val="none" w:color="FFFFFF" w:sz="0"/>
+              <w:right w:val="none" w:color="FFFFFF" w:sz="0"/>
+            </w:tcBorders>
+            <w:shd w:fill="D9D9D9" w:val="clear"/>
+            <w:tcMar>
+              <w:top w:type="dxa" w:w="40"/>
+              <w:left w:type="dxa" w:w="80"/>
+              <w:bottom w:type="dxa" w:w="40"/>
+              <w:right w:type="dxa" w:w="80"/>
+            </w:tcMar>
+            <w:vAlign w:val="center"/>
+          </w:tcPr>
+          <w:p>
+            <w:pPr>
+              <w:jc w:val="center"/>
+            </w:pPr>
+            <w:r>
+              <w:rPr>
+                <w:rFonts w:ascii="Times New Roman" w:cs="Times New Roman" w:eastAsia="Times New Roman" w:hAnsi="Times New Roman"/>
+                <w:b/>
+                <w:bCs/>
+                <w:sz w:val="16"/>
+                <w:szCs w:val="16"/>
+              </w:rPr>
+              <w:t xml:space="preserve">Class</w:t>
+            </w:r>
+          </w:p>
+        </w:tc>
+        <w:tc>
+          <w:tcPr>
+            <w:tcW w:type="dxa" w:w="1750"/>
+            <w:tcBorders>
+              <w:top w:val="none" w:color="FFFFFF" w:sz="0"/>
+              <w:left w:val="none" w:color="FFFFFF" w:sz="0"/>
+              <w:bottom w:val="none" w:color="FFFFFF" w:sz="0"/>
+              <w:right w:val="none" w:color="FFFFFF" w:sz="0"/>
+            </w:tcBorders>
+            <w:shd w:fill="D9D9D9" w:val="clear"/>
+            <w:tcMar>
+              <w:top w:type="dxa" w:w="40"/>
+              <w:left w:type="dxa" w:w="80"/>
+              <w:bottom w:type="dxa" w:w="40"/>
+              <w:right w:type="dxa" w:w="80"/>
+            </w:tcMar>
+            <w:vAlign w:val="center"/>
+          </w:tcPr>
+          <w:p>
+            <w:pPr>
+              <w:jc w:val="center"/>
+            </w:pPr>
+            <w:r>
+              <w:rPr>
+                <w:rFonts w:ascii="Times New Roman" w:cs="Times New Roman" w:eastAsia="Times New Roman" w:hAnsi="Times New Roman"/>
+                <w:b/>
+                <w:bCs/>
+                <w:sz w:val="16"/>
+                <w:szCs w:val="16"/>
+              </w:rPr>
+              <w:t xml:space="preserve">PA (mean±SD)</w:t>
+            </w:r>
+          </w:p>
+        </w:tc>
+        <w:tc>
+          <w:tcPr>
+            <w:tcW w:type="dxa" w:w="1750"/>
+            <w:tcBorders>
+              <w:top w:val="none" w:color="FFFFFF" w:sz="0"/>
+              <w:left w:val="none" w:color="FFFFFF" w:sz="0"/>
+              <w:bottom w:val="none" w:color="FFFFFF" w:sz="0"/>
+              <w:right w:val="none" w:color="FFFFFF" w:sz="0"/>
+            </w:tcBorders>
+            <w:shd w:fill="D9D9D9" w:val="clear"/>
+            <w:tcMar>
+              <w:top w:type="dxa" w:w="40"/>
+              <w:left w:type="dxa" w:w="80"/>
+              <w:bottom w:type="dxa" w:w="40"/>
+              <w:right w:type="dxa" w:w="80"/>
+            </w:tcMar>
+            <w:vAlign w:val="center"/>
+          </w:tcPr>
+          <w:p>
+            <w:pPr>
+              <w:jc w:val="center"/>
+            </w:pPr>
+            <w:r>
+              <w:rPr>
+                <w:rFonts w:ascii="Times New Roman" w:cs="Times New Roman" w:eastAsia="Times New Roman" w:hAnsi="Times New Roman"/>
+                <w:b/>
+                <w:bCs/>
+                <w:sz w:val="16"/>
+                <w:szCs w:val="16"/>
+              </w:rPr>
+              <w:t xml:space="preserve">UA (pooled)</w:t>
+            </w:r>
+          </w:p>
+        </w:tc>
+        <w:tc>
+          <w:tcPr>
+            <w:tcW w:type="dxa" w:w="1330"/>
+            <w:tcBorders>
+              <w:top w:val="none" w:color="FFFFFF" w:sz="0"/>
+              <w:left w:val="none" w:color="FFFFFF" w:sz="0"/>
+              <w:bottom w:val="none" w:color="FFFFFF" w:sz="0"/>
+              <w:right w:val="none" w:color="FFFFFF" w:sz="0"/>
+            </w:tcBorders>
+            <w:shd w:fill="D9D9D9" w:val="clear"/>
+            <w:tcMar>
+              <w:top w:type="dxa" w:w="40"/>
+              <w:left w:type="dxa" w:w="80"/>
+              <w:bottom w:type="dxa" w:w="40"/>
+              <w:right w:type="dxa" w:w="80"/>
+            </w:tcMar>
+            <w:vAlign w:val="center"/>
+          </w:tcPr>
+          <w:p>
+            <w:pPr>
+              <w:jc w:val="center"/>
+            </w:pPr>
+            <w:r>
+              <w:rPr>
+                <w:rFonts w:ascii="Times New Roman" w:cs="Times New Roman" w:eastAsia="Times New Roman" w:hAnsi="Times New Roman"/>
+                <w:b/>
+                <w:bCs/>
+                <w:sz w:val="16"/>
+                <w:szCs w:val="16"/>
+              </w:rPr>
+              <w:t xml:space="preserve"/>
+            </w:r>
+          </w:p>
+        </w:tc>
+        <w:tc>
+          <w:tcPr>
+            <w:tcW w:type="dxa" w:w="1330"/>
+            <w:tcBorders>
+              <w:top w:val="none" w:color="FFFFFF" w:sz="0"/>
+              <w:left w:val="none" w:color="FFFFFF" w:sz="0"/>
+              <w:bottom w:val="none" w:color="FFFFFF" w:sz="0"/>
+              <w:right w:val="none" w:color="FFFFFF" w:sz="0"/>
+            </w:tcBorders>
+            <w:shd w:fill="D9D9D9" w:val="clear"/>
+            <w:tcMar>
+              <w:top w:type="dxa" w:w="40"/>
+              <w:left w:type="dxa" w:w="80"/>
+              <w:bottom w:type="dxa" w:w="40"/>
+              <w:right w:type="dxa" w:w="80"/>
+            </w:tcMar>
+            <w:vAlign w:val="center"/>
+          </w:tcPr>
+          <w:p>
+            <w:pPr>
+              <w:jc w:val="center"/>
+            </w:pPr>
+            <w:r>
+              <w:rPr>
+                <w:rFonts w:ascii="Times New Roman" w:cs="Times New Roman" w:eastAsia="Times New Roman" w:hAnsi="Times New Roman"/>
+                <w:b/>
+                <w:bCs/>
+                <w:sz w:val="16"/>
+                <w:szCs w:val="16"/>
+              </w:rPr>
+              <w:t xml:space="preserve"/>
+            </w:r>
+          </w:p>
+        </w:tc>
+      </w:tr>
+      <w:tr>
+        <w:tc>
+          <w:tcPr>
+            <w:tcW w:type="dxa" w:w="3200"/>
+            <w:tcBorders>
+              <w:top w:val="none" w:color="FFFFFF" w:sz="0"/>
+              <w:left w:val="none" w:color="FFFFFF" w:sz="0"/>
+              <w:bottom w:val="none" w:color="FFFFFF" w:sz="0"/>
+              <w:right w:val="none" w:color="FFFFFF" w:sz="0"/>
+            </w:tcBorders>
+            <w:tcMar>
+              <w:top w:type="dxa" w:w="40"/>
+              <w:left w:type="dxa" w:w="80"/>
+              <w:bottom w:type="dxa" w:w="40"/>
+              <w:right w:type="dxa" w:w="80"/>
+            </w:tcMar>
+            <w:vAlign w:val="center"/>
+          </w:tcPr>
+          <w:p>
+            <w:pPr>
+              <w:jc w:val="left"/>
+            </w:pPr>
+            <w:r>
+              <w:rPr>
+                <w:rFonts w:ascii="Times New Roman" w:cs="Times New Roman" w:eastAsia="Times New Roman" w:hAnsi="Times New Roman"/>
+                <w:b w:val="false"/>
+                <w:bCs w:val="false"/>
+                <w:sz w:val="16"/>
+                <w:szCs w:val="16"/>
+              </w:rPr>
+              <w:t xml:space="preserve">Water</w:t>
+            </w:r>
+          </w:p>
+        </w:tc>
+        <w:tc>
+          <w:tcPr>
+            <w:tcW w:type="dxa" w:w="1750"/>
+            <w:tcBorders>
+              <w:top w:val="none" w:color="FFFFFF" w:sz="0"/>
+              <w:left w:val="none" w:color="FFFFFF" w:sz="0"/>
+              <w:bottom w:val="none" w:color="FFFFFF" w:sz="0"/>
+              <w:right w:val="none" w:color="FFFFFF" w:sz="0"/>
+            </w:tcBorders>
+            <w:tcMar>
+              <w:top w:type="dxa" w:w="40"/>
+              <w:left w:type="dxa" w:w="80"/>
+              <w:bottom w:type="dxa" w:w="40"/>
+              <w:right w:type="dxa" w:w="80"/>
+            </w:tcMar>
+            <w:vAlign w:val="center"/>
+          </w:tcPr>
+          <w:p>
+            <w:pPr>
+              <w:jc w:val="center"/>
+            </w:pPr>
+            <w:r>
+              <w:rPr>
+                <w:rFonts w:ascii="Times New Roman" w:cs="Times New Roman" w:eastAsia="Times New Roman" w:hAnsi="Times New Roman"/>
+                <w:b w:val="false"/>
+                <w:bCs w:val="false"/>
+                <w:sz w:val="16"/>
+                <w:szCs w:val="16"/>
+              </w:rPr>
+              <w:t xml:space="preserve">85.6±3.1%</w:t>
+            </w:r>
+          </w:p>
+        </w:tc>
+        <w:tc>
+          <w:tcPr>
+            <w:tcW w:type="dxa" w:w="1750"/>
+            <w:tcBorders>
+              <w:top w:val="none" w:color="FFFFFF" w:sz="0"/>
+              <w:left w:val="none" w:color="FFFFFF" w:sz="0"/>
+              <w:bottom w:val="none" w:color="FFFFFF" w:sz="0"/>
+              <w:right w:val="none" w:color="FFFFFF" w:sz="0"/>
+            </w:tcBorders>
+            <w:tcMar>
+              <w:top w:type="dxa" w:w="40"/>
+              <w:left w:type="dxa" w:w="80"/>
+              <w:bottom w:type="dxa" w:w="40"/>
+              <w:right w:type="dxa" w:w="80"/>
+            </w:tcMar>
+            <w:vAlign w:val="center"/>
+          </w:tcPr>
+          <w:p>
+            <w:pPr>
+              <w:jc w:val="center"/>
+            </w:pPr>
+            <w:r>
+              <w:rPr>
+                <w:rFonts w:ascii="Times New Roman" w:cs="Times New Roman" w:eastAsia="Times New Roman" w:hAnsi="Times New Roman"/>
+                <w:b w:val="false"/>
+                <w:bCs w:val="false"/>
+                <w:sz w:val="16"/>
+                <w:szCs w:val="16"/>
+              </w:rPr>
+              <w:t xml:space="preserve">78.3%</w:t>
+            </w:r>
+          </w:p>
+        </w:tc>
+        <w:tc>
+          <w:tcPr>
+            <w:tcW w:type="dxa" w:w="1330"/>
+            <w:tcBorders>
+              <w:top w:val="none" w:color="FFFFFF" w:sz="0"/>
+              <w:left w:val="none" w:color="FFFFFF" w:sz="0"/>
+              <w:bottom w:val="none" w:color="FFFFFF" w:sz="0"/>
+              <w:right w:val="none" w:color="FFFFFF" w:sz="0"/>
+            </w:tcBorders>
+            <w:tcMar>
+              <w:top w:type="dxa" w:w="40"/>
+              <w:left w:type="dxa" w:w="80"/>
+              <w:bottom w:type="dxa" w:w="40"/>
+              <w:right w:type="dxa" w:w="80"/>
+            </w:tcMar>
+            <w:vAlign w:val="center"/>
+          </w:tcPr>
+          <w:p>
+            <w:pPr>
+              <w:jc w:val="center"/>
+            </w:pPr>
+            <w:r>
+              <w:rPr>
+                <w:rFonts w:ascii="Times New Roman" w:cs="Times New Roman" w:eastAsia="Times New Roman" w:hAnsi="Times New Roman"/>
+                <w:b w:val="false"/>
+                <w:bCs w:val="false"/>
+                <w:sz w:val="16"/>
+                <w:szCs w:val="16"/>
+              </w:rPr>
+              <w:t xml:space="preserve"/>
+            </w:r>
+          </w:p>
+        </w:tc>
+        <w:tc>
+          <w:tcPr>
+            <w:tcW w:type="dxa" w:w="1330"/>
+            <w:tcBorders>
+              <w:top w:val="none" w:color="FFFFFF" w:sz="0"/>
+              <w:left w:val="none" w:color="FFFFFF" w:sz="0"/>
+              <w:bottom w:val="none" w:color="FFFFFF" w:sz="0"/>
+              <w:right w:val="none" w:color="FFFFFF" w:sz="0"/>
+            </w:tcBorders>
+            <w:tcMar>
+              <w:top w:type="dxa" w:w="40"/>
+              <w:left w:type="dxa" w:w="80"/>
+              <w:bottom w:type="dxa" w:w="40"/>
+              <w:right w:type="dxa" w:w="80"/>
+            </w:tcMar>
+            <w:vAlign w:val="center"/>
+          </w:tcPr>
+          <w:p>
+            <w:pPr>
+              <w:jc w:val="center"/>
+            </w:pPr>
+            <w:r>
+              <w:rPr>
+                <w:rFonts w:ascii="Times New Roman" w:cs="Times New Roman" w:eastAsia="Times New Roman" w:hAnsi="Times New Roman"/>
+                <w:b w:val="false"/>
+                <w:bCs w:val="false"/>
+                <w:sz w:val="16"/>
+                <w:szCs w:val="16"/>
+              </w:rPr>
+              <w:t xml:space="preserve"/>
+            </w:r>
+          </w:p>
+        </w:tc>
+      </w:tr>
+      <w:tr>
+        <w:tc>
+          <w:tcPr>
+            <w:tcW w:type="dxa" w:w="3200"/>
+            <w:tcBorders>
+              <w:top w:val="none" w:color="FFFFFF" w:sz="0"/>
+              <w:left w:val="none" w:color="FFFFFF" w:sz="0"/>
+              <w:bottom w:val="none" w:color="FFFFFF" w:sz="0"/>
+              <w:right w:val="none" w:color="FFFFFF" w:sz="0"/>
+            </w:tcBorders>
+            <w:tcMar>
+              <w:top w:type="dxa" w:w="40"/>
+              <w:left w:type="dxa" w:w="80"/>
+              <w:bottom w:type="dxa" w:w="40"/>
+              <w:right w:type="dxa" w:w="80"/>
+            </w:tcMar>
+            <w:vAlign w:val="center"/>
+          </w:tcPr>
+          <w:p>
+            <w:pPr>
+              <w:jc w:val="left"/>
+            </w:pPr>
+            <w:r>
+              <w:rPr>
+                <w:rFonts w:ascii="Times New Roman" w:cs="Times New Roman" w:eastAsia="Times New Roman" w:hAnsi="Times New Roman"/>
+                <w:b w:val="false"/>
+                <w:bCs w:val="false"/>
+                <w:sz w:val="16"/>
+                <w:szCs w:val="16"/>
+              </w:rPr>
+              <w:t xml:space="preserve">Non-vegetated</w:t>
+            </w:r>
+          </w:p>
+        </w:tc>
+        <w:tc>
+          <w:tcPr>
+            <w:tcW w:type="dxa" w:w="1750"/>
+            <w:tcBorders>
+              <w:top w:val="none" w:color="FFFFFF" w:sz="0"/>
+              <w:left w:val="none" w:color="FFFFFF" w:sz="0"/>
+              <w:bottom w:val="none" w:color="FFFFFF" w:sz="0"/>
+              <w:right w:val="none" w:color="FFFFFF" w:sz="0"/>
+            </w:tcBorders>
+            <w:tcMar>
+              <w:top w:type="dxa" w:w="40"/>
+              <w:left w:type="dxa" w:w="80"/>
+              <w:bottom w:type="dxa" w:w="40"/>
+              <w:right w:type="dxa" w:w="80"/>
+            </w:tcMar>
+            <w:vAlign w:val="center"/>
+          </w:tcPr>
+          <w:p>
+            <w:pPr>
+              <w:jc w:val="center"/>
+            </w:pPr>
+            <w:r>
+              <w:rPr>
+                <w:rFonts w:ascii="Times New Roman" w:cs="Times New Roman" w:eastAsia="Times New Roman" w:hAnsi="Times New Roman"/>
+                <w:b w:val="false"/>
+                <w:bCs w:val="false"/>
+                <w:sz w:val="16"/>
+                <w:szCs w:val="16"/>
+              </w:rPr>
+              <w:t xml:space="preserve">34.4±11.0%</w:t>
+            </w:r>
+          </w:p>
+        </w:tc>
+        <w:tc>
+          <w:tcPr>
+            <w:tcW w:type="dxa" w:w="1750"/>
+            <w:tcBorders>
+              <w:top w:val="none" w:color="FFFFFF" w:sz="0"/>
+              <w:left w:val="none" w:color="FFFFFF" w:sz="0"/>
+              <w:bottom w:val="none" w:color="FFFFFF" w:sz="0"/>
+              <w:right w:val="none" w:color="FFFFFF" w:sz="0"/>
+            </w:tcBorders>
+            <w:tcMar>
+              <w:top w:type="dxa" w:w="40"/>
+              <w:left w:type="dxa" w:w="80"/>
+              <w:bottom w:type="dxa" w:w="40"/>
+              <w:right w:type="dxa" w:w="80"/>
+            </w:tcMar>
+            <w:vAlign w:val="center"/>
+          </w:tcPr>
+          <w:p>
+            <w:pPr>
+              <w:jc w:val="center"/>
+            </w:pPr>
+            <w:r>
+              <w:rPr>
+                <w:rFonts w:ascii="Times New Roman" w:cs="Times New Roman" w:eastAsia="Times New Roman" w:hAnsi="Times New Roman"/>
+                <w:b w:val="false"/>
+                <w:bCs w:val="false"/>
+                <w:sz w:val="16"/>
+                <w:szCs w:val="16"/>
+              </w:rPr>
+              <w:t xml:space="preserve">25.9%</w:t>
+            </w:r>
+          </w:p>
+        </w:tc>
+        <w:tc>
+          <w:tcPr>
+            <w:tcW w:type="dxa" w:w="1330"/>
+            <w:tcBorders>
+              <w:top w:val="none" w:color="FFFFFF" w:sz="0"/>
+              <w:left w:val="none" w:color="FFFFFF" w:sz="0"/>
+              <w:bottom w:val="none" w:color="FFFFFF" w:sz="0"/>
+              <w:right w:val="none" w:color="FFFFFF" w:sz="0"/>
+            </w:tcBorders>
+            <w:tcMar>
+              <w:top w:type="dxa" w:w="40"/>
+              <w:left w:type="dxa" w:w="80"/>
+              <w:bottom w:type="dxa" w:w="40"/>
+              <w:right w:type="dxa" w:w="80"/>
+            </w:tcMar>
+            <w:vAlign w:val="center"/>
+          </w:tcPr>
+          <w:p>
+            <w:pPr>
+              <w:jc w:val="center"/>
+            </w:pPr>
+            <w:r>
+              <w:rPr>
+                <w:rFonts w:ascii="Times New Roman" w:cs="Times New Roman" w:eastAsia="Times New Roman" w:hAnsi="Times New Roman"/>
+                <w:b w:val="false"/>
+                <w:bCs w:val="false"/>
+                <w:sz w:val="16"/>
+                <w:szCs w:val="16"/>
+              </w:rPr>
+              <w:t xml:space="preserve"/>
+            </w:r>
+          </w:p>
+        </w:tc>
+        <w:tc>
+          <w:tcPr>
+            <w:tcW w:type="dxa" w:w="1330"/>
+            <w:tcBorders>
+              <w:top w:val="none" w:color="FFFFFF" w:sz="0"/>
+              <w:left w:val="none" w:color="FFFFFF" w:sz="0"/>
+              <w:bottom w:val="none" w:color="FFFFFF" w:sz="0"/>
+              <w:right w:val="none" w:color="FFFFFF" w:sz="0"/>
+            </w:tcBorders>
+            <w:tcMar>
+              <w:top w:type="dxa" w:w="40"/>
+              <w:left w:type="dxa" w:w="80"/>
+              <w:bottom w:type="dxa" w:w="40"/>
+              <w:right w:type="dxa" w:w="80"/>
+            </w:tcMar>
+            <w:vAlign w:val="center"/>
+          </w:tcPr>
+          <w:p>
+            <w:pPr>
+              <w:jc w:val="center"/>
+            </w:pPr>
+            <w:r>
+              <w:rPr>
+                <w:rFonts w:ascii="Times New Roman" w:cs="Times New Roman" w:eastAsia="Times New Roman" w:hAnsi="Times New Roman"/>
+                <w:b w:val="false"/>
+                <w:bCs w:val="false"/>
+                <w:sz w:val="16"/>
+                <w:szCs w:val="16"/>
+              </w:rPr>
+              <w:t xml:space="preserve"/>
+            </w:r>
+          </w:p>
+        </w:tc>
+      </w:tr>
+      <w:tr>
+        <w:tc>
+          <w:tcPr>
+            <w:tcW w:type="dxa" w:w="3200"/>
+            <w:tcBorders>
+              <w:top w:val="none" w:color="FFFFFF" w:sz="0"/>
+              <w:left w:val="none" w:color="FFFFFF" w:sz="0"/>
+              <w:bottom w:val="none" w:color="FFFFFF" w:sz="0"/>
+              <w:right w:val="none" w:color="FFFFFF" w:sz="0"/>
+            </w:tcBorders>
+            <w:tcMar>
+              <w:top w:type="dxa" w:w="40"/>
+              <w:left w:type="dxa" w:w="80"/>
+              <w:bottom w:type="dxa" w:w="40"/>
+              <w:right w:type="dxa" w:w="80"/>
+            </w:tcMar>
+            <w:vAlign w:val="center"/>
+          </w:tcPr>
+          <w:p>
+            <w:pPr>
+              <w:jc w:val="left"/>
+            </w:pPr>
+            <w:r>
+              <w:rPr>
+                <w:rFonts w:ascii="Times New Roman" w:cs="Times New Roman" w:eastAsia="Times New Roman" w:hAnsi="Times New Roman"/>
+                <w:b w:val="false"/>
+                <w:bCs w:val="false"/>
+                <w:sz w:val="16"/>
+                <w:szCs w:val="16"/>
+              </w:rPr>
+              <w:t xml:space="preserve">Sparse vegetation</w:t>
+            </w:r>
+          </w:p>
+        </w:tc>
+        <w:tc>
+          <w:tcPr>
+            <w:tcW w:type="dxa" w:w="1750"/>
+            <w:tcBorders>
+              <w:top w:val="none" w:color="FFFFFF" w:sz="0"/>
+              <w:left w:val="none" w:color="FFFFFF" w:sz="0"/>
+              <w:bottom w:val="none" w:color="FFFFFF" w:sz="0"/>
+              <w:right w:val="none" w:color="FFFFFF" w:sz="0"/>
+            </w:tcBorders>
+            <w:tcMar>
+              <w:top w:type="dxa" w:w="40"/>
+              <w:left w:type="dxa" w:w="80"/>
+              <w:bottom w:type="dxa" w:w="40"/>
+              <w:right w:type="dxa" w:w="80"/>
+            </w:tcMar>
+            <w:vAlign w:val="center"/>
+          </w:tcPr>
+          <w:p>
+            <w:pPr>
+              <w:jc w:val="center"/>
+            </w:pPr>
+            <w:r>
+              <w:rPr>
+                <w:rFonts w:ascii="Times New Roman" w:cs="Times New Roman" w:eastAsia="Times New Roman" w:hAnsi="Times New Roman"/>
+                <w:b w:val="false"/>
+                <w:bCs w:val="false"/>
+                <w:sz w:val="16"/>
+                <w:szCs w:val="16"/>
+              </w:rPr>
+              <w:t xml:space="preserve">73.0±0.7%</w:t>
+            </w:r>
+          </w:p>
+        </w:tc>
+        <w:tc>
+          <w:tcPr>
+            <w:tcW w:type="dxa" w:w="1750"/>
+            <w:tcBorders>
+              <w:top w:val="none" w:color="FFFFFF" w:sz="0"/>
+              <w:left w:val="none" w:color="FFFFFF" w:sz="0"/>
+              <w:bottom w:val="none" w:color="FFFFFF" w:sz="0"/>
+              <w:right w:val="none" w:color="FFFFFF" w:sz="0"/>
+            </w:tcBorders>
+            <w:tcMar>
+              <w:top w:type="dxa" w:w="40"/>
+              <w:left w:type="dxa" w:w="80"/>
+              <w:bottom w:type="dxa" w:w="40"/>
+              <w:right w:type="dxa" w:w="80"/>
+            </w:tcMar>
+            <w:vAlign w:val="center"/>
+          </w:tcPr>
+          <w:p>
+            <w:pPr>
+              <w:jc w:val="center"/>
+            </w:pPr>
+            <w:r>
+              <w:rPr>
+                <w:rFonts w:ascii="Times New Roman" w:cs="Times New Roman" w:eastAsia="Times New Roman" w:hAnsi="Times New Roman"/>
+                <w:b w:val="false"/>
+                <w:bCs w:val="false"/>
+                <w:sz w:val="16"/>
+                <w:szCs w:val="16"/>
+              </w:rPr>
+              <w:t xml:space="preserve">88.8%</w:t>
+            </w:r>
+          </w:p>
+        </w:tc>
+        <w:tc>
+          <w:tcPr>
+            <w:tcW w:type="dxa" w:w="1330"/>
+            <w:tcBorders>
+              <w:top w:val="none" w:color="FFFFFF" w:sz="0"/>
+              <w:left w:val="none" w:color="FFFFFF" w:sz="0"/>
+              <w:bottom w:val="none" w:color="FFFFFF" w:sz="0"/>
+              <w:right w:val="none" w:color="FFFFFF" w:sz="0"/>
+            </w:tcBorders>
+            <w:tcMar>
+              <w:top w:type="dxa" w:w="40"/>
+              <w:left w:type="dxa" w:w="80"/>
+              <w:bottom w:type="dxa" w:w="40"/>
+              <w:right w:type="dxa" w:w="80"/>
+            </w:tcMar>
+            <w:vAlign w:val="center"/>
+          </w:tcPr>
+          <w:p>
+            <w:pPr>
+              <w:jc w:val="center"/>
+            </w:pPr>
+            <w:r>
+              <w:rPr>
+                <w:rFonts w:ascii="Times New Roman" w:cs="Times New Roman" w:eastAsia="Times New Roman" w:hAnsi="Times New Roman"/>
+                <w:b w:val="false"/>
+                <w:bCs w:val="false"/>
+                <w:sz w:val="16"/>
+                <w:szCs w:val="16"/>
+              </w:rPr>
+              <w:t xml:space="preserve"/>
+            </w:r>
+          </w:p>
+        </w:tc>
+        <w:tc>
+          <w:tcPr>
+            <w:tcW w:type="dxa" w:w="1330"/>
+            <w:tcBorders>
+              <w:top w:val="none" w:color="FFFFFF" w:sz="0"/>
+              <w:left w:val="none" w:color="FFFFFF" w:sz="0"/>
+              <w:bottom w:val="none" w:color="FFFFFF" w:sz="0"/>
+              <w:right w:val="none" w:color="FFFFFF" w:sz="0"/>
+            </w:tcBorders>
+            <w:tcMar>
+              <w:top w:type="dxa" w:w="40"/>
+              <w:left w:type="dxa" w:w="80"/>
+              <w:bottom w:type="dxa" w:w="40"/>
+              <w:right w:type="dxa" w:w="80"/>
+            </w:tcMar>
+            <w:vAlign w:val="center"/>
+          </w:tcPr>
+          <w:p>
+            <w:pPr>
+              <w:jc w:val="center"/>
+            </w:pPr>
+            <w:r>
+              <w:rPr>
+                <w:rFonts w:ascii="Times New Roman" w:cs="Times New Roman" w:eastAsia="Times New Roman" w:hAnsi="Times New Roman"/>
+                <w:b w:val="false"/>
+                <w:bCs w:val="false"/>
+                <w:sz w:val="16"/>
+                <w:szCs w:val="16"/>
+              </w:rPr>
+              <w:t xml:space="preserve"/>
+            </w:r>
+          </w:p>
+        </w:tc>
+      </w:tr>
+      <w:tr>
+        <w:tc>
+          <w:tcPr>
+            <w:tcW w:type="dxa" w:w="3200"/>
+            <w:tcBorders>
+              <w:top w:val="none" w:color="FFFFFF" w:sz="0"/>
+              <w:left w:val="none" w:color="FFFFFF" w:sz="0"/>
+              <w:bottom w:val="none" w:color="FFFFFF" w:sz="0"/>
+              <w:right w:val="none" w:color="FFFFFF" w:sz="0"/>
+            </w:tcBorders>
+            <w:tcMar>
+              <w:top w:type="dxa" w:w="40"/>
+              <w:left w:type="dxa" w:w="80"/>
+              <w:bottom w:type="dxa" w:w="40"/>
+              <w:right w:type="dxa" w:w="80"/>
+            </w:tcMar>
+            <w:vAlign w:val="center"/>
+          </w:tcPr>
+          <w:p>
+            <w:pPr>
+              <w:jc w:val="left"/>
+            </w:pPr>
+            <w:r>
+              <w:rPr>
+                <w:rFonts w:ascii="Times New Roman" w:cs="Times New Roman" w:eastAsia="Times New Roman" w:hAnsi="Times New Roman"/>
+                <w:b w:val="false"/>
+                <w:bCs w:val="false"/>
+                <w:sz w:val="16"/>
+                <w:szCs w:val="16"/>
+              </w:rPr>
+              <w:t xml:space="preserve">Dense vegetation</w:t>
+            </w:r>
+          </w:p>
+        </w:tc>
+        <w:tc>
+          <w:tcPr>
+            <w:tcW w:type="dxa" w:w="1750"/>
+            <w:tcBorders>
+              <w:top w:val="none" w:color="FFFFFF" w:sz="0"/>
+              <w:left w:val="none" w:color="FFFFFF" w:sz="0"/>
+              <w:bottom w:val="none" w:color="FFFFFF" w:sz="0"/>
+              <w:right w:val="none" w:color="FFFFFF" w:sz="0"/>
+            </w:tcBorders>
+            <w:tcMar>
+              <w:top w:type="dxa" w:w="40"/>
+              <w:left w:type="dxa" w:w="80"/>
+              <w:bottom w:type="dxa" w:w="40"/>
+              <w:right w:type="dxa" w:w="80"/>
+            </w:tcMar>
+            <w:vAlign w:val="center"/>
+          </w:tcPr>
+          <w:p>
+            <w:pPr>
+              <w:jc w:val="center"/>
+            </w:pPr>
+            <w:r>
+              <w:rPr>
+                <w:rFonts w:ascii="Times New Roman" w:cs="Times New Roman" w:eastAsia="Times New Roman" w:hAnsi="Times New Roman"/>
+                <w:b w:val="false"/>
+                <w:bCs w:val="false"/>
+                <w:sz w:val="16"/>
+                <w:szCs w:val="16"/>
+              </w:rPr>
+              <w:t xml:space="preserve">76.5±1.2%</w:t>
+            </w:r>
+          </w:p>
+        </w:tc>
+        <w:tc>
+          <w:tcPr>
+            <w:tcW w:type="dxa" w:w="1750"/>
+            <w:tcBorders>
+              <w:top w:val="none" w:color="FFFFFF" w:sz="0"/>
+              <w:left w:val="none" w:color="FFFFFF" w:sz="0"/>
+              <w:bottom w:val="none" w:color="FFFFFF" w:sz="0"/>
+              <w:right w:val="none" w:color="FFFFFF" w:sz="0"/>
+            </w:tcBorders>
+            <w:tcMar>
+              <w:top w:type="dxa" w:w="40"/>
+              <w:left w:type="dxa" w:w="80"/>
+              <w:bottom w:type="dxa" w:w="40"/>
+              <w:right w:type="dxa" w:w="80"/>
+            </w:tcMar>
+            <w:vAlign w:val="center"/>
+          </w:tcPr>
+          <w:p>
+            <w:pPr>
+              <w:jc w:val="center"/>
+            </w:pPr>
+            <w:r>
+              <w:rPr>
+                <w:rFonts w:ascii="Times New Roman" w:cs="Times New Roman" w:eastAsia="Times New Roman" w:hAnsi="Times New Roman"/>
+                <w:b w:val="false"/>
+                <w:bCs w:val="false"/>
+                <w:sz w:val="16"/>
+                <w:szCs w:val="16"/>
+              </w:rPr>
+              <w:t xml:space="preserve">49.9%</w:t>
+            </w:r>
+          </w:p>
+        </w:tc>
+        <w:tc>
+          <w:tcPr>
+            <w:tcW w:type="dxa" w:w="1330"/>
+            <w:tcBorders>
+              <w:top w:val="none" w:color="FFFFFF" w:sz="0"/>
+              <w:left w:val="none" w:color="FFFFFF" w:sz="0"/>
+              <w:bottom w:val="none" w:color="FFFFFF" w:sz="0"/>
+              <w:right w:val="none" w:color="FFFFFF" w:sz="0"/>
+            </w:tcBorders>
+            <w:tcMar>
+              <w:top w:type="dxa" w:w="40"/>
+              <w:left w:type="dxa" w:w="80"/>
+              <w:bottom w:type="dxa" w:w="40"/>
+              <w:right w:type="dxa" w:w="80"/>
+            </w:tcMar>
+            <w:vAlign w:val="center"/>
+          </w:tcPr>
+          <w:p>
+            <w:pPr>
+              <w:jc w:val="center"/>
+            </w:pPr>
+            <w:r>
+              <w:rPr>
+                <w:rFonts w:ascii="Times New Roman" w:cs="Times New Roman" w:eastAsia="Times New Roman" w:hAnsi="Times New Roman"/>
+                <w:b w:val="false"/>
+                <w:bCs w:val="false"/>
+                <w:sz w:val="16"/>
+                <w:szCs w:val="16"/>
+              </w:rPr>
+              <w:t xml:space="preserve"/>
+            </w:r>
+          </w:p>
+        </w:tc>
+        <w:tc>
+          <w:tcPr>
+            <w:tcW w:type="dxa" w:w="1330"/>
+            <w:tcBorders>
+              <w:top w:val="none" w:color="FFFFFF" w:sz="0"/>
+              <w:left w:val="none" w:color="FFFFFF" w:sz="0"/>
+              <w:bottom w:val="none" w:color="FFFFFF" w:sz="0"/>
+              <w:right w:val="none" w:color="FFFFFF" w:sz="0"/>
+            </w:tcBorders>
+            <w:tcMar>
+              <w:top w:type="dxa" w:w="40"/>
+              <w:left w:type="dxa" w:w="80"/>
+              <w:bottom w:type="dxa" w:w="40"/>
+              <w:right w:type="dxa" w:w="80"/>
+            </w:tcMar>
+            <w:vAlign w:val="center"/>
+          </w:tcPr>
+          <w:p>
+            <w:pPr>
+              <w:jc w:val="center"/>
+            </w:pPr>
+            <w:r>
+              <w:rPr>
+                <w:rFonts w:ascii="Times New Roman" w:cs="Times New Roman" w:eastAsia="Times New Roman" w:hAnsi="Times New Roman"/>
+                <w:b w:val="false"/>
+                <w:bCs w:val="false"/>
+                <w:sz w:val="16"/>
+                <w:szCs w:val="16"/>
+              </w:rPr>
+              <w:t xml:space="preserve"/>
+            </w:r>
+          </w:p>
+        </w:tc>
+      </w:tr>
+    </w:tbl>
+    <w:p>
+      <w:pPr>
+        <w:spacing w:after="120" w:line="252"/>
+        <w:ind w:firstLine="204"/>
+        <w:jc w:val="both"/>
+      </w:pPr>
+      <w:r>
+        <w:rPr>
+          <w:rFonts w:ascii="Times New Roman" w:cs="Times New Roman" w:eastAsia="Times New Roman" w:hAnsi="Times New Roman"/>
+          <w:sz w:val="20"/>
+          <w:szCs w:val="20"/>
+        </w:rPr>
+        <w:t xml:space="preserve">Pooled across all five seeds' held-out 2024 test pixels (n = 228,195), OA = 72.73% and Kappa = 0.4509 — both higher than the refined CA–Markov's validation figures — but Non-vegetated recall is unstable across seeds (range 12.9–42.4%, one seed effectively collapsing) and its precision remains weak (UA = 25.9%). Neither weighting configuration therefore yields a Non-vegetated detector that is simultaneously accurate, precise, and stable.</w:t>
+      </w:r>
+    </w:p>
+    <w:p>
+      <w:pPr>
+        <w:spacing w:after="120" w:line="252"/>
+        <w:ind w:firstLine="204"/>
+        <w:jc w:val="both"/>
+      </w:pPr>
+      <w:r>
+        <w:rPr>
+          <w:rFonts w:ascii="Times New Roman" w:cs="Times New Roman" w:eastAsia="Times New Roman" w:hAnsi="Times New Roman"/>
+          <w:sz w:val="20"/>
+          <w:szCs w:val="20"/>
+        </w:rPr>
+        <w:t xml:space="preserve">This instability propagates directly into the 2025 forecasts. The full-weight configuration projected Non-vegetated land at 8,420.6 km² (± 706.6 km², 5 seeds) — a nearly four-fold increase from the 2024 baseline in a single year, driven by its false-positive rate rather than genuine signal. The √-dampened configuration projected 1,580.0 km² (± 550.3 km²) — a decline from 2024, with one seed alone (542.5 km²) pulling the mean down, reflecting the same recall instability seen in Table 17. Table 18 compares the refined CA–Markov projection against the √-dampened refined ConvLSTM, the configuration retained for final comparison:</w:t>
+      </w:r>
+    </w:p>
+    <w:p>
+      <w:pPr>
+        <w:spacing w:after="20" w:before="200"/>
+        <w:jc w:val="left"/>
+      </w:pPr>
+      <w:r>
+        <w:rPr>
+          <w:rFonts w:ascii="Times New Roman" w:cs="Times New Roman" w:eastAsia="Times New Roman" w:hAnsi="Times New Roman"/>
+          <w:sz w:val="16"/>
+          <w:szCs w:val="16"/>
+        </w:rPr>
+        <w:t xml:space="preserve">TABLE 18</w:t>
+      </w:r>
+    </w:p>
+    <w:p>
+      <w:pPr>
+        <w:spacing w:after="100"/>
+        <w:jc w:val="left"/>
+      </w:pPr>
+      <w:r>
+        <w:rPr>
+          <w:rFonts w:ascii="Times New Roman" w:cs="Times New Roman" w:eastAsia="Times New Roman" w:hAnsi="Times New Roman"/>
+          <w:caps/>
+          <w:sz w:val="16"/>
+          <w:szCs w:val="16"/>
+        </w:rPr>
+        <w:t xml:space="preserve">REFINED CA–MARKOV VS. REFINED CONVLSTM (√-DAMPENED): PROJECTED 2025 LAND COVER</w:t>
+      </w:r>
+    </w:p>
+    <w:tbl>
+      <w:tblPr>
+        <w:tblW w:type="dxa" w:w="9360"/>
+        <w:tblBorders>
+          <w:top w:val="single" w:color="000000" w:sz="8"/>
+          <w:left w:val="none" w:color="FFFFFF" w:sz="0"/>
+          <w:bottom w:val="single" w:color="000000" w:sz="8"/>
+          <w:right w:val="none" w:color="FFFFFF" w:sz="0"/>
+          <w:insideH w:val="none" w:color="FFFFFF" w:sz="0"/>
+          <w:insideV w:val="none" w:color="FFFFFF" w:sz="0"/>
+        </w:tblBorders>
+      </w:tblPr>
+      <w:tblGrid>
+        <w:gridCol w:w="2700"/>
+        <w:gridCol w:w="2100"/>
+        <w:gridCol w:w="2400"/>
+        <w:gridCol w:w="2160"/>
+      </w:tblGrid>
+      <w:tr>
+        <w:trPr>
+          <w:tblHeader/>
+        </w:trPr>
+        <w:tc>
+          <w:tcPr>
+            <w:tcW w:type="dxa" w:w="2700"/>
+            <w:tcBorders>
+              <w:top w:val="none" w:color="FFFFFF" w:sz="0"/>
+              <w:left w:val="none" w:color="FFFFFF" w:sz="0"/>
+              <w:bottom w:val="none" w:color="FFFFFF" w:sz="0"/>
+              <w:right w:val="none" w:color="FFFFFF" w:sz="0"/>
+            </w:tcBorders>
+            <w:shd w:fill="D9D9D9" w:val="clear"/>
+            <w:tcMar>
+              <w:top w:type="dxa" w:w="40"/>
+              <w:left w:type="dxa" w:w="80"/>
+              <w:bottom w:type="dxa" w:w="40"/>
+              <w:right w:type="dxa" w:w="80"/>
+            </w:tcMar>
+            <w:vAlign w:val="center"/>
+          </w:tcPr>
+          <w:p>
+            <w:pPr>
+              <w:jc w:val="center"/>
+            </w:pPr>
+            <w:r>
+              <w:rPr>
+                <w:rFonts w:ascii="Times New Roman" w:cs="Times New Roman" w:eastAsia="Times New Roman" w:hAnsi="Times New Roman"/>
+                <w:b/>
+                <w:bCs/>
+                <w:sz w:val="16"/>
+                <w:szCs w:val="16"/>
+              </w:rPr>
+              <w:t xml:space="preserve">Class</w:t>
+            </w:r>
+          </w:p>
+        </w:tc>
+        <w:tc>
+          <w:tcPr>
+            <w:tcW w:type="dxa" w:w="2100"/>
+            <w:tcBorders>
+              <w:top w:val="none" w:color="FFFFFF" w:sz="0"/>
+              <w:left w:val="none" w:color="FFFFFF" w:sz="0"/>
+              <w:bottom w:val="none" w:color="FFFFFF" w:sz="0"/>
+              <w:right w:val="none" w:color="FFFFFF" w:sz="0"/>
+            </w:tcBorders>
+            <w:shd w:fill="D9D9D9" w:val="clear"/>
+            <w:tcMar>
+              <w:top w:type="dxa" w:w="40"/>
+              <w:left w:type="dxa" w:w="80"/>
+              <w:bottom w:type="dxa" w:w="40"/>
+              <w:right w:type="dxa" w:w="80"/>
+            </w:tcMar>
+            <w:vAlign w:val="center"/>
+          </w:tcPr>
+          <w:p>
+            <w:pPr>
+              <w:jc w:val="center"/>
+            </w:pPr>
+            <w:r>
+              <w:rPr>
+                <w:rFonts w:ascii="Times New Roman" w:cs="Times New Roman" w:eastAsia="Times New Roman" w:hAnsi="Times New Roman"/>
+                <w:b/>
+                <w:bCs/>
+                <w:sz w:val="16"/>
+                <w:szCs w:val="16"/>
+              </w:rPr>
+              <w:t xml:space="preserve">CA–Markov (km²)</w:t>
+            </w:r>
+          </w:p>
+        </w:tc>
+        <w:tc>
+          <w:tcPr>
+            <w:tcW w:type="dxa" w:w="2400"/>
+            <w:tcBorders>
+              <w:top w:val="none" w:color="FFFFFF" w:sz="0"/>
+              <w:left w:val="none" w:color="FFFFFF" w:sz="0"/>
+              <w:bottom w:val="none" w:color="FFFFFF" w:sz="0"/>
+              <w:right w:val="none" w:color="FFFFFF" w:sz="0"/>
+            </w:tcBorders>
+            <w:shd w:fill="D9D9D9" w:val="clear"/>
+            <w:tcMar>
+              <w:top w:type="dxa" w:w="40"/>
+              <w:left w:type="dxa" w:w="80"/>
+              <w:bottom w:type="dxa" w:w="40"/>
+              <w:right w:type="dxa" w:w="80"/>
+            </w:tcMar>
+            <w:vAlign w:val="center"/>
+          </w:tcPr>
+          <w:p>
+            <w:pPr>
+              <w:jc w:val="center"/>
+            </w:pPr>
+            <w:r>
+              <w:rPr>
+                <w:rFonts w:ascii="Times New Roman" w:cs="Times New Roman" w:eastAsia="Times New Roman" w:hAnsi="Times New Roman"/>
+                <w:b/>
+                <w:bCs/>
+                <w:sz w:val="16"/>
+                <w:szCs w:val="16"/>
+              </w:rPr>
+              <w:t xml:space="preserve">ConvLSTM (km², mean±SD)</w:t>
+            </w:r>
+          </w:p>
+        </w:tc>
+        <w:tc>
+          <w:tcPr>
+            <w:tcW w:type="dxa" w:w="2160"/>
+            <w:tcBorders>
+              <w:top w:val="none" w:color="FFFFFF" w:sz="0"/>
+              <w:left w:val="none" w:color="FFFFFF" w:sz="0"/>
+              <w:bottom w:val="none" w:color="FFFFFF" w:sz="0"/>
+              <w:right w:val="none" w:color="FFFFFF" w:sz="0"/>
+            </w:tcBorders>
+            <w:shd w:fill="D9D9D9" w:val="clear"/>
+            <w:tcMar>
+              <w:top w:type="dxa" w:w="40"/>
+              <w:left w:type="dxa" w:w="80"/>
+              <w:bottom w:type="dxa" w:w="40"/>
+              <w:right w:type="dxa" w:w="80"/>
+            </w:tcMar>
+            <w:vAlign w:val="center"/>
+          </w:tcPr>
+          <w:p>
+            <w:pPr>
+              <w:jc w:val="center"/>
+            </w:pPr>
+            <w:r>
+              <w:rPr>
+                <w:rFonts w:ascii="Times New Roman" w:cs="Times New Roman" w:eastAsia="Times New Roman" w:hAnsi="Times New Roman"/>
+                <w:b/>
+                <w:bCs/>
+                <w:sz w:val="16"/>
+                <w:szCs w:val="16"/>
+              </w:rPr>
+              <w:t xml:space="preserve">Ratio</w:t>
+            </w:r>
+          </w:p>
+        </w:tc>
+      </w:tr>
+      <w:tr>
+        <w:tc>
+          <w:tcPr>
+            <w:tcW w:type="dxa" w:w="2700"/>
+            <w:tcBorders>
+              <w:top w:val="none" w:color="FFFFFF" w:sz="0"/>
+              <w:left w:val="none" w:color="FFFFFF" w:sz="0"/>
+              <w:bottom w:val="none" w:color="FFFFFF" w:sz="0"/>
+              <w:right w:val="none" w:color="FFFFFF" w:sz="0"/>
+            </w:tcBorders>
+            <w:tcMar>
+              <w:top w:type="dxa" w:w="40"/>
+              <w:left w:type="dxa" w:w="80"/>
+              <w:bottom w:type="dxa" w:w="40"/>
+              <w:right w:type="dxa" w:w="80"/>
+            </w:tcMar>
+            <w:vAlign w:val="center"/>
+          </w:tcPr>
+          <w:p>
+            <w:pPr>
+              <w:jc w:val="left"/>
+            </w:pPr>
+            <w:r>
+              <w:rPr>
+                <w:rFonts w:ascii="Times New Roman" w:cs="Times New Roman" w:eastAsia="Times New Roman" w:hAnsi="Times New Roman"/>
+                <w:b w:val="false"/>
+                <w:bCs w:val="false"/>
+                <w:sz w:val="16"/>
+                <w:szCs w:val="16"/>
+              </w:rPr>
+              <w:t xml:space="preserve">Water</w:t>
+            </w:r>
+          </w:p>
+        </w:tc>
+        <w:tc>
+          <w:tcPr>
+            <w:tcW w:type="dxa" w:w="2100"/>
+            <w:tcBorders>
+              <w:top w:val="none" w:color="FFFFFF" w:sz="0"/>
+              <w:left w:val="none" w:color="FFFFFF" w:sz="0"/>
+              <w:bottom w:val="none" w:color="FFFFFF" w:sz="0"/>
+              <w:right w:val="none" w:color="FFFFFF" w:sz="0"/>
+            </w:tcBorders>
+            <w:tcMar>
+              <w:top w:type="dxa" w:w="40"/>
+              <w:left w:type="dxa" w:w="80"/>
+              <w:bottom w:type="dxa" w:w="40"/>
+              <w:right w:type="dxa" w:w="80"/>
+            </w:tcMar>
+            <w:vAlign w:val="center"/>
+          </w:tcPr>
+          <w:p>
+            <w:pPr>
+              <w:jc w:val="center"/>
+            </w:pPr>
+            <w:r>
+              <w:rPr>
+                <w:rFonts w:ascii="Times New Roman" w:cs="Times New Roman" w:eastAsia="Times New Roman" w:hAnsi="Times New Roman"/>
+                <w:b w:val="false"/>
+                <w:bCs w:val="false"/>
+                <w:sz w:val="16"/>
+                <w:szCs w:val="16"/>
+              </w:rPr>
+              <w:t xml:space="preserve">1,200.8</w:t>
+            </w:r>
+          </w:p>
+        </w:tc>
+        <w:tc>
+          <w:tcPr>
+            <w:tcW w:type="dxa" w:w="2400"/>
+            <w:tcBorders>
+              <w:top w:val="none" w:color="FFFFFF" w:sz="0"/>
+              <w:left w:val="none" w:color="FFFFFF" w:sz="0"/>
+              <w:bottom w:val="none" w:color="FFFFFF" w:sz="0"/>
+              <w:right w:val="none" w:color="FFFFFF" w:sz="0"/>
+            </w:tcBorders>
+            <w:tcMar>
+              <w:top w:type="dxa" w:w="40"/>
+              <w:left w:type="dxa" w:w="80"/>
+              <w:bottom w:type="dxa" w:w="40"/>
+              <w:right w:type="dxa" w:w="80"/>
+            </w:tcMar>
+            <w:vAlign w:val="center"/>
+          </w:tcPr>
+          <w:p>
+            <w:pPr>
+              <w:jc w:val="center"/>
+            </w:pPr>
+            <w:r>
+              <w:rPr>
+                <w:rFonts w:ascii="Times New Roman" w:cs="Times New Roman" w:eastAsia="Times New Roman" w:hAnsi="Times New Roman"/>
+                <w:b w:val="false"/>
+                <w:bCs w:val="false"/>
+                <w:sz w:val="16"/>
+                <w:szCs w:val="16"/>
+              </w:rPr>
+              <w:t xml:space="preserve">998.8±126.9</w:t>
+            </w:r>
+          </w:p>
+        </w:tc>
+        <w:tc>
+          <w:tcPr>
+            <w:tcW w:type="dxa" w:w="2160"/>
+            <w:tcBorders>
+              <w:top w:val="none" w:color="FFFFFF" w:sz="0"/>
+              <w:left w:val="none" w:color="FFFFFF" w:sz="0"/>
+              <w:bottom w:val="none" w:color="FFFFFF" w:sz="0"/>
+              <w:right w:val="none" w:color="FFFFFF" w:sz="0"/>
+            </w:tcBorders>
+            <w:tcMar>
+              <w:top w:type="dxa" w:w="40"/>
+              <w:left w:type="dxa" w:w="80"/>
+              <w:bottom w:type="dxa" w:w="40"/>
+              <w:right w:type="dxa" w:w="80"/>
+            </w:tcMar>
+            <w:vAlign w:val="center"/>
+          </w:tcPr>
+          <w:p>
+            <w:pPr>
+              <w:jc w:val="center"/>
+            </w:pPr>
+            <w:r>
+              <w:rPr>
+                <w:rFonts w:ascii="Times New Roman" w:cs="Times New Roman" w:eastAsia="Times New Roman" w:hAnsi="Times New Roman"/>
+                <w:b w:val="false"/>
+                <w:bCs w:val="false"/>
+                <w:sz w:val="16"/>
+                <w:szCs w:val="16"/>
+              </w:rPr>
+              <w:t xml:space="preserve">0.83</w:t>
+            </w:r>
+          </w:p>
+        </w:tc>
+      </w:tr>
+      <w:tr>
+        <w:tc>
+          <w:tcPr>
+            <w:tcW w:type="dxa" w:w="2700"/>
+            <w:tcBorders>
+              <w:top w:val="none" w:color="FFFFFF" w:sz="0"/>
+              <w:left w:val="none" w:color="FFFFFF" w:sz="0"/>
+              <w:bottom w:val="none" w:color="FFFFFF" w:sz="0"/>
+              <w:right w:val="none" w:color="FFFFFF" w:sz="0"/>
+            </w:tcBorders>
+            <w:tcMar>
+              <w:top w:type="dxa" w:w="40"/>
+              <w:left w:type="dxa" w:w="80"/>
+              <w:bottom w:type="dxa" w:w="40"/>
+              <w:right w:type="dxa" w:w="80"/>
+            </w:tcMar>
+            <w:vAlign w:val="center"/>
+          </w:tcPr>
+          <w:p>
+            <w:pPr>
+              <w:jc w:val="left"/>
+            </w:pPr>
+            <w:r>
+              <w:rPr>
+                <w:rFonts w:ascii="Times New Roman" w:cs="Times New Roman" w:eastAsia="Times New Roman" w:hAnsi="Times New Roman"/>
+                <w:b w:val="false"/>
+                <w:bCs w:val="false"/>
+                <w:sz w:val="16"/>
+                <w:szCs w:val="16"/>
+              </w:rPr>
+              <w:t xml:space="preserve">Non-vegetated</w:t>
+            </w:r>
+          </w:p>
+        </w:tc>
+        <w:tc>
+          <w:tcPr>
+            <w:tcW w:type="dxa" w:w="2100"/>
+            <w:tcBorders>
+              <w:top w:val="none" w:color="FFFFFF" w:sz="0"/>
+              <w:left w:val="none" w:color="FFFFFF" w:sz="0"/>
+              <w:bottom w:val="none" w:color="FFFFFF" w:sz="0"/>
+              <w:right w:val="none" w:color="FFFFFF" w:sz="0"/>
+            </w:tcBorders>
+            <w:tcMar>
+              <w:top w:type="dxa" w:w="40"/>
+              <w:left w:type="dxa" w:w="80"/>
+              <w:bottom w:type="dxa" w:w="40"/>
+              <w:right w:type="dxa" w:w="80"/>
+            </w:tcMar>
+            <w:vAlign w:val="center"/>
+          </w:tcPr>
+          <w:p>
+            <w:pPr>
+              <w:jc w:val="center"/>
+            </w:pPr>
+            <w:r>
+              <w:rPr>
+                <w:rFonts w:ascii="Times New Roman" w:cs="Times New Roman" w:eastAsia="Times New Roman" w:hAnsi="Times New Roman"/>
+                <w:b w:val="false"/>
+                <w:bCs w:val="false"/>
+                <w:sz w:val="16"/>
+                <w:szCs w:val="16"/>
+              </w:rPr>
+              <w:t xml:space="preserve">2,626.0</w:t>
+            </w:r>
+          </w:p>
+        </w:tc>
+        <w:tc>
+          <w:tcPr>
+            <w:tcW w:type="dxa" w:w="2400"/>
+            <w:tcBorders>
+              <w:top w:val="none" w:color="FFFFFF" w:sz="0"/>
+              <w:left w:val="none" w:color="FFFFFF" w:sz="0"/>
+              <w:bottom w:val="none" w:color="FFFFFF" w:sz="0"/>
+              <w:right w:val="none" w:color="FFFFFF" w:sz="0"/>
+            </w:tcBorders>
+            <w:tcMar>
+              <w:top w:type="dxa" w:w="40"/>
+              <w:left w:type="dxa" w:w="80"/>
+              <w:bottom w:type="dxa" w:w="40"/>
+              <w:right w:type="dxa" w:w="80"/>
+            </w:tcMar>
+            <w:vAlign w:val="center"/>
+          </w:tcPr>
+          <w:p>
+            <w:pPr>
+              <w:jc w:val="center"/>
+            </w:pPr>
+            <w:r>
+              <w:rPr>
+                <w:rFonts w:ascii="Times New Roman" w:cs="Times New Roman" w:eastAsia="Times New Roman" w:hAnsi="Times New Roman"/>
+                <w:b w:val="false"/>
+                <w:bCs w:val="false"/>
+                <w:sz w:val="16"/>
+                <w:szCs w:val="16"/>
+              </w:rPr>
+              <w:t xml:space="preserve">1580.0±550.3</w:t>
+            </w:r>
+          </w:p>
+        </w:tc>
+        <w:tc>
+          <w:tcPr>
+            <w:tcW w:type="dxa" w:w="2160"/>
+            <w:tcBorders>
+              <w:top w:val="none" w:color="FFFFFF" w:sz="0"/>
+              <w:left w:val="none" w:color="FFFFFF" w:sz="0"/>
+              <w:bottom w:val="none" w:color="FFFFFF" w:sz="0"/>
+              <w:right w:val="none" w:color="FFFFFF" w:sz="0"/>
+            </w:tcBorders>
+            <w:tcMar>
+              <w:top w:type="dxa" w:w="40"/>
+              <w:left w:type="dxa" w:w="80"/>
+              <w:bottom w:type="dxa" w:w="40"/>
+              <w:right w:type="dxa" w:w="80"/>
+            </w:tcMar>
+            <w:vAlign w:val="center"/>
+          </w:tcPr>
+          <w:p>
+            <w:pPr>
+              <w:jc w:val="center"/>
+            </w:pPr>
+            <w:r>
+              <w:rPr>
+                <w:rFonts w:ascii="Times New Roman" w:cs="Times New Roman" w:eastAsia="Times New Roman" w:hAnsi="Times New Roman"/>
+                <w:b w:val="false"/>
+                <w:bCs w:val="false"/>
+                <w:sz w:val="16"/>
+                <w:szCs w:val="16"/>
+              </w:rPr>
+              <w:t xml:space="preserve">0.60</w:t>
+            </w:r>
+          </w:p>
+        </w:tc>
+      </w:tr>
+      <w:tr>
+        <w:tc>
+          <w:tcPr>
+            <w:tcW w:type="dxa" w:w="2700"/>
+            <w:tcBorders>
+              <w:top w:val="none" w:color="FFFFFF" w:sz="0"/>
+              <w:left w:val="none" w:color="FFFFFF" w:sz="0"/>
+              <w:bottom w:val="none" w:color="FFFFFF" w:sz="0"/>
+              <w:right w:val="none" w:color="FFFFFF" w:sz="0"/>
+            </w:tcBorders>
+            <w:tcMar>
+              <w:top w:type="dxa" w:w="40"/>
+              <w:left w:type="dxa" w:w="80"/>
+              <w:bottom w:type="dxa" w:w="40"/>
+              <w:right w:type="dxa" w:w="80"/>
+            </w:tcMar>
+            <w:vAlign w:val="center"/>
+          </w:tcPr>
+          <w:p>
+            <w:pPr>
+              <w:jc w:val="left"/>
+            </w:pPr>
+            <w:r>
+              <w:rPr>
+                <w:rFonts w:ascii="Times New Roman" w:cs="Times New Roman" w:eastAsia="Times New Roman" w:hAnsi="Times New Roman"/>
+                <w:b w:val="false"/>
+                <w:bCs w:val="false"/>
+                <w:sz w:val="16"/>
+                <w:szCs w:val="16"/>
+              </w:rPr>
+              <w:t xml:space="preserve">Sparse vegetation</w:t>
+            </w:r>
+          </w:p>
+        </w:tc>
+        <w:tc>
+          <w:tcPr>
+            <w:tcW w:type="dxa" w:w="2100"/>
+            <w:tcBorders>
+              <w:top w:val="none" w:color="FFFFFF" w:sz="0"/>
+              <w:left w:val="none" w:color="FFFFFF" w:sz="0"/>
+              <w:bottom w:val="none" w:color="FFFFFF" w:sz="0"/>
+              <w:right w:val="none" w:color="FFFFFF" w:sz="0"/>
+            </w:tcBorders>
+            <w:tcMar>
+              <w:top w:type="dxa" w:w="40"/>
+              <w:left w:type="dxa" w:w="80"/>
+              <w:bottom w:type="dxa" w:w="40"/>
+              <w:right w:type="dxa" w:w="80"/>
+            </w:tcMar>
+            <w:vAlign w:val="center"/>
+          </w:tcPr>
+          <w:p>
+            <w:pPr>
+              <w:jc w:val="center"/>
+            </w:pPr>
+            <w:r>
+              <w:rPr>
+                <w:rFonts w:ascii="Times New Roman" w:cs="Times New Roman" w:eastAsia="Times New Roman" w:hAnsi="Times New Roman"/>
+                <w:b w:val="false"/>
+                <w:bCs w:val="false"/>
+                <w:sz w:val="16"/>
+                <w:szCs w:val="16"/>
+              </w:rPr>
+              <w:t xml:space="preserve">20,364.7</w:t>
+            </w:r>
+          </w:p>
+        </w:tc>
+        <w:tc>
+          <w:tcPr>
+            <w:tcW w:type="dxa" w:w="2400"/>
+            <w:tcBorders>
+              <w:top w:val="none" w:color="FFFFFF" w:sz="0"/>
+              <w:left w:val="none" w:color="FFFFFF" w:sz="0"/>
+              <w:bottom w:val="none" w:color="FFFFFF" w:sz="0"/>
+              <w:right w:val="none" w:color="FFFFFF" w:sz="0"/>
+            </w:tcBorders>
+            <w:tcMar>
+              <w:top w:type="dxa" w:w="40"/>
+              <w:left w:type="dxa" w:w="80"/>
+              <w:bottom w:type="dxa" w:w="40"/>
+              <w:right w:type="dxa" w:w="80"/>
+            </w:tcMar>
+            <w:vAlign w:val="center"/>
+          </w:tcPr>
+          <w:p>
+            <w:pPr>
+              <w:jc w:val="center"/>
+            </w:pPr>
+            <w:r>
+              <w:rPr>
+                <w:rFonts w:ascii="Times New Roman" w:cs="Times New Roman" w:eastAsia="Times New Roman" w:hAnsi="Times New Roman"/>
+                <w:b w:val="false"/>
+                <w:bCs w:val="false"/>
+                <w:sz w:val="16"/>
+                <w:szCs w:val="16"/>
+              </w:rPr>
+              <w:t xml:space="preserve">25333.5±617.5</w:t>
+            </w:r>
+          </w:p>
+        </w:tc>
+        <w:tc>
+          <w:tcPr>
+            <w:tcW w:type="dxa" w:w="2160"/>
+            <w:tcBorders>
+              <w:top w:val="none" w:color="FFFFFF" w:sz="0"/>
+              <w:left w:val="none" w:color="FFFFFF" w:sz="0"/>
+              <w:bottom w:val="none" w:color="FFFFFF" w:sz="0"/>
+              <w:right w:val="none" w:color="FFFFFF" w:sz="0"/>
+            </w:tcBorders>
+            <w:tcMar>
+              <w:top w:type="dxa" w:w="40"/>
+              <w:left w:type="dxa" w:w="80"/>
+              <w:bottom w:type="dxa" w:w="40"/>
+              <w:right w:type="dxa" w:w="80"/>
+            </w:tcMar>
+            <w:vAlign w:val="center"/>
+          </w:tcPr>
+          <w:p>
+            <w:pPr>
+              <w:jc w:val="center"/>
+            </w:pPr>
+            <w:r>
+              <w:rPr>
+                <w:rFonts w:ascii="Times New Roman" w:cs="Times New Roman" w:eastAsia="Times New Roman" w:hAnsi="Times New Roman"/>
+                <w:b w:val="false"/>
+                <w:bCs w:val="false"/>
+                <w:sz w:val="16"/>
+                <w:szCs w:val="16"/>
+              </w:rPr>
+              <w:t xml:space="preserve">1.24</w:t>
+            </w:r>
+          </w:p>
+        </w:tc>
+      </w:tr>
+      <w:tr>
+        <w:tc>
+          <w:tcPr>
+            <w:tcW w:type="dxa" w:w="2700"/>
+            <w:tcBorders>
+              <w:top w:val="none" w:color="FFFFFF" w:sz="0"/>
+              <w:left w:val="none" w:color="FFFFFF" w:sz="0"/>
+              <w:bottom w:val="none" w:color="FFFFFF" w:sz="0"/>
+              <w:right w:val="none" w:color="FFFFFF" w:sz="0"/>
+            </w:tcBorders>
+            <w:tcMar>
+              <w:top w:type="dxa" w:w="40"/>
+              <w:left w:type="dxa" w:w="80"/>
+              <w:bottom w:type="dxa" w:w="40"/>
+              <w:right w:type="dxa" w:w="80"/>
+            </w:tcMar>
+            <w:vAlign w:val="center"/>
+          </w:tcPr>
+          <w:p>
+            <w:pPr>
+              <w:jc w:val="left"/>
+            </w:pPr>
+            <w:r>
+              <w:rPr>
+                <w:rFonts w:ascii="Times New Roman" w:cs="Times New Roman" w:eastAsia="Times New Roman" w:hAnsi="Times New Roman"/>
+                <w:b w:val="false"/>
+                <w:bCs w:val="false"/>
+                <w:sz w:val="16"/>
+                <w:szCs w:val="16"/>
+              </w:rPr>
+              <w:t xml:space="preserve">Dense vegetation</w:t>
+            </w:r>
+          </w:p>
+        </w:tc>
+        <w:tc>
+          <w:tcPr>
+            <w:tcW w:type="dxa" w:w="2100"/>
+            <w:tcBorders>
+              <w:top w:val="none" w:color="FFFFFF" w:sz="0"/>
+              <w:left w:val="none" w:color="FFFFFF" w:sz="0"/>
+              <w:bottom w:val="none" w:color="FFFFFF" w:sz="0"/>
+              <w:right w:val="none" w:color="FFFFFF" w:sz="0"/>
+            </w:tcBorders>
+            <w:tcMar>
+              <w:top w:type="dxa" w:w="40"/>
+              <w:left w:type="dxa" w:w="80"/>
+              <w:bottom w:type="dxa" w:w="40"/>
+              <w:right w:type="dxa" w:w="80"/>
+            </w:tcMar>
+            <w:vAlign w:val="center"/>
+          </w:tcPr>
+          <w:p>
+            <w:pPr>
+              <w:jc w:val="center"/>
+            </w:pPr>
+            <w:r>
+              <w:rPr>
+                <w:rFonts w:ascii="Times New Roman" w:cs="Times New Roman" w:eastAsia="Times New Roman" w:hAnsi="Times New Roman"/>
+                <w:b w:val="false"/>
+                <w:bCs w:val="false"/>
+                <w:sz w:val="16"/>
+                <w:szCs w:val="16"/>
+              </w:rPr>
+              <w:t xml:space="preserve">11,330.8</w:t>
+            </w:r>
+          </w:p>
+        </w:tc>
+        <w:tc>
+          <w:tcPr>
+            <w:tcW w:type="dxa" w:w="2400"/>
+            <w:tcBorders>
+              <w:top w:val="none" w:color="FFFFFF" w:sz="0"/>
+              <w:left w:val="none" w:color="FFFFFF" w:sz="0"/>
+              <w:bottom w:val="none" w:color="FFFFFF" w:sz="0"/>
+              <w:right w:val="none" w:color="FFFFFF" w:sz="0"/>
+            </w:tcBorders>
+            <w:tcMar>
+              <w:top w:type="dxa" w:w="40"/>
+              <w:left w:type="dxa" w:w="80"/>
+              <w:bottom w:type="dxa" w:w="40"/>
+              <w:right w:type="dxa" w:w="80"/>
+            </w:tcMar>
+            <w:vAlign w:val="center"/>
+          </w:tcPr>
+          <w:p>
+            <w:pPr>
+              <w:jc w:val="center"/>
+            </w:pPr>
+            <w:r>
+              <w:rPr>
+                <w:rFonts w:ascii="Times New Roman" w:cs="Times New Roman" w:eastAsia="Times New Roman" w:hAnsi="Times New Roman"/>
+                <w:b w:val="false"/>
+                <w:bCs w:val="false"/>
+                <w:sz w:val="16"/>
+                <w:szCs w:val="16"/>
+              </w:rPr>
+              <w:t xml:space="preserve">7610.1±619.6</w:t>
+            </w:r>
+          </w:p>
+        </w:tc>
+        <w:tc>
+          <w:tcPr>
+            <w:tcW w:type="dxa" w:w="2160"/>
+            <w:tcBorders>
+              <w:top w:val="none" w:color="FFFFFF" w:sz="0"/>
+              <w:left w:val="none" w:color="FFFFFF" w:sz="0"/>
+              <w:bottom w:val="none" w:color="FFFFFF" w:sz="0"/>
+              <w:right w:val="none" w:color="FFFFFF" w:sz="0"/>
+            </w:tcBorders>
+            <w:tcMar>
+              <w:top w:type="dxa" w:w="40"/>
+              <w:left w:type="dxa" w:w="80"/>
+              <w:bottom w:type="dxa" w:w="40"/>
+              <w:right w:type="dxa" w:w="80"/>
+            </w:tcMar>
+            <w:vAlign w:val="center"/>
+          </w:tcPr>
+          <w:p>
+            <w:pPr>
+              <w:jc w:val="center"/>
+            </w:pPr>
+            <w:r>
+              <w:rPr>
+                <w:rFonts w:ascii="Times New Roman" w:cs="Times New Roman" w:eastAsia="Times New Roman" w:hAnsi="Times New Roman"/>
+                <w:b w:val="false"/>
+                <w:bCs w:val="false"/>
+                <w:sz w:val="16"/>
+                <w:szCs w:val="16"/>
+              </w:rPr>
+              <w:t xml:space="preserve">0.67</w:t>
+            </w:r>
+          </w:p>
+        </w:tc>
+      </w:tr>
+    </w:tbl>
+    <w:p>
+      <w:pPr>
+        <w:keepNext/>
         <w:spacing w:after="160" w:before="280"/>
         <w:jc w:val="center"/>
       </w:pPr>
@@ -10770,7 +15115,7 @@
           <w:sz w:val="20"/>
           <w:szCs w:val="20"/>
         </w:rPr>
-        <w:t xml:space="preserve">The corrected picture therefore reverses the paper's initial conclusion, and the fifth experiment (Section IV-F, Table 12) shows the reversal is not a hedge: tested against CA–Markov's coarse-grid prediction across five independent seeds, the fixed ConvLSTM exceeded CA–Markov's Non-vegetated Producer's Accuracy in every seed, significantly so in every seed (McNemar p ≈ 0 throughout), and matched or exceeded CA–Markov's overall OA in every seed as well, significantly in four of five. At matched resolution and with standard class-weighting applied, ConvLSTM is not merely competitive with CA–Markov — it is significantly and consistently better, on both overall agreement and the specific minority class that motivated this comparison. The methodological lesson is not "CA–Markov is more defensible than ConvLSTM," but rather that a naive, single-configuration comparison between a classical and a deep-learning model can produce a confident-sounding but misleading — and, as shown here, reversible — verdict unless evaluation resolution is held constant and standard class-imbalance remedies are applied to both models before judging either one's ceiling performance [18], [19], [28]. Overall Accuracy alone remains an unsafe basis for model selection when the class of interest is rare — that part of the original finding stands — but so is a single unweighted training run of a deep-learning alternative.</w:t>
+        <w:t xml:space="preserve">Within the initial classification, the corrected picture reversed the paper's first conclusion, and the fifth experiment (Section IV-F, Table 12) showed the reversal was not a hedge: tested against CA–Markov's coarse-grid prediction across five independent seeds, the fixed ConvLSTM exceeded CA–Markov's Non-vegetated Producer's Accuracy in every seed, significantly so in every seed, and matched or exceeded CA–Markov's overall OA in every seed as well, significantly in four of five. At matched resolution and with standard class-weighting applied, ConvLSTM was not merely competitive with CA–Markov within that classification scheme — it was significantly and consistently better, on both overall agreement and the specific minority class that motivated this comparison. That finding stands on its own terms: a naive, single-configuration comparison between a classical and a deep-learning model can produce a confident-sounding but misleading verdict unless evaluation resolution is held constant and standard class-imbalance remedies are applied to both models before judging either one's ceiling performance [18], [19], [28].</w:t>
       </w:r>
     </w:p>
     <w:p>
@@ -10785,7 +15130,7 @@
           <w:sz w:val="20"/>
           <w:szCs w:val="20"/>
         </w:rPr>
-        <w:t xml:space="preserve">These results should be read against three remaining limitations. First, the historical image series available for this study spans only eight annual composites (2017–2024), far short of the training-data volumes typically used to demonstrate ConvLSTM's advantages over Markovian methods in the deep-learning land cover literature [15]–[17]; the fixed ConvLSTM already outperforms CA–Markov at this modest data volume, but whether the margin widens, narrows, or reverses again at a longer or higher-frequency (e.g., monthly or seasonal) composite series remains an open, testable question. Second, the single-threshold NDVI classification scheme, while robust across dates after radiometric normalization, cannot distinguish sub-types within the Non-vegetated or Sparse vegetation classes (e.g., settlement vs. bare land, or paddy vs. plantation), which limits the operational granularity of the resulting maps relative to studies using supervised multi-band classifiers [8], [32], [33]. Third, the Non-vegetated→Water transition cap applied in Section III-E is a disclosed, rule-based domain correction rather than a structural fix; an auxiliary water index (e.g., MNDWI) or multi-seasonal compositing would be a more principled way to resolve the underlying wet-paddy/bare-land spectral confusion in future work.</w:t>
+        <w:t xml:space="preserve">The independent ground-truth check (Section IV-G) added a further, more consequential twist: the initial NDVI-only classification that both models were built on agreed with real, external reference data far less often (OA = 43.8%, Kappa = 0.155) than any self-referential figure in this paper suggested, with the error concentrated in exactly the mechanism the remote-sensing literature predicts — a single greenness index cannot separate closed-canopy natural forest from healthy, high-NDVI cropland or plantation [8], [32], [33]. This is a different and, for a study whose purpose is model comparison, more fundamental problem than the resolution and weighting confounds diagnosed above: those affected which model looked better; this affected whether the labels either model was being scored against were themselves trustworthy. Adding a second spectral index (NDMI) and refitting the Dense-vegetation threshold against the independent reference recovered roughly two-fifths of the gap (OA 43.8% → 55.5%), but is disclosed here as a partial, not a complete, correction — Dense-vegetation accuracy fell as a side effect, and the refined classification should be read as an improvement in degree, not a solved classification problem.</w:t>
       </w:r>
     </w:p>
     <w:p>
@@ -10800,7 +15145,52 @@
           <w:sz w:val="20"/>
           <w:szCs w:val="20"/>
         </w:rPr>
-        <w:t xml:space="preserve">Both models' 2025 projections are linear or Markovian extrapolations of the 2017–2024 historical pattern and do not incorporate spatial-plan zoning, scheduled infrastructure projects, or other exogenous policy drivers that are already known to reshape land-use trajectories along West Java's toll-road and high-speed-rail corridors [2]; integrating such drivers as spatially explicit constraints, as has been done for scenario-based Java-wide projections [1], is a natural extension of the present validated baseline.</w:t>
+        <w:t xml:space="preserve">Rebuilding both models on the refined classification produced a genuinely mixed, rather than a clean, result — and this is itself the more important finding to report honestly than either paper's earlier headline verdict. Refined CA–Markov's validation OA fell relative to the initial classification (68.3% → 61.7%) but its FoM rose (22.2% → 25.7%), and its 2025 Non-vegetated projection (+19.0%) remained single-valued, deterministic, and directionally consistent with the documented urbanization trend [1]–[5]. Refined ConvLSTM, even after adding the NDMI channel the new labels required, could not simultaneously achieve good precision and good recall on the Non-vegetated class under either weighting scheme tested: full inverse-frequency weighting reached 73% recall at 13% precision (Table 17 preceding text), while square-root-dampened weighting improved overall Kappa (0.451, exceeding CA–Markov's 0.319) but left Non-vegetated recall unstable across seeds (12.9–42.4%) and precision still weak (26%). The practical consequence is visible directly in the 2025 forecasts (Table 18): the full-weight ConvLSTM projects an implausible near-quadrupling of Non-vegetated land in one year, driven by false positives, while the dampened configuration projects a decline with a standard deviation exceeding a third of its own mean. Neither is a forecast a planner should act on; CA–Markov's is the only one of the three model configurations tested here that produces a single, stable, directionally plausible number for the class this study's argument turns on.</w:t>
+      </w:r>
+    </w:p>
+    <w:p>
+      <w:pPr>
+        <w:spacing w:after="120" w:line="252"/>
+        <w:ind w:firstLine="204"/>
+        <w:jc w:val="both"/>
+      </w:pPr>
+      <w:r>
+        <w:rPr>
+          <w:rFonts w:ascii="Times New Roman" w:cs="Times New Roman" w:eastAsia="Times New Roman" w:hAnsi="Times New Roman"/>
+          <w:sz w:val="20"/>
+          <w:szCs w:val="20"/>
+        </w:rPr>
+        <w:t xml:space="preserve">Read end to end, this study's own trajectory is the clearest illustration of its central methodological claim. A first comparison favored CA–Markov, apparently decisively. Diagnosing that result's confounds (resolution, loss weighting) reversed it, apparently decisively, in ConvLSTM's favor. Introducing independent, external validation — absent from both prior comparisons — showed the foundation both models were built on was itself weaker than assumed, and that repairing it did not restore ConvLSTM's advantage; if anything, it reopened the case for CA–Markov's practical reliability, while leaving its own accuracy figures lower and more honestly caveated than before. No single comparison in this sequence would have been a safe place to stop.</w:t>
+      </w:r>
+    </w:p>
+    <w:p>
+      <w:pPr>
+        <w:spacing w:after="120" w:line="252"/>
+        <w:ind w:firstLine="204"/>
+        <w:jc w:val="both"/>
+      </w:pPr>
+      <w:r>
+        <w:rPr>
+          <w:rFonts w:ascii="Times New Roman" w:cs="Times New Roman" w:eastAsia="Times New Roman" w:hAnsi="Times New Roman"/>
+          <w:sz w:val="20"/>
+          <w:szCs w:val="20"/>
+        </w:rPr>
+        <w:t xml:space="preserve">These results should be read against four remaining limitations. First, the independent reference layer's exact acquisition date could not be confirmed from its own metadata, so some of the residual disagreement with the 2024 classification may reflect genuine land-cover change between the reference date and 2024 rather than classification error; a dated, higher-resolution, or field-verified reference would sharpen this check considerably. Second, the historical image series available for this study spans only eight annual composites (2017–2024), short of the training-data volumes typically used to demonstrate ConvLSTM's advantages over Markovian methods in the deep-learning land cover literature [15]–[17]; whether a longer or higher-frequency (e.g., monthly or seasonal) composite series would let ConvLSTM achieve good precision and recall simultaneously on the Non-vegetated class remains an open, testable question. Third, NDMI addresses the specific agriculture/forest confusion diagnosed here but is itself a single additional index; distinguishing further sub-types (settlement vs. bare land, paddy vs. plantation) would need supervised multi-band classification and labeled training data this study did not have. Fourth, the Non-vegetated→Water transition cap applied in Section III-E is a disclosed, rule-based domain correction rather than a structural fix; an auxiliary water index (e.g., MNDWI) or multi-seasonal compositing would be a more principled way to resolve the underlying wet-paddy/bare-land spectral confusion in future work.</w:t>
+      </w:r>
+    </w:p>
+    <w:p>
+      <w:pPr>
+        <w:spacing w:after="120" w:line="252"/>
+        <w:ind w:firstLine="204"/>
+        <w:jc w:val="both"/>
+      </w:pPr>
+      <w:r>
+        <w:rPr>
+          <w:rFonts w:ascii="Times New Roman" w:cs="Times New Roman" w:eastAsia="Times New Roman" w:hAnsi="Times New Roman"/>
+          <w:sz w:val="20"/>
+          <w:szCs w:val="20"/>
+        </w:rPr>
+        <w:t xml:space="preserve">Both models' 2025 projections remain linear or Markovian extrapolations of the 2017–2024 historical pattern and do not incorporate spatial-plan zoning, scheduled infrastructure projects, or other exogenous policy drivers that are already known to reshape land-use trajectories along West Java's toll-road and high-speed-rail corridors [2]; integrating such drivers as spatially explicit constraints, as has been done for scenario-based Java-wide projections [1], is a natural extension of the present, now independently checked, baseline.</w:t>
       </w:r>
     </w:p>
     <w:p>
@@ -10832,7 +15222,22 @@
           <w:sz w:val="20"/>
           <w:szCs w:val="20"/>
         </w:rPr>
-        <w:t xml:space="preserve">This study produced a native-resolution, genuinely sourced 2024 land cover classification of West Java, two independently validated 2025 projections, and — after the initial comparison showed ConvLSTM collapsing on the Non-vegetated class — a set of diagnostic experiments that traced that collapse to its actual causes and tested the corrected result for statistical significance. CA–Markov's apparent advantage was driven substantially by an unfair resolution mismatch and by ConvLSTM's original, unweighted training objective; once evaluation resolution was held constant and standard inverse-frequency class-weighting was applied, ConvLSTM significantly and consistently exceeded CA–Markov on both overall agreement and Non-vegetated Producer's Accuracy across five independent seeds (McNemar p ≈ 0 in every seed on the minority class). The contribution of this study is therefore threefold: a reproducible, fully disclosed workflow for building and validating province-scale land cover change projections from genuinely open Sentinel-2 data, including explicit documentation of a systematic classification artifact and its correction; a demonstrated case in which a single, unweighted, resolution-mismatched comparison between a classical and a deep-learning change model produced a confident but statistically reversible verdict; and evidence that diagnosing and correcting a model's failure mode, rather than reporting and accepting it, materially changes which model a comparison favors. Future work should extend the historical composite series (ideally to monthly or seasonal frequency over a decade or more) to test whether this advantage holds at greater data volume, and incorporate spatial-plan and infrastructure data as exogenous constraints on both models.</w:t>
+        <w:t xml:space="preserve">This study set out to compare a classical CA–Markov model against a ConvLSTM deep-learning alternative for land cover change projection, and ended up demonstrating why that comparison is harder to get right than a single model run can show. On the initial NDVI-only classification, a naive comparison favored CA–Markov; diagnosing and correcting a resolution mismatch and an unweighted loss function reversed that verdict, significantly and consistently, in ConvLSTM's favor. Introducing an independent, external ground-truth check — a validation step absent from the comparable literature on this topic — then showed the classification both models were built on was itself less accurate against real reference data than either model's self-referential validation implied, concentrated in a specific, diagnosable spectral confusion between forest and high-NDVI agriculture. Adding a second spectral index and rebuilding both models on the corrected classification did not restore a clean verdict: refined CA–Markov produced a lower validation OA but a higher FoM and a single, stable, plausible 2025 forecast, while refined ConvLSTM reached higher overall Kappa but could not, under either class-weighting scheme tested, produce a Non-vegetated forecast that was simultaneously precise, sensitive, and stable across seeds.</w:t>
+      </w:r>
+    </w:p>
+    <w:p>
+      <w:pPr>
+        <w:spacing w:after="120" w:line="252"/>
+        <w:ind w:firstLine="204"/>
+        <w:jc w:val="both"/>
+      </w:pPr>
+      <w:r>
+        <w:rPr>
+          <w:rFonts w:ascii="Times New Roman" w:cs="Times New Roman" w:eastAsia="Times New Roman" w:hAnsi="Times New Roman"/>
+          <w:sz w:val="20"/>
+          <w:szCs w:val="20"/>
+        </w:rPr>
+        <w:t xml:space="preserve">The contribution of this study is therefore not a verdict on which model family is superior — the evidence does not support one — but a demonstrated, fully disclosed case for why land change model comparisons need independent validation and repeated, adversarial self-checking before any such verdict is drawn. Reproducible, disclosed workflows and honestly reported reversals are more valuable to the field than a single confident comparison run once. Future work should obtain a dated, field-verified reference to sharpen the independent check; extend the historical composite series (ideally to monthly or seasonal frequency over a decade or more) to test whether either model's minority-class instability resolves at greater data volume; and incorporate spatial-plan and infrastructure data as exogenous constraints on both models, so that a genuinely decision-ready 2025 forecast — which, on the present evidence, neither model fully provides — can be built with justified confidence.</w:t>
       </w:r>
     </w:p>
     <w:p>
@@ -11839,6 +16244,52 @@
           <w:szCs w:val="16"/>
         </w:rPr>
         <w:t xml:space="preserve">B. Efron and R. J. Tibshirani, An Introduction to the Bootstrap. New York, NY, USA: Chapman &amp; Hall/CRC, 1994.</w:t>
+      </w:r>
+    </w:p>
+    <w:p>
+      <w:pPr>
+        <w:spacing w:after="90" w:line="240"/>
+        <w:ind w:left="260" w:hanging="260"/>
+        <w:jc w:val="both"/>
+      </w:pPr>
+      <w:r>
+        <w:rPr>
+          <w:rFonts w:ascii="Times New Roman" w:cs="Times New Roman" w:eastAsia="Times New Roman" w:hAnsi="Times New Roman"/>
+          <w:sz w:val="16"/>
+          <w:szCs w:val="16"/>
+        </w:rPr>
+        <w:t xml:space="preserve">[36]	</w:t>
+      </w:r>
+      <w:r>
+        <w:rPr>
+          <w:rFonts w:ascii="Times New Roman" w:cs="Times New Roman" w:eastAsia="Times New Roman" w:hAnsi="Times New Roman"/>
+          <w:sz w:val="16"/>
+          <w:szCs w:val="16"/>
+        </w:rPr>
+        <w:t xml:space="preserve">B.-C. Gao, “NDWI—A normalized difference water index for remote sensing of vegetation liquid water from space,” Remote Sens. Environ., vol. 58, no. 3, pp. 257–266, 1996, doi: 10.1016/S0034-4257(96)00067-3.</w:t>
+      </w:r>
+    </w:p>
+    <w:p>
+      <w:pPr>
+        <w:spacing w:after="90" w:line="240"/>
+        <w:ind w:left="260" w:hanging="260"/>
+        <w:jc w:val="both"/>
+      </w:pPr>
+      <w:r>
+        <w:rPr>
+          <w:rFonts w:ascii="Times New Roman" w:cs="Times New Roman" w:eastAsia="Times New Roman" w:hAnsi="Times New Roman"/>
+          <w:sz w:val="16"/>
+          <w:szCs w:val="16"/>
+        </w:rPr>
+        <w:t xml:space="preserve">[37]	</w:t>
+      </w:r>
+      <w:r>
+        <w:rPr>
+          <w:rFonts w:ascii="Times New Roman" w:cs="Times New Roman" w:eastAsia="Times New Roman" w:hAnsi="Times New Roman"/>
+          <w:sz w:val="16"/>
+          <w:szCs w:val="16"/>
+        </w:rPr>
+        <w:t xml:space="preserve">E. H. Wilson and S. A. Sader, “Detection of forest harvest type using multiple dates of Landsat TM imagery,” Remote Sens. Environ., vol. 80, no. 3, pp. 385–396, 2002, doi: 10.1016/S0034-4257(01)00318-2.</w:t>
       </w:r>
     </w:p>
     <w:p>

</xml_diff>

<commit_message>
Add 2025 prediction map figures for CA-Markov and ConvLSTM to the paper
Adds Fig. 3 (refined CA-Markov 2025 projection, native resolution) and
Fig. 4 (refined ConvLSTM v3 2025 projection, majority vote across 5 seeds,
shown at its actual native 300x233 grid rather than smoothed) to the
Results section, using the same color palette as the existing 2024 land
cover map. The visible blockiness in Fig. 4 is deliberate -- it is
ConvLSTM's real prediction resolution and visually reinforces the paper's
own resolution-mismatch discussion.

Adds analysis/v2_refined/render_2025_maps.py to reproduce both figures.
</commit_message>
<xml_diff>
--- a/paper/JISEBI_West_Java_Landcover.docx
+++ b/paper/JISEBI_West_Java_Landcover.docx
@@ -13396,6 +13396,66 @@
     </w:tbl>
     <w:p>
       <w:pPr>
+        <w:spacing w:before="160"/>
+        <w:jc w:val="center"/>
+      </w:pPr>
+      <w:r>
+        <w:drawing>
+          <wp:inline distT="0" distB="0" distL="0" distR="0">
+            <wp:extent cx="3429000" cy="2790825"/>
+            <wp:effectExtent t="0" r="0" b="0" l="0"/>
+            <wp:docPr id="1" name="" descr="" title=""/>
+            <wp:cNvGraphicFramePr>
+              <a:graphicFrameLocks xmlns:a="http://schemas.openxmlformats.org/drawingml/2006/main" noChangeAspect="1"/>
+            </wp:cNvGraphicFramePr>
+            <a:graphic xmlns:a="http://schemas.openxmlformats.org/drawingml/2006/main">
+              <a:graphicData uri="http://schemas.openxmlformats.org/drawingml/2006/picture">
+                <pic:pic xmlns:pic="http://schemas.openxmlformats.org/drawingml/2006/picture">
+                  <pic:nvPicPr>
+                    <pic:cNvPr id="0" name="" descr=""/>
+                    <pic:cNvPicPr>
+                      <a:picLocks noChangeAspect="1" noChangeArrowheads="1"/>
+                    </pic:cNvPicPr>
+                  </pic:nvPicPr>
+                  <pic:blipFill>
+                    <a:blip r:embed="rId12" cstate="none"/>
+                    <a:srcRect/>
+                    <a:stretch>
+                      <a:fillRect/>
+                    </a:stretch>
+                  </pic:blipFill>
+                  <pic:spPr bwMode="auto">
+                    <a:xfrm>
+                      <a:off x="0" y="0"/>
+                      <a:ext cx="3429000" cy="2790825"/>
+                    </a:xfrm>
+                    <a:prstGeom prst="rect">
+                      <a:avLst/>
+                    </a:prstGeom>
+                  </pic:spPr>
+                </pic:pic>
+              </a:graphicData>
+            </a:graphic>
+          </wp:inline>
+        </w:drawing>
+      </w:r>
+    </w:p>
+    <w:p>
+      <w:pPr>
+        <w:spacing w:after="200" w:before="60"/>
+        <w:jc w:val="center"/>
+      </w:pPr>
+      <w:r>
+        <w:rPr>
+          <w:rFonts w:ascii="Times New Roman" w:cs="Times New Roman" w:eastAsia="Times New Roman" w:hAnsi="Times New Roman"/>
+          <w:sz w:val="16"/>
+          <w:szCs w:val="16"/>
+        </w:rPr>
+        <w:t xml:space="preserve">Fig. 3 Refined CA–Markov 2025 land cover projection for West Java, native analysis grid (dark green = dense vegetation/forest; light green = sparse vegetation/agriculture; red = non-vegetated; blue = water), corresponding to the areas in Table 15.</w:t>
+      </w:r>
+    </w:p>
+    <w:p>
+      <w:pPr>
         <w:spacing w:after="120" w:line="252"/>
         <w:ind w:firstLine="204"/>
         <w:jc w:val="both"/>
@@ -15809,6 +15869,66 @@
           <w:szCs w:val="20"/>
         </w:rPr>
         <w:t xml:space="preserve">At this shared, resolution-matched grid, refined ConvLSTM v3 (Table 17: OA = 72.73%, Kappa = 0.4509, PA[Non-vegetated] = 34.4%) exceeds refined CA–Markov's coarse-grid figures (OA = 61.82%, Kappa = 0.2871, PA[Non-vegetated] = 10.2%) on every one of these metrics — by 10.9 points of OA, 0.164 of Kappa, and 24.2 points of Non-vegetated Producer's Accuracy. Unlike the original classification, where matching resolution was needed to overturn an initially CA–Markov-favoring result, here it removes the one confound that could have explained refined ConvLSTM's Kappa advantage and shows the advantage holds, and is if anything larger, once the comparison is made fairly. This does not change the paper's overall conclusion that neither refined model is decision-ready on the Non-vegetated class: refined ConvLSTM still cannot deliver that accuracy with stable, precise recall (Table 17), and refined CA–Markov's real-world 2025 forecast (Table 15) remains the only one of the three configurations that is single-valued and directionally plausible.</w:t>
+      </w:r>
+    </w:p>
+    <w:p>
+      <w:pPr>
+        <w:spacing w:before="160"/>
+        <w:jc w:val="center"/>
+      </w:pPr>
+      <w:r>
+        <w:drawing>
+          <wp:inline distT="0" distB="0" distL="0" distR="0">
+            <wp:extent cx="3429000" cy="2790825"/>
+            <wp:effectExtent t="0" r="0" b="0" l="0"/>
+            <wp:docPr id="1" name="" descr="" title=""/>
+            <wp:cNvGraphicFramePr>
+              <a:graphicFrameLocks xmlns:a="http://schemas.openxmlformats.org/drawingml/2006/main" noChangeAspect="1"/>
+            </wp:cNvGraphicFramePr>
+            <a:graphic xmlns:a="http://schemas.openxmlformats.org/drawingml/2006/main">
+              <a:graphicData uri="http://schemas.openxmlformats.org/drawingml/2006/picture">
+                <pic:pic xmlns:pic="http://schemas.openxmlformats.org/drawingml/2006/picture">
+                  <pic:nvPicPr>
+                    <pic:cNvPr id="0" name="" descr=""/>
+                    <pic:cNvPicPr>
+                      <a:picLocks noChangeAspect="1" noChangeArrowheads="1"/>
+                    </pic:cNvPicPr>
+                  </pic:nvPicPr>
+                  <pic:blipFill>
+                    <a:blip r:embed="rId13" cstate="none"/>
+                    <a:srcRect/>
+                    <a:stretch>
+                      <a:fillRect/>
+                    </a:stretch>
+                  </pic:blipFill>
+                  <pic:spPr bwMode="auto">
+                    <a:xfrm>
+                      <a:off x="0" y="0"/>
+                      <a:ext cx="3429000" cy="2790825"/>
+                    </a:xfrm>
+                    <a:prstGeom prst="rect">
+                      <a:avLst/>
+                    </a:prstGeom>
+                  </pic:spPr>
+                </pic:pic>
+              </a:graphicData>
+            </a:graphic>
+          </wp:inline>
+        </w:drawing>
+      </w:r>
+    </w:p>
+    <w:p>
+      <w:pPr>
+        <w:spacing w:after="200" w:before="60"/>
+        <w:jc w:val="center"/>
+      </w:pPr>
+      <w:r>
+        <w:rPr>
+          <w:rFonts w:ascii="Times New Roman" w:cs="Times New Roman" w:eastAsia="Times New Roman" w:hAnsi="Times New Roman"/>
+          <w:sz w:val="16"/>
+          <w:szCs w:val="16"/>
+        </w:rPr>
+        <w:t xml:space="preserve">Fig. 4 Refined ConvLSTM v3 2025 land cover projection, majority vote across 5 seeds, shown at the model's native 300×233 training/prediction grid upsampled by nearest-neighbor (same palette as Fig. 3). The visible blockiness is not a rendering artifact — it is the actual spatial resolution ConvLSTM predicts at, roughly 8× coarser per axis than CA–Markov's native grid, and the near-absence of red (Non-vegetated) pixels away from the coastal fringe illustrates the class's low, unstable recall documented in Table 17.</w:t>
       </w:r>
     </w:p>
     <w:p>

</xml_diff>